<commit_message>
Add Day 2: use-case diagram, descriptions, activity diagram
</commit_message>
<xml_diff>
--- a/report/Problem Statement.docx
+++ b/report/Problem Statement.docx
@@ -177,7 +177,6 @@
         <w:pStyle w:val="Heading1"/>
       </w:pPr>
       <w:r>
-        <w:lastRenderedPageBreak/>
         <w:t>1.4 Stakeholders</w:t>
       </w:r>
     </w:p>
@@ -230,6 +229,7 @@
                 <w:b/>
                 <w:bCs/>
               </w:rPr>
+              <w:lastRenderedPageBreak/>
               <w:t>Stakeholder</w:t>
             </w:r>
           </w:p>
@@ -660,7 +660,6 @@
         </w:numPr>
       </w:pPr>
       <w:r>
-        <w:lastRenderedPageBreak/>
         <w:t>Deployment of the website using GitHub Pages for free public hosting.</w:t>
       </w:r>
     </w:p>
@@ -689,6 +688,7 @@
         </w:numPr>
       </w:pPr>
       <w:r>
+        <w:lastRenderedPageBreak/>
         <w:t>Backend development or server-side programming.</w:t>
       </w:r>
     </w:p>
@@ -967,7 +967,7 @@
     <w:p>
       <w:r>
         <w:pict w14:anchorId="34899E99">
-          <v:rect id="_x0000_i1033" style="width:0;height:1.5pt" o:hralign="center" o:hrstd="t" o:hr="t" fillcolor="#a0a0a0" stroked="f"/>
+          <v:rect id="_x0000_i1029" style="width:0;height:1.5pt" o:hralign="center" o:hrstd="t" o:hr="t" fillcolor="#a0a0a0" stroked="f"/>
         </w:pict>
       </w:r>
     </w:p>
@@ -1037,7 +1037,6 @@
                 <w:b/>
                 <w:bCs/>
               </w:rPr>
-              <w:lastRenderedPageBreak/>
               <w:t>Requirement ID</w:t>
             </w:r>
           </w:p>
@@ -1107,6 +1106,7 @@
           </w:tcPr>
           <w:p>
             <w:r>
+              <w:lastRenderedPageBreak/>
               <w:t>FR-02</w:t>
             </w:r>
           </w:p>
@@ -1360,7 +1360,7 @@
     <w:p>
       <w:r>
         <w:pict w14:anchorId="1E961320">
-          <v:rect id="_x0000_i1034" style="width:0;height:1.5pt" o:hralign="center" o:hrstd="t" o:hr="t" fillcolor="#a0a0a0" stroked="f"/>
+          <v:rect id="_x0000_i1030" style="width:0;height:1.5pt" o:hralign="center" o:hrstd="t" o:hr="t" fillcolor="#a0a0a0" stroked="f"/>
         </w:pict>
       </w:r>
     </w:p>
@@ -1528,7 +1528,6 @@
           </w:tcPr>
           <w:p>
             <w:r>
-              <w:lastRenderedPageBreak/>
               <w:t>NFR-03</w:t>
             </w:r>
           </w:p>
@@ -1558,6 +1557,7 @@
           </w:tcPr>
           <w:p>
             <w:r>
+              <w:lastRenderedPageBreak/>
               <w:t>NFR-04</w:t>
             </w:r>
           </w:p>
@@ -1752,20 +1752,3017 @@
     </w:tbl>
     <w:p>
       <w:pPr>
+        <w:pStyle w:val="Heading1"/>
+      </w:pPr>
+    </w:p>
+    <w:p/>
+    <w:p/>
+    <w:p/>
+    <w:p/>
+    <w:p/>
+    <w:p/>
+    <w:p/>
+    <w:p/>
+    <w:p/>
+    <w:p/>
+    <w:p/>
+    <w:p/>
+    <w:p>
+      <w:pPr>
+        <w:pStyle w:val="Heading1"/>
+      </w:pPr>
+      <w:r>
+        <w:lastRenderedPageBreak/>
+        <w:t>1.8 Use Case Diagram</w:t>
+      </w:r>
+    </w:p>
+    <w:p>
+      <w:pPr>
         <w:pStyle w:val="NormalWeb"/>
       </w:pPr>
-      <w:bookmarkStart w:id="0" w:name="_GoBack"/>
-      <w:bookmarkEnd w:id="0"/>
-    </w:p>
-    <w:p/>
+      <w:r>
+        <w:t xml:space="preserve">A Use Case Diagram is used to represent the interactions between the system and its users. For this portfolio website, the primary actor is the </w:t>
+      </w:r>
+      <w:r>
+        <w:rPr>
+          <w:rStyle w:val="Strong"/>
+          <w:rFonts w:eastAsiaTheme="majorEastAsia"/>
+        </w:rPr>
+        <w:t>Visitor/Recruiter</w:t>
+      </w:r>
+      <w:r>
+        <w:t>, who interacts with various features provided by the system to view information about the portfolio owner.</w:t>
+      </w:r>
+    </w:p>
+    <w:p>
+      <w:pPr>
+        <w:pStyle w:val="Heading2"/>
+      </w:pPr>
+      <w:r>
+        <w:t>1.8.1 Use Case Diagram</w:t>
+      </w:r>
+    </w:p>
+    <w:p>
+      <w:pPr>
+        <w:pStyle w:val="NormalWeb"/>
+      </w:pPr>
+      <w:r>
+        <w:t>The Personal Portfolio Website contains a single actor (</w:t>
+      </w:r>
+      <w:r>
+        <w:rPr>
+          <w:rStyle w:val="Strong"/>
+          <w:rFonts w:eastAsiaTheme="majorEastAsia"/>
+        </w:rPr>
+        <w:t>Visitor/Recruiter</w:t>
+      </w:r>
+      <w:r>
+        <w:t>) and six main use cases within the system boundary.</w:t>
+      </w:r>
+    </w:p>
+    <w:p>
+      <w:pPr>
+        <w:pStyle w:val="NormalWeb"/>
+      </w:pPr>
+      <w:r>
+        <w:rPr>
+          <w:rStyle w:val="Strong"/>
+          <w:rFonts w:eastAsiaTheme="majorEastAsia"/>
+        </w:rPr>
+        <w:t>Actor:</w:t>
+      </w:r>
+    </w:p>
+    <w:p>
+      <w:pPr>
+        <w:pStyle w:val="NormalWeb"/>
+        <w:numPr>
+          <w:ilvl w:val="0"/>
+          <w:numId w:val="6"/>
+        </w:numPr>
+      </w:pPr>
+      <w:r>
+        <w:t>Visitor / Recruiter</w:t>
+      </w:r>
+    </w:p>
+    <w:p>
+      <w:pPr>
+        <w:pStyle w:val="NormalWeb"/>
+      </w:pPr>
+      <w:r>
+        <w:rPr>
+          <w:rStyle w:val="Strong"/>
+          <w:rFonts w:eastAsiaTheme="majorEastAsia"/>
+        </w:rPr>
+        <w:t>Use Cases:</w:t>
+      </w:r>
+    </w:p>
+    <w:p>
+      <w:pPr>
+        <w:pStyle w:val="NormalWeb"/>
+        <w:numPr>
+          <w:ilvl w:val="0"/>
+          <w:numId w:val="7"/>
+        </w:numPr>
+      </w:pPr>
+      <w:r>
+        <w:t>View Home Page</w:t>
+      </w:r>
+    </w:p>
+    <w:p>
+      <w:pPr>
+        <w:pStyle w:val="NormalWeb"/>
+        <w:numPr>
+          <w:ilvl w:val="0"/>
+          <w:numId w:val="7"/>
+        </w:numPr>
+      </w:pPr>
+      <w:r>
+        <w:t>View Profile Information</w:t>
+      </w:r>
+    </w:p>
+    <w:p>
+      <w:pPr>
+        <w:pStyle w:val="NormalWeb"/>
+        <w:numPr>
+          <w:ilvl w:val="0"/>
+          <w:numId w:val="7"/>
+        </w:numPr>
+      </w:pPr>
+      <w:r>
+        <w:t>View Projects</w:t>
+      </w:r>
+    </w:p>
+    <w:p>
+      <w:pPr>
+        <w:pStyle w:val="NormalWeb"/>
+        <w:numPr>
+          <w:ilvl w:val="0"/>
+          <w:numId w:val="7"/>
+        </w:numPr>
+      </w:pPr>
+      <w:r>
+        <w:t>View or Download CV</w:t>
+      </w:r>
+    </w:p>
+    <w:p>
+      <w:pPr>
+        <w:pStyle w:val="NormalWeb"/>
+        <w:numPr>
+          <w:ilvl w:val="0"/>
+          <w:numId w:val="7"/>
+        </w:numPr>
+      </w:pPr>
+      <w:r>
+        <w:t>Navigate via Menu</w:t>
+      </w:r>
+    </w:p>
+    <w:p>
+      <w:pPr>
+        <w:pStyle w:val="NormalWeb"/>
+        <w:numPr>
+          <w:ilvl w:val="0"/>
+          <w:numId w:val="7"/>
+        </w:numPr>
+      </w:pPr>
+      <w:r>
+        <w:t>View Contact Links</w:t>
+      </w:r>
+    </w:p>
+    <w:p>
+      <w:pPr>
+        <w:pStyle w:val="Heading3"/>
+      </w:pPr>
+      <w:r>
+        <w:t>Diagram Structure</w:t>
+      </w:r>
+    </w:p>
+    <w:p>
+      <w:pPr>
+        <w:pStyle w:val="Heading3"/>
+      </w:pPr>
+    </w:p>
+    <w:p>
+      <w:pPr>
+        <w:pStyle w:val="Heading3"/>
+        <w:ind w:left="900"/>
+      </w:pPr>
+      <w:r>
+        <w:rPr>
+          <w:noProof/>
+        </w:rPr>
+        <w:drawing>
+          <wp:inline distT="0" distB="0" distL="0" distR="0" wp14:anchorId="4B1D4038" wp14:editId="0874800E">
+            <wp:extent cx="4868883" cy="3128686"/>
+            <wp:effectExtent l="0" t="0" r="0" b="0"/>
+            <wp:docPr id="2" name="Picture 2"/>
+            <wp:cNvGraphicFramePr>
+              <a:graphicFrameLocks xmlns:a="http://schemas.openxmlformats.org/drawingml/2006/main" noChangeAspect="1"/>
+            </wp:cNvGraphicFramePr>
+            <a:graphic xmlns:a="http://schemas.openxmlformats.org/drawingml/2006/main">
+              <a:graphicData uri="http://schemas.openxmlformats.org/drawingml/2006/picture">
+                <pic:pic xmlns:pic="http://schemas.openxmlformats.org/drawingml/2006/picture">
+                  <pic:nvPicPr>
+                    <pic:cNvPr id="0" name="Picture 24"/>
+                    <pic:cNvPicPr>
+                      <a:picLocks noChangeAspect="1" noChangeArrowheads="1"/>
+                    </pic:cNvPicPr>
+                  </pic:nvPicPr>
+                  <pic:blipFill>
+                    <a:blip r:embed="rId7" cstate="print">
+                      <a:extLst>
+                        <a:ext uri="{28A0092B-C50C-407E-A947-70E740481C1C}">
+                          <a14:useLocalDpi xmlns:a14="http://schemas.microsoft.com/office/drawing/2010/main" val="0"/>
+                        </a:ext>
+                      </a:extLst>
+                    </a:blip>
+                    <a:srcRect/>
+                    <a:stretch>
+                      <a:fillRect/>
+                    </a:stretch>
+                  </pic:blipFill>
+                  <pic:spPr bwMode="auto">
+                    <a:xfrm>
+                      <a:off x="0" y="0"/>
+                      <a:ext cx="4910667" cy="3155536"/>
+                    </a:xfrm>
+                    <a:prstGeom prst="rect">
+                      <a:avLst/>
+                    </a:prstGeom>
+                    <a:noFill/>
+                    <a:ln>
+                      <a:noFill/>
+                    </a:ln>
+                  </pic:spPr>
+                </pic:pic>
+              </a:graphicData>
+            </a:graphic>
+          </wp:inline>
+        </w:drawing>
+      </w:r>
+    </w:p>
+    <w:p>
+      <w:r>
+        <w:lastRenderedPageBreak/>
+        <w:pict w14:anchorId="3983BD3B">
+          <v:rect id="_x0000_i1036" style="width:0;height:1.5pt" o:hralign="center" o:hrstd="t" o:hr="t" fillcolor="#a0a0a0" stroked="f"/>
+        </w:pict>
+      </w:r>
+    </w:p>
+    <w:p>
+      <w:pPr>
+        <w:pStyle w:val="Heading2"/>
+      </w:pPr>
+      <w:r>
+        <w:t>1.8.2 Use Case Descriptions</w:t>
+      </w:r>
+    </w:p>
+    <w:p>
+      <w:pPr>
+        <w:pStyle w:val="Heading3"/>
+      </w:pPr>
+      <w:r>
+        <w:t>UC-01: View Home Page</w:t>
+      </w:r>
+    </w:p>
+    <w:tbl>
+      <w:tblPr>
+        <w:tblW w:w="0" w:type="auto"/>
+        <w:tblCellSpacing w:w="15" w:type="dxa"/>
+        <w:tblCellMar>
+          <w:top w:w="15" w:type="dxa"/>
+          <w:left w:w="15" w:type="dxa"/>
+          <w:bottom w:w="15" w:type="dxa"/>
+          <w:right w:w="15" w:type="dxa"/>
+        </w:tblCellMar>
+        <w:tblLook w:val="04A0" w:firstRow="1" w:lastRow="0" w:firstColumn="1" w:lastColumn="0" w:noHBand="0" w:noVBand="1"/>
+      </w:tblPr>
+      <w:tblGrid>
+        <w:gridCol w:w="1462"/>
+        <w:gridCol w:w="4292"/>
+      </w:tblGrid>
+      <w:tr>
+        <w:trPr>
+          <w:tblHeader/>
+          <w:tblCellSpacing w:w="15" w:type="dxa"/>
+        </w:trPr>
+        <w:tc>
+          <w:tcPr>
+            <w:tcW w:w="0" w:type="auto"/>
+            <w:vAlign w:val="center"/>
+            <w:hideMark/>
+          </w:tcPr>
+          <w:p>
+            <w:pPr>
+              <w:jc w:val="center"/>
+              <w:rPr>
+                <w:b/>
+                <w:bCs/>
+              </w:rPr>
+            </w:pPr>
+            <w:r>
+              <w:rPr>
+                <w:b/>
+                <w:bCs/>
+              </w:rPr>
+              <w:t>Item</w:t>
+            </w:r>
+          </w:p>
+        </w:tc>
+        <w:tc>
+          <w:tcPr>
+            <w:tcW w:w="0" w:type="auto"/>
+            <w:vAlign w:val="center"/>
+            <w:hideMark/>
+          </w:tcPr>
+          <w:p>
+            <w:pPr>
+              <w:jc w:val="center"/>
+              <w:rPr>
+                <w:b/>
+                <w:bCs/>
+              </w:rPr>
+            </w:pPr>
+            <w:r>
+              <w:rPr>
+                <w:b/>
+                <w:bCs/>
+              </w:rPr>
+              <w:t>Description</w:t>
+            </w:r>
+          </w:p>
+        </w:tc>
+      </w:tr>
+      <w:tr>
+        <w:trPr>
+          <w:tblCellSpacing w:w="15" w:type="dxa"/>
+        </w:trPr>
+        <w:tc>
+          <w:tcPr>
+            <w:tcW w:w="0" w:type="auto"/>
+            <w:vAlign w:val="center"/>
+            <w:hideMark/>
+          </w:tcPr>
+          <w:p>
+            <w:r>
+              <w:t>Use Case ID</w:t>
+            </w:r>
+          </w:p>
+        </w:tc>
+        <w:tc>
+          <w:tcPr>
+            <w:tcW w:w="0" w:type="auto"/>
+            <w:vAlign w:val="center"/>
+            <w:hideMark/>
+          </w:tcPr>
+          <w:p>
+            <w:r>
+              <w:t>UC-01</w:t>
+            </w:r>
+          </w:p>
+        </w:tc>
+      </w:tr>
+      <w:tr>
+        <w:trPr>
+          <w:tblCellSpacing w:w="15" w:type="dxa"/>
+        </w:trPr>
+        <w:tc>
+          <w:tcPr>
+            <w:tcW w:w="0" w:type="auto"/>
+            <w:vAlign w:val="center"/>
+            <w:hideMark/>
+          </w:tcPr>
+          <w:p>
+            <w:r>
+              <w:t>Use Case Name</w:t>
+            </w:r>
+          </w:p>
+        </w:tc>
+        <w:tc>
+          <w:tcPr>
+            <w:tcW w:w="0" w:type="auto"/>
+            <w:vAlign w:val="center"/>
+            <w:hideMark/>
+          </w:tcPr>
+          <w:p>
+            <w:r>
+              <w:t>View Home Page</w:t>
+            </w:r>
+          </w:p>
+        </w:tc>
+      </w:tr>
+      <w:tr>
+        <w:trPr>
+          <w:tblCellSpacing w:w="15" w:type="dxa"/>
+        </w:trPr>
+        <w:tc>
+          <w:tcPr>
+            <w:tcW w:w="0" w:type="auto"/>
+            <w:vAlign w:val="center"/>
+            <w:hideMark/>
+          </w:tcPr>
+          <w:p>
+            <w:r>
+              <w:t>Primary Actor</w:t>
+            </w:r>
+          </w:p>
+        </w:tc>
+        <w:tc>
+          <w:tcPr>
+            <w:tcW w:w="0" w:type="auto"/>
+            <w:vAlign w:val="center"/>
+            <w:hideMark/>
+          </w:tcPr>
+          <w:p>
+            <w:r>
+              <w:t>Visitor / Recruiter</w:t>
+            </w:r>
+          </w:p>
+        </w:tc>
+      </w:tr>
+      <w:tr>
+        <w:trPr>
+          <w:tblCellSpacing w:w="15" w:type="dxa"/>
+        </w:trPr>
+        <w:tc>
+          <w:tcPr>
+            <w:tcW w:w="0" w:type="auto"/>
+            <w:vAlign w:val="center"/>
+            <w:hideMark/>
+          </w:tcPr>
+          <w:p>
+            <w:r>
+              <w:t>Description</w:t>
+            </w:r>
+          </w:p>
+        </w:tc>
+        <w:tc>
+          <w:tcPr>
+            <w:tcW w:w="0" w:type="auto"/>
+            <w:vAlign w:val="center"/>
+            <w:hideMark/>
+          </w:tcPr>
+          <w:p>
+            <w:r>
+              <w:t>View the owner's name, title, and introduction.</w:t>
+            </w:r>
+          </w:p>
+        </w:tc>
+      </w:tr>
+      <w:tr>
+        <w:trPr>
+          <w:tblCellSpacing w:w="15" w:type="dxa"/>
+        </w:trPr>
+        <w:tc>
+          <w:tcPr>
+            <w:tcW w:w="0" w:type="auto"/>
+            <w:vAlign w:val="center"/>
+            <w:hideMark/>
+          </w:tcPr>
+          <w:p>
+            <w:r>
+              <w:t>Precondition</w:t>
+            </w:r>
+          </w:p>
+        </w:tc>
+        <w:tc>
+          <w:tcPr>
+            <w:tcW w:w="0" w:type="auto"/>
+            <w:vAlign w:val="center"/>
+            <w:hideMark/>
+          </w:tcPr>
+          <w:p>
+            <w:r>
+              <w:t>Website is deployed and accessible.</w:t>
+            </w:r>
+          </w:p>
+        </w:tc>
+      </w:tr>
+      <w:tr>
+        <w:trPr>
+          <w:tblCellSpacing w:w="15" w:type="dxa"/>
+        </w:trPr>
+        <w:tc>
+          <w:tcPr>
+            <w:tcW w:w="0" w:type="auto"/>
+            <w:vAlign w:val="center"/>
+            <w:hideMark/>
+          </w:tcPr>
+          <w:p>
+            <w:r>
+              <w:t>Postcondition</w:t>
+            </w:r>
+          </w:p>
+        </w:tc>
+        <w:tc>
+          <w:tcPr>
+            <w:tcW w:w="0" w:type="auto"/>
+            <w:vAlign w:val="center"/>
+            <w:hideMark/>
+          </w:tcPr>
+          <w:p>
+            <w:r>
+              <w:t>Visitor understands the portfolio owner.</w:t>
+            </w:r>
+          </w:p>
+        </w:tc>
+      </w:tr>
+    </w:tbl>
+    <w:p>
+      <w:r>
+        <w:pict w14:anchorId="6B197895">
+          <v:rect id="_x0000_i1056" style="width:0;height:1.5pt" o:hralign="center" o:hrstd="t" o:hr="t" fillcolor="#a0a0a0" stroked="f"/>
+        </w:pict>
+      </w:r>
+    </w:p>
+    <w:p>
+      <w:pPr>
+        <w:pStyle w:val="Heading3"/>
+      </w:pPr>
+      <w:r>
+        <w:t>UC-02: View Profile Information</w:t>
+      </w:r>
+    </w:p>
+    <w:tbl>
+      <w:tblPr>
+        <w:tblW w:w="0" w:type="auto"/>
+        <w:tblCellSpacing w:w="15" w:type="dxa"/>
+        <w:tblCellMar>
+          <w:top w:w="15" w:type="dxa"/>
+          <w:left w:w="15" w:type="dxa"/>
+          <w:bottom w:w="15" w:type="dxa"/>
+          <w:right w:w="15" w:type="dxa"/>
+        </w:tblCellMar>
+        <w:tblLook w:val="04A0" w:firstRow="1" w:lastRow="0" w:firstColumn="1" w:lastColumn="0" w:noHBand="0" w:noVBand="1"/>
+      </w:tblPr>
+      <w:tblGrid>
+        <w:gridCol w:w="1462"/>
+        <w:gridCol w:w="5068"/>
+      </w:tblGrid>
+      <w:tr>
+        <w:trPr>
+          <w:tblHeader/>
+          <w:tblCellSpacing w:w="15" w:type="dxa"/>
+        </w:trPr>
+        <w:tc>
+          <w:tcPr>
+            <w:tcW w:w="0" w:type="auto"/>
+            <w:vAlign w:val="center"/>
+            <w:hideMark/>
+          </w:tcPr>
+          <w:p>
+            <w:pPr>
+              <w:jc w:val="center"/>
+              <w:rPr>
+                <w:b/>
+                <w:bCs/>
+              </w:rPr>
+            </w:pPr>
+            <w:r>
+              <w:rPr>
+                <w:b/>
+                <w:bCs/>
+              </w:rPr>
+              <w:t>Item</w:t>
+            </w:r>
+          </w:p>
+        </w:tc>
+        <w:tc>
+          <w:tcPr>
+            <w:tcW w:w="0" w:type="auto"/>
+            <w:vAlign w:val="center"/>
+            <w:hideMark/>
+          </w:tcPr>
+          <w:p>
+            <w:pPr>
+              <w:jc w:val="center"/>
+              <w:rPr>
+                <w:b/>
+                <w:bCs/>
+              </w:rPr>
+            </w:pPr>
+            <w:r>
+              <w:rPr>
+                <w:b/>
+                <w:bCs/>
+              </w:rPr>
+              <w:t>Description</w:t>
+            </w:r>
+          </w:p>
+        </w:tc>
+      </w:tr>
+      <w:tr>
+        <w:trPr>
+          <w:tblCellSpacing w:w="15" w:type="dxa"/>
+        </w:trPr>
+        <w:tc>
+          <w:tcPr>
+            <w:tcW w:w="0" w:type="auto"/>
+            <w:vAlign w:val="center"/>
+            <w:hideMark/>
+          </w:tcPr>
+          <w:p>
+            <w:r>
+              <w:t>Use Case ID</w:t>
+            </w:r>
+          </w:p>
+        </w:tc>
+        <w:tc>
+          <w:tcPr>
+            <w:tcW w:w="0" w:type="auto"/>
+            <w:vAlign w:val="center"/>
+            <w:hideMark/>
+          </w:tcPr>
+          <w:p>
+            <w:r>
+              <w:t>UC-02</w:t>
+            </w:r>
+          </w:p>
+        </w:tc>
+      </w:tr>
+      <w:tr>
+        <w:trPr>
+          <w:tblCellSpacing w:w="15" w:type="dxa"/>
+        </w:trPr>
+        <w:tc>
+          <w:tcPr>
+            <w:tcW w:w="0" w:type="auto"/>
+            <w:vAlign w:val="center"/>
+            <w:hideMark/>
+          </w:tcPr>
+          <w:p>
+            <w:r>
+              <w:t>Use Case Name</w:t>
+            </w:r>
+          </w:p>
+        </w:tc>
+        <w:tc>
+          <w:tcPr>
+            <w:tcW w:w="0" w:type="auto"/>
+            <w:vAlign w:val="center"/>
+            <w:hideMark/>
+          </w:tcPr>
+          <w:p>
+            <w:r>
+              <w:t>View Profile Information</w:t>
+            </w:r>
+          </w:p>
+        </w:tc>
+      </w:tr>
+      <w:tr>
+        <w:trPr>
+          <w:tblCellSpacing w:w="15" w:type="dxa"/>
+        </w:trPr>
+        <w:tc>
+          <w:tcPr>
+            <w:tcW w:w="0" w:type="auto"/>
+            <w:vAlign w:val="center"/>
+            <w:hideMark/>
+          </w:tcPr>
+          <w:p>
+            <w:r>
+              <w:t>Primary Actor</w:t>
+            </w:r>
+          </w:p>
+        </w:tc>
+        <w:tc>
+          <w:tcPr>
+            <w:tcW w:w="0" w:type="auto"/>
+            <w:vAlign w:val="center"/>
+            <w:hideMark/>
+          </w:tcPr>
+          <w:p>
+            <w:r>
+              <w:t>Visitor / Recruiter</w:t>
+            </w:r>
+          </w:p>
+        </w:tc>
+      </w:tr>
+      <w:tr>
+        <w:trPr>
+          <w:tblCellSpacing w:w="15" w:type="dxa"/>
+        </w:trPr>
+        <w:tc>
+          <w:tcPr>
+            <w:tcW w:w="0" w:type="auto"/>
+            <w:vAlign w:val="center"/>
+            <w:hideMark/>
+          </w:tcPr>
+          <w:p>
+            <w:r>
+              <w:t>Description</w:t>
+            </w:r>
+          </w:p>
+        </w:tc>
+        <w:tc>
+          <w:tcPr>
+            <w:tcW w:w="0" w:type="auto"/>
+            <w:vAlign w:val="center"/>
+            <w:hideMark/>
+          </w:tcPr>
+          <w:p>
+            <w:r>
+              <w:t>View the About, Education, and Skills sections.</w:t>
+            </w:r>
+          </w:p>
+        </w:tc>
+      </w:tr>
+      <w:tr>
+        <w:trPr>
+          <w:tblCellSpacing w:w="15" w:type="dxa"/>
+        </w:trPr>
+        <w:tc>
+          <w:tcPr>
+            <w:tcW w:w="0" w:type="auto"/>
+            <w:vAlign w:val="center"/>
+            <w:hideMark/>
+          </w:tcPr>
+          <w:p>
+            <w:r>
+              <w:t>Precondition</w:t>
+            </w:r>
+          </w:p>
+        </w:tc>
+        <w:tc>
+          <w:tcPr>
+            <w:tcW w:w="0" w:type="auto"/>
+            <w:vAlign w:val="center"/>
+            <w:hideMark/>
+          </w:tcPr>
+          <w:p>
+            <w:r>
+              <w:t>Profile information is published.</w:t>
+            </w:r>
+          </w:p>
+        </w:tc>
+      </w:tr>
+      <w:tr>
+        <w:trPr>
+          <w:tblCellSpacing w:w="15" w:type="dxa"/>
+        </w:trPr>
+        <w:tc>
+          <w:tcPr>
+            <w:tcW w:w="0" w:type="auto"/>
+            <w:vAlign w:val="center"/>
+            <w:hideMark/>
+          </w:tcPr>
+          <w:p>
+            <w:r>
+              <w:t>Postcondition</w:t>
+            </w:r>
+          </w:p>
+        </w:tc>
+        <w:tc>
+          <w:tcPr>
+            <w:tcW w:w="0" w:type="auto"/>
+            <w:vAlign w:val="center"/>
+            <w:hideMark/>
+          </w:tcPr>
+          <w:p>
+            <w:r>
+              <w:t>Visitor understands the owner's qualifications and skills.</w:t>
+            </w:r>
+          </w:p>
+        </w:tc>
+      </w:tr>
+    </w:tbl>
+    <w:p>
+      <w:r>
+        <w:pict w14:anchorId="4B33DA93">
+          <v:rect id="_x0000_i1057" style="width:0;height:1.5pt" o:hralign="center" o:hrstd="t" o:hr="t" fillcolor="#a0a0a0" stroked="f"/>
+        </w:pict>
+      </w:r>
+    </w:p>
+    <w:p>
+      <w:pPr>
+        <w:pStyle w:val="Heading3"/>
+      </w:pPr>
+      <w:r>
+        <w:t>UC-03: View Projects</w:t>
+      </w:r>
+    </w:p>
+    <w:tbl>
+      <w:tblPr>
+        <w:tblW w:w="0" w:type="auto"/>
+        <w:tblCellSpacing w:w="15" w:type="dxa"/>
+        <w:tblCellMar>
+          <w:top w:w="15" w:type="dxa"/>
+          <w:left w:w="15" w:type="dxa"/>
+          <w:bottom w:w="15" w:type="dxa"/>
+          <w:right w:w="15" w:type="dxa"/>
+        </w:tblCellMar>
+        <w:tblLook w:val="04A0" w:firstRow="1" w:lastRow="0" w:firstColumn="1" w:lastColumn="0" w:noHBand="0" w:noVBand="1"/>
+      </w:tblPr>
+      <w:tblGrid>
+        <w:gridCol w:w="1462"/>
+        <w:gridCol w:w="7178"/>
+      </w:tblGrid>
+      <w:tr>
+        <w:trPr>
+          <w:tblHeader/>
+          <w:tblCellSpacing w:w="15" w:type="dxa"/>
+        </w:trPr>
+        <w:tc>
+          <w:tcPr>
+            <w:tcW w:w="0" w:type="auto"/>
+            <w:vAlign w:val="center"/>
+            <w:hideMark/>
+          </w:tcPr>
+          <w:p>
+            <w:pPr>
+              <w:jc w:val="center"/>
+              <w:rPr>
+                <w:b/>
+                <w:bCs/>
+              </w:rPr>
+            </w:pPr>
+            <w:r>
+              <w:rPr>
+                <w:b/>
+                <w:bCs/>
+              </w:rPr>
+              <w:t>Item</w:t>
+            </w:r>
+          </w:p>
+        </w:tc>
+        <w:tc>
+          <w:tcPr>
+            <w:tcW w:w="7133" w:type="dxa"/>
+            <w:vAlign w:val="center"/>
+            <w:hideMark/>
+          </w:tcPr>
+          <w:p>
+            <w:pPr>
+              <w:jc w:val="center"/>
+              <w:rPr>
+                <w:b/>
+                <w:bCs/>
+              </w:rPr>
+            </w:pPr>
+            <w:r>
+              <w:rPr>
+                <w:b/>
+                <w:bCs/>
+              </w:rPr>
+              <w:t>Description</w:t>
+            </w:r>
+          </w:p>
+        </w:tc>
+      </w:tr>
+      <w:tr>
+        <w:trPr>
+          <w:tblCellSpacing w:w="15" w:type="dxa"/>
+        </w:trPr>
+        <w:tc>
+          <w:tcPr>
+            <w:tcW w:w="0" w:type="auto"/>
+            <w:vAlign w:val="center"/>
+            <w:hideMark/>
+          </w:tcPr>
+          <w:p>
+            <w:r>
+              <w:t>Use Case ID</w:t>
+            </w:r>
+          </w:p>
+        </w:tc>
+        <w:tc>
+          <w:tcPr>
+            <w:tcW w:w="7133" w:type="dxa"/>
+            <w:vAlign w:val="center"/>
+            <w:hideMark/>
+          </w:tcPr>
+          <w:p>
+            <w:r>
+              <w:t>UC-03</w:t>
+            </w:r>
+          </w:p>
+        </w:tc>
+      </w:tr>
+      <w:tr>
+        <w:trPr>
+          <w:tblCellSpacing w:w="15" w:type="dxa"/>
+        </w:trPr>
+        <w:tc>
+          <w:tcPr>
+            <w:tcW w:w="0" w:type="auto"/>
+            <w:vAlign w:val="center"/>
+            <w:hideMark/>
+          </w:tcPr>
+          <w:p>
+            <w:r>
+              <w:t>Use Case Name</w:t>
+            </w:r>
+          </w:p>
+        </w:tc>
+        <w:tc>
+          <w:tcPr>
+            <w:tcW w:w="7133" w:type="dxa"/>
+            <w:vAlign w:val="center"/>
+            <w:hideMark/>
+          </w:tcPr>
+          <w:p>
+            <w:r>
+              <w:t>View Projects</w:t>
+            </w:r>
+          </w:p>
+        </w:tc>
+      </w:tr>
+      <w:tr>
+        <w:trPr>
+          <w:tblCellSpacing w:w="15" w:type="dxa"/>
+        </w:trPr>
+        <w:tc>
+          <w:tcPr>
+            <w:tcW w:w="0" w:type="auto"/>
+            <w:vAlign w:val="center"/>
+            <w:hideMark/>
+          </w:tcPr>
+          <w:p>
+            <w:r>
+              <w:t>Primary Actor</w:t>
+            </w:r>
+          </w:p>
+        </w:tc>
+        <w:tc>
+          <w:tcPr>
+            <w:tcW w:w="7133" w:type="dxa"/>
+            <w:vAlign w:val="center"/>
+            <w:hideMark/>
+          </w:tcPr>
+          <w:p>
+            <w:r>
+              <w:t>Visitor / Recruiter</w:t>
+            </w:r>
+          </w:p>
+        </w:tc>
+      </w:tr>
+      <w:tr>
+        <w:trPr>
+          <w:tblCellSpacing w:w="15" w:type="dxa"/>
+        </w:trPr>
+        <w:tc>
+          <w:tcPr>
+            <w:tcW w:w="0" w:type="auto"/>
+            <w:vAlign w:val="center"/>
+            <w:hideMark/>
+          </w:tcPr>
+          <w:p>
+            <w:r>
+              <w:lastRenderedPageBreak/>
+              <w:t>Description</w:t>
+            </w:r>
+          </w:p>
+        </w:tc>
+        <w:tc>
+          <w:tcPr>
+            <w:tcW w:w="7133" w:type="dxa"/>
+            <w:vAlign w:val="center"/>
+            <w:hideMark/>
+          </w:tcPr>
+          <w:p>
+            <w:r>
+              <w:t>Browse project details, technologies, and links.</w:t>
+            </w:r>
+          </w:p>
+        </w:tc>
+      </w:tr>
+      <w:tr>
+        <w:trPr>
+          <w:tblCellSpacing w:w="15" w:type="dxa"/>
+        </w:trPr>
+        <w:tc>
+          <w:tcPr>
+            <w:tcW w:w="0" w:type="auto"/>
+            <w:vAlign w:val="center"/>
+            <w:hideMark/>
+          </w:tcPr>
+          <w:p>
+            <w:r>
+              <w:t>Precondition</w:t>
+            </w:r>
+          </w:p>
+        </w:tc>
+        <w:tc>
+          <w:tcPr>
+            <w:tcW w:w="7133" w:type="dxa"/>
+            <w:vAlign w:val="center"/>
+            <w:hideMark/>
+          </w:tcPr>
+          <w:p>
+            <w:r>
+              <w:t>Projects are available on the website.</w:t>
+            </w:r>
+          </w:p>
+        </w:tc>
+      </w:tr>
+      <w:tr>
+        <w:trPr>
+          <w:tblCellSpacing w:w="15" w:type="dxa"/>
+        </w:trPr>
+        <w:tc>
+          <w:tcPr>
+            <w:tcW w:w="0" w:type="auto"/>
+            <w:vAlign w:val="center"/>
+            <w:hideMark/>
+          </w:tcPr>
+          <w:p>
+            <w:r>
+              <w:t>Postcondition</w:t>
+            </w:r>
+          </w:p>
+        </w:tc>
+        <w:tc>
+          <w:tcPr>
+            <w:tcW w:w="7133" w:type="dxa"/>
+            <w:vAlign w:val="center"/>
+            <w:hideMark/>
+          </w:tcPr>
+          <w:p>
+            <w:r>
+              <w:t>Visitor evaluates the owner's practical experience.</w:t>
+            </w:r>
+          </w:p>
+        </w:tc>
+      </w:tr>
+    </w:tbl>
+    <w:p>
+      <w:r>
+        <w:pict w14:anchorId="1F55095A">
+          <v:rect id="_x0000_i1058" style="width:0;height:1.5pt" o:hralign="center" o:hrstd="t" o:hr="t" fillcolor="#a0a0a0" stroked="f"/>
+        </w:pict>
+      </w:r>
+    </w:p>
+    <w:p>
+      <w:pPr>
+        <w:pStyle w:val="Heading3"/>
+      </w:pPr>
+      <w:r>
+        <w:t>UC-04: View or Download CV</w:t>
+      </w:r>
+    </w:p>
+    <w:tbl>
+      <w:tblPr>
+        <w:tblW w:w="0" w:type="auto"/>
+        <w:tblCellSpacing w:w="15" w:type="dxa"/>
+        <w:tblCellMar>
+          <w:top w:w="15" w:type="dxa"/>
+          <w:left w:w="15" w:type="dxa"/>
+          <w:bottom w:w="15" w:type="dxa"/>
+          <w:right w:w="15" w:type="dxa"/>
+        </w:tblCellMar>
+        <w:tblLook w:val="04A0" w:firstRow="1" w:lastRow="0" w:firstColumn="1" w:lastColumn="0" w:noHBand="0" w:noVBand="1"/>
+      </w:tblPr>
+      <w:tblGrid>
+        <w:gridCol w:w="1462"/>
+        <w:gridCol w:w="3742"/>
+      </w:tblGrid>
+      <w:tr>
+        <w:trPr>
+          <w:tblHeader/>
+          <w:tblCellSpacing w:w="15" w:type="dxa"/>
+        </w:trPr>
+        <w:tc>
+          <w:tcPr>
+            <w:tcW w:w="0" w:type="auto"/>
+            <w:vAlign w:val="center"/>
+            <w:hideMark/>
+          </w:tcPr>
+          <w:p>
+            <w:pPr>
+              <w:jc w:val="center"/>
+              <w:rPr>
+                <w:b/>
+                <w:bCs/>
+              </w:rPr>
+            </w:pPr>
+            <w:r>
+              <w:rPr>
+                <w:b/>
+                <w:bCs/>
+              </w:rPr>
+              <w:t>Item</w:t>
+            </w:r>
+          </w:p>
+        </w:tc>
+        <w:tc>
+          <w:tcPr>
+            <w:tcW w:w="0" w:type="auto"/>
+            <w:vAlign w:val="center"/>
+            <w:hideMark/>
+          </w:tcPr>
+          <w:p>
+            <w:pPr>
+              <w:jc w:val="center"/>
+              <w:rPr>
+                <w:b/>
+                <w:bCs/>
+              </w:rPr>
+            </w:pPr>
+            <w:r>
+              <w:rPr>
+                <w:b/>
+                <w:bCs/>
+              </w:rPr>
+              <w:t>Description</w:t>
+            </w:r>
+          </w:p>
+        </w:tc>
+      </w:tr>
+      <w:tr>
+        <w:trPr>
+          <w:tblCellSpacing w:w="15" w:type="dxa"/>
+        </w:trPr>
+        <w:tc>
+          <w:tcPr>
+            <w:tcW w:w="0" w:type="auto"/>
+            <w:vAlign w:val="center"/>
+            <w:hideMark/>
+          </w:tcPr>
+          <w:p>
+            <w:r>
+              <w:t>Use Case ID</w:t>
+            </w:r>
+          </w:p>
+        </w:tc>
+        <w:tc>
+          <w:tcPr>
+            <w:tcW w:w="0" w:type="auto"/>
+            <w:vAlign w:val="center"/>
+            <w:hideMark/>
+          </w:tcPr>
+          <w:p>
+            <w:r>
+              <w:t>UC-04</w:t>
+            </w:r>
+          </w:p>
+        </w:tc>
+      </w:tr>
+      <w:tr>
+        <w:trPr>
+          <w:tblCellSpacing w:w="15" w:type="dxa"/>
+        </w:trPr>
+        <w:tc>
+          <w:tcPr>
+            <w:tcW w:w="0" w:type="auto"/>
+            <w:vAlign w:val="center"/>
+            <w:hideMark/>
+          </w:tcPr>
+          <w:p>
+            <w:r>
+              <w:t>Use Case Name</w:t>
+            </w:r>
+          </w:p>
+        </w:tc>
+        <w:tc>
+          <w:tcPr>
+            <w:tcW w:w="0" w:type="auto"/>
+            <w:vAlign w:val="center"/>
+            <w:hideMark/>
+          </w:tcPr>
+          <w:p>
+            <w:r>
+              <w:t>View or Download CV</w:t>
+            </w:r>
+          </w:p>
+        </w:tc>
+      </w:tr>
+      <w:tr>
+        <w:trPr>
+          <w:tblCellSpacing w:w="15" w:type="dxa"/>
+        </w:trPr>
+        <w:tc>
+          <w:tcPr>
+            <w:tcW w:w="0" w:type="auto"/>
+            <w:vAlign w:val="center"/>
+            <w:hideMark/>
+          </w:tcPr>
+          <w:p>
+            <w:r>
+              <w:t>Primary Actor</w:t>
+            </w:r>
+          </w:p>
+        </w:tc>
+        <w:tc>
+          <w:tcPr>
+            <w:tcW w:w="0" w:type="auto"/>
+            <w:vAlign w:val="center"/>
+            <w:hideMark/>
+          </w:tcPr>
+          <w:p>
+            <w:r>
+              <w:t>Visitor / Recruiter</w:t>
+            </w:r>
+          </w:p>
+        </w:tc>
+      </w:tr>
+      <w:tr>
+        <w:trPr>
+          <w:tblCellSpacing w:w="15" w:type="dxa"/>
+        </w:trPr>
+        <w:tc>
+          <w:tcPr>
+            <w:tcW w:w="0" w:type="auto"/>
+            <w:vAlign w:val="center"/>
+            <w:hideMark/>
+          </w:tcPr>
+          <w:p>
+            <w:r>
+              <w:t>Description</w:t>
+            </w:r>
+          </w:p>
+        </w:tc>
+        <w:tc>
+          <w:tcPr>
+            <w:tcW w:w="0" w:type="auto"/>
+            <w:vAlign w:val="center"/>
+            <w:hideMark/>
+          </w:tcPr>
+          <w:p>
+            <w:r>
+              <w:t>Open or download the CV in PDF format.</w:t>
+            </w:r>
+          </w:p>
+        </w:tc>
+      </w:tr>
+      <w:tr>
+        <w:trPr>
+          <w:tblCellSpacing w:w="15" w:type="dxa"/>
+        </w:trPr>
+        <w:tc>
+          <w:tcPr>
+            <w:tcW w:w="0" w:type="auto"/>
+            <w:vAlign w:val="center"/>
+            <w:hideMark/>
+          </w:tcPr>
+          <w:p>
+            <w:r>
+              <w:t>Precondition</w:t>
+            </w:r>
+          </w:p>
+        </w:tc>
+        <w:tc>
+          <w:tcPr>
+            <w:tcW w:w="0" w:type="auto"/>
+            <w:vAlign w:val="center"/>
+            <w:hideMark/>
+          </w:tcPr>
+          <w:p>
+            <w:r>
+              <w:t>CV file is uploaded.</w:t>
+            </w:r>
+          </w:p>
+        </w:tc>
+      </w:tr>
+      <w:tr>
+        <w:trPr>
+          <w:tblCellSpacing w:w="15" w:type="dxa"/>
+        </w:trPr>
+        <w:tc>
+          <w:tcPr>
+            <w:tcW w:w="0" w:type="auto"/>
+            <w:vAlign w:val="center"/>
+            <w:hideMark/>
+          </w:tcPr>
+          <w:p>
+            <w:r>
+              <w:t>Postcondition</w:t>
+            </w:r>
+          </w:p>
+        </w:tc>
+        <w:tc>
+          <w:tcPr>
+            <w:tcW w:w="0" w:type="auto"/>
+            <w:vAlign w:val="center"/>
+            <w:hideMark/>
+          </w:tcPr>
+          <w:p>
+            <w:r>
+              <w:t>CV is viewed or downloaded successfully.</w:t>
+            </w:r>
+          </w:p>
+        </w:tc>
+      </w:tr>
+    </w:tbl>
+    <w:p>
+      <w:r>
+        <w:pict w14:anchorId="1C549445">
+          <v:rect id="_x0000_i1059" style="width:0;height:1.5pt" o:hralign="center" o:hrstd="t" o:hr="t" fillcolor="#a0a0a0" stroked="f"/>
+        </w:pict>
+      </w:r>
+    </w:p>
+    <w:p>
+      <w:pPr>
+        <w:pStyle w:val="Heading3"/>
+      </w:pPr>
+      <w:r>
+        <w:t>UC-05: Navigate via Menu</w:t>
+      </w:r>
+    </w:p>
+    <w:tbl>
+      <w:tblPr>
+        <w:tblW w:w="0" w:type="auto"/>
+        <w:tblCellSpacing w:w="15" w:type="dxa"/>
+        <w:tblCellMar>
+          <w:top w:w="15" w:type="dxa"/>
+          <w:left w:w="15" w:type="dxa"/>
+          <w:bottom w:w="15" w:type="dxa"/>
+          <w:right w:w="15" w:type="dxa"/>
+        </w:tblCellMar>
+        <w:tblLook w:val="04A0" w:firstRow="1" w:lastRow="0" w:firstColumn="1" w:lastColumn="0" w:noHBand="0" w:noVBand="1"/>
+      </w:tblPr>
+      <w:tblGrid>
+        <w:gridCol w:w="1462"/>
+        <w:gridCol w:w="4438"/>
+      </w:tblGrid>
+      <w:tr>
+        <w:trPr>
+          <w:tblHeader/>
+          <w:tblCellSpacing w:w="15" w:type="dxa"/>
+        </w:trPr>
+        <w:tc>
+          <w:tcPr>
+            <w:tcW w:w="0" w:type="auto"/>
+            <w:vAlign w:val="center"/>
+            <w:hideMark/>
+          </w:tcPr>
+          <w:p>
+            <w:pPr>
+              <w:jc w:val="center"/>
+              <w:rPr>
+                <w:b/>
+                <w:bCs/>
+              </w:rPr>
+            </w:pPr>
+            <w:r>
+              <w:rPr>
+                <w:b/>
+                <w:bCs/>
+              </w:rPr>
+              <w:t>Item</w:t>
+            </w:r>
+          </w:p>
+        </w:tc>
+        <w:tc>
+          <w:tcPr>
+            <w:tcW w:w="0" w:type="auto"/>
+            <w:vAlign w:val="center"/>
+            <w:hideMark/>
+          </w:tcPr>
+          <w:p>
+            <w:pPr>
+              <w:jc w:val="center"/>
+              <w:rPr>
+                <w:b/>
+                <w:bCs/>
+              </w:rPr>
+            </w:pPr>
+            <w:r>
+              <w:rPr>
+                <w:b/>
+                <w:bCs/>
+              </w:rPr>
+              <w:t>Description</w:t>
+            </w:r>
+          </w:p>
+        </w:tc>
+      </w:tr>
+      <w:tr>
+        <w:trPr>
+          <w:tblCellSpacing w:w="15" w:type="dxa"/>
+        </w:trPr>
+        <w:tc>
+          <w:tcPr>
+            <w:tcW w:w="0" w:type="auto"/>
+            <w:vAlign w:val="center"/>
+            <w:hideMark/>
+          </w:tcPr>
+          <w:p>
+            <w:r>
+              <w:t>Use Case ID</w:t>
+            </w:r>
+          </w:p>
+        </w:tc>
+        <w:tc>
+          <w:tcPr>
+            <w:tcW w:w="0" w:type="auto"/>
+            <w:vAlign w:val="center"/>
+            <w:hideMark/>
+          </w:tcPr>
+          <w:p>
+            <w:r>
+              <w:t>UC-05</w:t>
+            </w:r>
+          </w:p>
+        </w:tc>
+      </w:tr>
+      <w:tr>
+        <w:trPr>
+          <w:tblCellSpacing w:w="15" w:type="dxa"/>
+        </w:trPr>
+        <w:tc>
+          <w:tcPr>
+            <w:tcW w:w="0" w:type="auto"/>
+            <w:vAlign w:val="center"/>
+            <w:hideMark/>
+          </w:tcPr>
+          <w:p>
+            <w:r>
+              <w:t>Use Case Name</w:t>
+            </w:r>
+          </w:p>
+        </w:tc>
+        <w:tc>
+          <w:tcPr>
+            <w:tcW w:w="0" w:type="auto"/>
+            <w:vAlign w:val="center"/>
+            <w:hideMark/>
+          </w:tcPr>
+          <w:p>
+            <w:r>
+              <w:t>Navigate via Menu</w:t>
+            </w:r>
+          </w:p>
+        </w:tc>
+      </w:tr>
+      <w:tr>
+        <w:trPr>
+          <w:tblCellSpacing w:w="15" w:type="dxa"/>
+        </w:trPr>
+        <w:tc>
+          <w:tcPr>
+            <w:tcW w:w="0" w:type="auto"/>
+            <w:vAlign w:val="center"/>
+            <w:hideMark/>
+          </w:tcPr>
+          <w:p>
+            <w:r>
+              <w:t>Primary Actor</w:t>
+            </w:r>
+          </w:p>
+        </w:tc>
+        <w:tc>
+          <w:tcPr>
+            <w:tcW w:w="0" w:type="auto"/>
+            <w:vAlign w:val="center"/>
+            <w:hideMark/>
+          </w:tcPr>
+          <w:p>
+            <w:r>
+              <w:t>Visitor / Recruiter</w:t>
+            </w:r>
+          </w:p>
+        </w:tc>
+      </w:tr>
+      <w:tr>
+        <w:trPr>
+          <w:tblCellSpacing w:w="15" w:type="dxa"/>
+        </w:trPr>
+        <w:tc>
+          <w:tcPr>
+            <w:tcW w:w="0" w:type="auto"/>
+            <w:vAlign w:val="center"/>
+            <w:hideMark/>
+          </w:tcPr>
+          <w:p>
+            <w:r>
+              <w:t>Description</w:t>
+            </w:r>
+          </w:p>
+        </w:tc>
+        <w:tc>
+          <w:tcPr>
+            <w:tcW w:w="0" w:type="auto"/>
+            <w:vAlign w:val="center"/>
+            <w:hideMark/>
+          </w:tcPr>
+          <w:p>
+            <w:r>
+              <w:t>Move between website sections using the menu.</w:t>
+            </w:r>
+          </w:p>
+        </w:tc>
+      </w:tr>
+      <w:tr>
+        <w:trPr>
+          <w:tblCellSpacing w:w="15" w:type="dxa"/>
+        </w:trPr>
+        <w:tc>
+          <w:tcPr>
+            <w:tcW w:w="0" w:type="auto"/>
+            <w:vAlign w:val="center"/>
+            <w:hideMark/>
+          </w:tcPr>
+          <w:p>
+            <w:r>
+              <w:t>Precondition</w:t>
+            </w:r>
+          </w:p>
+        </w:tc>
+        <w:tc>
+          <w:tcPr>
+            <w:tcW w:w="0" w:type="auto"/>
+            <w:vAlign w:val="center"/>
+            <w:hideMark/>
+          </w:tcPr>
+          <w:p>
+            <w:r>
+              <w:t>Navigation menu is available.</w:t>
+            </w:r>
+          </w:p>
+        </w:tc>
+      </w:tr>
+      <w:tr>
+        <w:trPr>
+          <w:tblCellSpacing w:w="15" w:type="dxa"/>
+        </w:trPr>
+        <w:tc>
+          <w:tcPr>
+            <w:tcW w:w="0" w:type="auto"/>
+            <w:vAlign w:val="center"/>
+            <w:hideMark/>
+          </w:tcPr>
+          <w:p>
+            <w:r>
+              <w:t>Postcondition</w:t>
+            </w:r>
+          </w:p>
+        </w:tc>
+        <w:tc>
+          <w:tcPr>
+            <w:tcW w:w="0" w:type="auto"/>
+            <w:vAlign w:val="center"/>
+            <w:hideMark/>
+          </w:tcPr>
+          <w:p>
+            <w:r>
+              <w:t>Visitor reaches the selected section.</w:t>
+            </w:r>
+          </w:p>
+        </w:tc>
+      </w:tr>
+    </w:tbl>
+    <w:p>
+      <w:r>
+        <w:pict w14:anchorId="73C8D4FC">
+          <v:rect id="_x0000_i1070" style="width:0;height:1.5pt" o:hralign="center" o:hrstd="t" o:hr="t" fillcolor="#a0a0a0" stroked="f"/>
+        </w:pict>
+      </w:r>
+    </w:p>
+    <w:p>
+      <w:pPr>
+        <w:pStyle w:val="Heading3"/>
+      </w:pPr>
+    </w:p>
+    <w:p>
+      <w:pPr>
+        <w:pStyle w:val="Heading3"/>
+      </w:pPr>
+    </w:p>
+    <w:p>
+      <w:pPr>
+        <w:pStyle w:val="Heading3"/>
+      </w:pPr>
+    </w:p>
+    <w:tbl>
+      <w:tblPr>
+        <w:tblpPr w:leftFromText="180" w:rightFromText="180" w:vertAnchor="text" w:tblpX="-180" w:tblpY="1"/>
+        <w:tblOverlap w:val="never"/>
+        <w:tblW w:w="9455" w:type="dxa"/>
+        <w:tblCellSpacing w:w="15" w:type="dxa"/>
+        <w:tblCellMar>
+          <w:top w:w="15" w:type="dxa"/>
+          <w:left w:w="15" w:type="dxa"/>
+          <w:bottom w:w="15" w:type="dxa"/>
+          <w:right w:w="15" w:type="dxa"/>
+        </w:tblCellMar>
+        <w:tblLook w:val="04A0" w:firstRow="1" w:lastRow="0" w:firstColumn="1" w:lastColumn="0" w:noHBand="0" w:noVBand="1"/>
+      </w:tblPr>
+      <w:tblGrid>
+        <w:gridCol w:w="9360"/>
+        <w:gridCol w:w="95"/>
+      </w:tblGrid>
+      <w:tr>
+        <w:trPr>
+          <w:tblCellSpacing w:w="15" w:type="dxa"/>
+        </w:trPr>
+        <w:tc>
+          <w:tcPr>
+            <w:tcW w:w="9315" w:type="dxa"/>
+            <w:vAlign w:val="center"/>
+          </w:tcPr>
+          <w:p>
+            <w:pPr>
+              <w:pStyle w:val="Heading3"/>
+            </w:pPr>
+            <w:r>
+              <w:t>UC-06: View Contact Links</w:t>
+            </w:r>
+          </w:p>
+          <w:tbl>
+            <w:tblPr>
+              <w:tblW w:w="0" w:type="auto"/>
+              <w:tblCellSpacing w:w="15" w:type="dxa"/>
+              <w:tblCellMar>
+                <w:top w:w="15" w:type="dxa"/>
+                <w:left w:w="15" w:type="dxa"/>
+                <w:bottom w:w="15" w:type="dxa"/>
+                <w:right w:w="15" w:type="dxa"/>
+              </w:tblCellMar>
+              <w:tblLook w:val="04A0" w:firstRow="1" w:lastRow="0" w:firstColumn="1" w:lastColumn="0" w:noHBand="0" w:noVBand="1"/>
+            </w:tblPr>
+            <w:tblGrid>
+              <w:gridCol w:w="1462"/>
+              <w:gridCol w:w="4960"/>
+            </w:tblGrid>
+            <w:tr>
+              <w:trPr>
+                <w:tblCellSpacing w:w="15" w:type="dxa"/>
+              </w:trPr>
+              <w:tc>
+                <w:tcPr>
+                  <w:tcW w:w="0" w:type="auto"/>
+                  <w:vAlign w:val="center"/>
+                  <w:hideMark/>
+                </w:tcPr>
+                <w:p>
+                  <w:pPr>
+                    <w:framePr w:hSpace="180" w:wrap="around" w:vAnchor="text" w:hAnchor="text" w:x="-180" w:y="1"/>
+                    <w:suppressOverlap/>
+                    <w:rPr>
+                      <w:b/>
+                      <w:bCs/>
+                    </w:rPr>
+                  </w:pPr>
+                  <w:r>
+                    <w:rPr>
+                      <w:b/>
+                      <w:bCs/>
+                    </w:rPr>
+                    <w:t>Item</w:t>
+                  </w:r>
+                </w:p>
+              </w:tc>
+              <w:tc>
+                <w:tcPr>
+                  <w:tcW w:w="0" w:type="auto"/>
+                  <w:vAlign w:val="center"/>
+                  <w:hideMark/>
+                </w:tcPr>
+                <w:p>
+                  <w:pPr>
+                    <w:framePr w:hSpace="180" w:wrap="around" w:vAnchor="text" w:hAnchor="text" w:x="-180" w:y="1"/>
+                    <w:ind w:left="1210"/>
+                    <w:suppressOverlap/>
+                    <w:rPr>
+                      <w:b/>
+                      <w:bCs/>
+                    </w:rPr>
+                  </w:pPr>
+                  <w:r>
+                    <w:rPr>
+                      <w:b/>
+                      <w:bCs/>
+                    </w:rPr>
+                    <w:t>Description</w:t>
+                  </w:r>
+                </w:p>
+              </w:tc>
+            </w:tr>
+            <w:tr>
+              <w:trPr>
+                <w:tblCellSpacing w:w="15" w:type="dxa"/>
+              </w:trPr>
+              <w:tc>
+                <w:tcPr>
+                  <w:tcW w:w="0" w:type="auto"/>
+                  <w:vAlign w:val="center"/>
+                  <w:hideMark/>
+                </w:tcPr>
+                <w:p>
+                  <w:pPr>
+                    <w:framePr w:hSpace="180" w:wrap="around" w:vAnchor="text" w:hAnchor="text" w:x="-180" w:y="1"/>
+                    <w:suppressOverlap/>
+                  </w:pPr>
+                  <w:r>
+                    <w:t>Use Case ID</w:t>
+                  </w:r>
+                </w:p>
+              </w:tc>
+              <w:tc>
+                <w:tcPr>
+                  <w:tcW w:w="0" w:type="auto"/>
+                  <w:vAlign w:val="center"/>
+                  <w:hideMark/>
+                </w:tcPr>
+                <w:p>
+                  <w:pPr>
+                    <w:framePr w:hSpace="180" w:wrap="around" w:vAnchor="text" w:hAnchor="text" w:x="-180" w:y="1"/>
+                    <w:suppressOverlap/>
+                  </w:pPr>
+                  <w:r>
+                    <w:t>UC-06</w:t>
+                  </w:r>
+                </w:p>
+              </w:tc>
+            </w:tr>
+            <w:tr>
+              <w:trPr>
+                <w:tblCellSpacing w:w="15" w:type="dxa"/>
+              </w:trPr>
+              <w:tc>
+                <w:tcPr>
+                  <w:tcW w:w="0" w:type="auto"/>
+                  <w:vAlign w:val="center"/>
+                  <w:hideMark/>
+                </w:tcPr>
+                <w:p>
+                  <w:pPr>
+                    <w:framePr w:hSpace="180" w:wrap="around" w:vAnchor="text" w:hAnchor="text" w:x="-180" w:y="1"/>
+                    <w:suppressOverlap/>
+                  </w:pPr>
+                  <w:r>
+                    <w:t>Use Case Name</w:t>
+                  </w:r>
+                </w:p>
+              </w:tc>
+              <w:tc>
+                <w:tcPr>
+                  <w:tcW w:w="0" w:type="auto"/>
+                  <w:vAlign w:val="center"/>
+                  <w:hideMark/>
+                </w:tcPr>
+                <w:p>
+                  <w:pPr>
+                    <w:framePr w:hSpace="180" w:wrap="around" w:vAnchor="text" w:hAnchor="text" w:x="-180" w:y="1"/>
+                    <w:suppressOverlap/>
+                  </w:pPr>
+                  <w:r>
+                    <w:t>View Contact Links</w:t>
+                  </w:r>
+                </w:p>
+              </w:tc>
+            </w:tr>
+            <w:tr>
+              <w:trPr>
+                <w:tblCellSpacing w:w="15" w:type="dxa"/>
+              </w:trPr>
+              <w:tc>
+                <w:tcPr>
+                  <w:tcW w:w="0" w:type="auto"/>
+                  <w:vAlign w:val="center"/>
+                  <w:hideMark/>
+                </w:tcPr>
+                <w:p>
+                  <w:pPr>
+                    <w:framePr w:hSpace="180" w:wrap="around" w:vAnchor="text" w:hAnchor="text" w:x="-180" w:y="1"/>
+                    <w:suppressOverlap/>
+                  </w:pPr>
+                  <w:r>
+                    <w:t>Primary Actor</w:t>
+                  </w:r>
+                </w:p>
+              </w:tc>
+              <w:tc>
+                <w:tcPr>
+                  <w:tcW w:w="0" w:type="auto"/>
+                  <w:vAlign w:val="center"/>
+                  <w:hideMark/>
+                </w:tcPr>
+                <w:p>
+                  <w:pPr>
+                    <w:framePr w:hSpace="180" w:wrap="around" w:vAnchor="text" w:hAnchor="text" w:x="-180" w:y="1"/>
+                    <w:suppressOverlap/>
+                  </w:pPr>
+                  <w:r>
+                    <w:t>Visitor / Recruiter</w:t>
+                  </w:r>
+                </w:p>
+              </w:tc>
+            </w:tr>
+            <w:tr>
+              <w:trPr>
+                <w:tblCellSpacing w:w="15" w:type="dxa"/>
+              </w:trPr>
+              <w:tc>
+                <w:tcPr>
+                  <w:tcW w:w="0" w:type="auto"/>
+                  <w:vAlign w:val="center"/>
+                  <w:hideMark/>
+                </w:tcPr>
+                <w:p>
+                  <w:pPr>
+                    <w:framePr w:hSpace="180" w:wrap="around" w:vAnchor="text" w:hAnchor="text" w:x="-180" w:y="1"/>
+                    <w:suppressOverlap/>
+                  </w:pPr>
+                  <w:r>
+                    <w:t>Description</w:t>
+                  </w:r>
+                </w:p>
+              </w:tc>
+              <w:tc>
+                <w:tcPr>
+                  <w:tcW w:w="0" w:type="auto"/>
+                  <w:vAlign w:val="center"/>
+                  <w:hideMark/>
+                </w:tcPr>
+                <w:p>
+                  <w:pPr>
+                    <w:framePr w:hSpace="180" w:wrap="around" w:vAnchor="text" w:hAnchor="text" w:x="-180" w:y="1"/>
+                    <w:suppressOverlap/>
+                  </w:pPr>
+                  <w:r>
+                    <w:t>Access contact details and social links.</w:t>
+                  </w:r>
+                </w:p>
+              </w:tc>
+            </w:tr>
+            <w:tr>
+              <w:trPr>
+                <w:tblCellSpacing w:w="15" w:type="dxa"/>
+              </w:trPr>
+              <w:tc>
+                <w:tcPr>
+                  <w:tcW w:w="0" w:type="auto"/>
+                  <w:vAlign w:val="center"/>
+                  <w:hideMark/>
+                </w:tcPr>
+                <w:p>
+                  <w:pPr>
+                    <w:framePr w:hSpace="180" w:wrap="around" w:vAnchor="text" w:hAnchor="text" w:x="-180" w:y="1"/>
+                    <w:suppressOverlap/>
+                  </w:pPr>
+                  <w:r>
+                    <w:t>Precondition</w:t>
+                  </w:r>
+                </w:p>
+              </w:tc>
+              <w:tc>
+                <w:tcPr>
+                  <w:tcW w:w="0" w:type="auto"/>
+                  <w:vAlign w:val="center"/>
+                  <w:hideMark/>
+                </w:tcPr>
+                <w:p>
+                  <w:pPr>
+                    <w:framePr w:hSpace="180" w:wrap="around" w:vAnchor="text" w:hAnchor="text" w:x="-180" w:y="1"/>
+                    <w:suppressOverlap/>
+                  </w:pPr>
+                  <w:r>
+                    <w:t>Contact information is available.</w:t>
+                  </w:r>
+                </w:p>
+              </w:tc>
+            </w:tr>
+            <w:tr>
+              <w:trPr>
+                <w:tblCellSpacing w:w="15" w:type="dxa"/>
+              </w:trPr>
+              <w:tc>
+                <w:tcPr>
+                  <w:tcW w:w="0" w:type="auto"/>
+                  <w:vAlign w:val="center"/>
+                  <w:hideMark/>
+                </w:tcPr>
+                <w:p>
+                  <w:pPr>
+                    <w:framePr w:hSpace="180" w:wrap="around" w:vAnchor="text" w:hAnchor="text" w:x="-180" w:y="1"/>
+                    <w:suppressOverlap/>
+                  </w:pPr>
+                  <w:r>
+                    <w:t>Postcondition</w:t>
+                  </w:r>
+                </w:p>
+              </w:tc>
+              <w:tc>
+                <w:tcPr>
+                  <w:tcW w:w="0" w:type="auto"/>
+                  <w:vAlign w:val="center"/>
+                  <w:hideMark/>
+                </w:tcPr>
+                <w:p>
+                  <w:pPr>
+                    <w:framePr w:hSpace="180" w:wrap="around" w:vAnchor="text" w:hAnchor="text" w:x="-180" w:y="1"/>
+                    <w:suppressOverlap/>
+                  </w:pPr>
+                  <w:r>
+                    <w:t>Visitor can contact the owner or view external profiles.</w:t>
+                  </w:r>
+                </w:p>
+              </w:tc>
+            </w:tr>
+          </w:tbl>
+          <w:p>
+            <w:pPr>
+              <w:pStyle w:val="Heading2"/>
+            </w:pPr>
+          </w:p>
+          <w:p>
+            <w:pPr>
+              <w:pStyle w:val="Heading2"/>
+            </w:pPr>
+          </w:p>
+          <w:p>
+            <w:pPr>
+              <w:pStyle w:val="Heading2"/>
+            </w:pPr>
+          </w:p>
+          <w:p>
+            <w:pPr>
+              <w:pStyle w:val="Heading2"/>
+            </w:pPr>
+          </w:p>
+          <w:p>
+            <w:pPr>
+              <w:pStyle w:val="Heading2"/>
+            </w:pPr>
+          </w:p>
+          <w:p>
+            <w:pPr>
+              <w:pStyle w:val="Heading2"/>
+            </w:pPr>
+            <w:r>
+              <w:t>1.9.1 Activity: View or Download CV</w:t>
+            </w:r>
+          </w:p>
+          <w:p>
+            <w:pPr>
+              <w:pStyle w:val="Heading3"/>
+              <w:ind w:left="1668"/>
+            </w:pPr>
+            <w:r>
+              <w:t>Activity Description</w:t>
+            </w:r>
+          </w:p>
+          <w:p>
+            <w:pPr>
+              <w:pStyle w:val="NormalWeb"/>
+            </w:pPr>
+            <w:r>
+              <w:t>This activity begins when a visitor accesses the portfolio website. The visitor navigates to the CV section through the navigation menu. Once the CV page is loaded, the visitor can choose either to view the CV online or download it as a PDF file.</w:t>
+            </w:r>
+          </w:p>
+          <w:p>
+            <w:pPr>
+              <w:pStyle w:val="NormalWeb"/>
+              <w:ind w:right="872"/>
+            </w:pPr>
+          </w:p>
+          <w:p>
+            <w:pPr>
+              <w:pStyle w:val="Heading3"/>
+            </w:pPr>
+            <w:r>
+              <w:t>Activity Flow</w:t>
+            </w:r>
+          </w:p>
+          <w:p>
+            <w:pPr>
+              <w:pStyle w:val="NormalWeb"/>
+              <w:numPr>
+                <w:ilvl w:val="0"/>
+                <w:numId w:val="8"/>
+              </w:numPr>
+            </w:pPr>
+            <w:r>
+              <w:t>Visitor lands on the Home Page.</w:t>
+            </w:r>
+          </w:p>
+          <w:p>
+            <w:pPr>
+              <w:pStyle w:val="NormalWeb"/>
+              <w:numPr>
+                <w:ilvl w:val="0"/>
+                <w:numId w:val="8"/>
+              </w:numPr>
+            </w:pPr>
+            <w:r>
+              <w:t>Visitor clicks the Navigation Menu.</w:t>
+            </w:r>
+          </w:p>
+          <w:p>
+            <w:pPr>
+              <w:pStyle w:val="NormalWeb"/>
+              <w:numPr>
+                <w:ilvl w:val="0"/>
+                <w:numId w:val="8"/>
+              </w:numPr>
+            </w:pPr>
+            <w:r>
+              <w:t>Visitor selects the CV section.</w:t>
+            </w:r>
+          </w:p>
+          <w:p>
+            <w:pPr>
+              <w:pStyle w:val="NormalWeb"/>
+              <w:numPr>
+                <w:ilvl w:val="0"/>
+                <w:numId w:val="8"/>
+              </w:numPr>
+            </w:pPr>
+            <w:r>
+              <w:t>System loads the CV preview.</w:t>
+            </w:r>
+          </w:p>
+          <w:p>
+            <w:pPr>
+              <w:pStyle w:val="NormalWeb"/>
+              <w:numPr>
+                <w:ilvl w:val="0"/>
+                <w:numId w:val="8"/>
+              </w:numPr>
+            </w:pPr>
+            <w:r>
+              <w:t>Visitor chooses whether to view the CV online or download it.</w:t>
+            </w:r>
+          </w:p>
+          <w:p>
+            <w:pPr>
+              <w:pStyle w:val="NormalWeb"/>
+              <w:numPr>
+                <w:ilvl w:val="0"/>
+                <w:numId w:val="8"/>
+              </w:numPr>
+            </w:pPr>
+            <w:r>
+              <w:t>System displays the CV or initiates the download.</w:t>
+            </w:r>
+          </w:p>
+          <w:p>
+            <w:pPr>
+              <w:pStyle w:val="NormalWeb"/>
+              <w:numPr>
+                <w:ilvl w:val="0"/>
+                <w:numId w:val="8"/>
+              </w:numPr>
+            </w:pPr>
+            <w:r>
+              <w:t>Activity ends.</w:t>
+            </w:r>
+          </w:p>
+          <w:p>
+            <w:pPr>
+              <w:pStyle w:val="NormalWeb"/>
+            </w:pPr>
+          </w:p>
+          <w:p>
+            <w:pPr>
+              <w:pStyle w:val="Heading3"/>
+            </w:pPr>
+            <w:r>
+              <w:lastRenderedPageBreak/>
+              <w:t>Activity Diagram Structure</w:t>
+            </w:r>
+          </w:p>
+          <w:p>
+            <w:pPr>
+              <w:pStyle w:val="Heading3"/>
+              <w:ind w:left="1132"/>
+            </w:pPr>
+            <w:r>
+              <w:rPr>
+                <w:noProof/>
+                <w14:ligatures w14:val="standardContextual"/>
+              </w:rPr>
+              <mc:AlternateContent>
+                <mc:Choice Requires="wpg">
+                  <w:drawing>
+                    <wp:anchor distT="0" distB="0" distL="114300" distR="114300" simplePos="0" relativeHeight="251668480" behindDoc="0" locked="0" layoutInCell="1" allowOverlap="1" wp14:anchorId="10751A9D" wp14:editId="328B51A8">
+                      <wp:simplePos x="0" y="0"/>
+                      <wp:positionH relativeFrom="column">
+                        <wp:posOffset>2134870</wp:posOffset>
+                      </wp:positionH>
+                      <wp:positionV relativeFrom="paragraph">
+                        <wp:posOffset>2117090</wp:posOffset>
+                      </wp:positionV>
+                      <wp:extent cx="1522095" cy="581025"/>
+                      <wp:effectExtent l="19050" t="19050" r="40005" b="47625"/>
+                      <wp:wrapNone/>
+                      <wp:docPr id="13" name="Group 13"/>
+                      <wp:cNvGraphicFramePr/>
+                      <a:graphic xmlns:a="http://schemas.openxmlformats.org/drawingml/2006/main">
+                        <a:graphicData uri="http://schemas.microsoft.com/office/word/2010/wordprocessingGroup">
+                          <wpg:wgp>
+                            <wpg:cNvGrpSpPr/>
+                            <wpg:grpSpPr>
+                              <a:xfrm>
+                                <a:off x="0" y="0"/>
+                                <a:ext cx="1522095" cy="581025"/>
+                                <a:chOff x="0" y="0"/>
+                                <a:chExt cx="1522095" cy="718820"/>
+                              </a:xfrm>
+                            </wpg:grpSpPr>
+                            <wps:wsp>
+                              <wps:cNvPr id="11" name="Flowchart: Decision 11"/>
+                              <wps:cNvSpPr/>
+                              <wps:spPr>
+                                <a:xfrm>
+                                  <a:off x="0" y="0"/>
+                                  <a:ext cx="1522095" cy="718820"/>
+                                </a:xfrm>
+                                <a:prstGeom prst="flowChartDecision">
+                                  <a:avLst/>
+                                </a:prstGeom>
+                                <a:solidFill>
+                                  <a:schemeClr val="bg1"/>
+                                </a:solidFill>
+                              </wps:spPr>
+                              <wps:style>
+                                <a:lnRef idx="2">
+                                  <a:schemeClr val="dk1">
+                                    <a:shade val="50000"/>
+                                  </a:schemeClr>
+                                </a:lnRef>
+                                <a:fillRef idx="1">
+                                  <a:schemeClr val="dk1"/>
+                                </a:fillRef>
+                                <a:effectRef idx="0">
+                                  <a:schemeClr val="dk1"/>
+                                </a:effectRef>
+                                <a:fontRef idx="minor">
+                                  <a:schemeClr val="lt1"/>
+                                </a:fontRef>
+                              </wps:style>
+                              <wps:bodyPr rot="0" spcFirstLastPara="0" vertOverflow="overflow" horzOverflow="overflow" vert="horz" wrap="square" lIns="91440" tIns="45720" rIns="91440" bIns="45720" numCol="1" spcCol="0" rtlCol="0" fromWordArt="0" anchor="ctr" anchorCtr="0" forceAA="0" compatLnSpc="1">
+                                <a:prstTxWarp prst="textNoShape">
+                                  <a:avLst/>
+                                </a:prstTxWarp>
+                                <a:noAutofit/>
+                              </wps:bodyPr>
+                            </wps:wsp>
+                            <wps:wsp>
+                              <wps:cNvPr id="12" name="Text Box 12"/>
+                              <wps:cNvSpPr txBox="1"/>
+                              <wps:spPr>
+                                <a:xfrm>
+                                  <a:off x="332990" y="135613"/>
+                                  <a:ext cx="855980" cy="433934"/>
+                                </a:xfrm>
+                                <a:prstGeom prst="rect">
+                                  <a:avLst/>
+                                </a:prstGeom>
+                                <a:noFill/>
+                                <a:ln w="6350">
+                                  <a:noFill/>
+                                </a:ln>
+                              </wps:spPr>
+                              <wps:txbx>
+                                <w:txbxContent>
+                                  <w:p>
+                                    <w:pPr>
+                                      <w:jc w:val="center"/>
+                                      <w:rPr>
+                                        <w:b/>
+                                        <w:bCs/>
+                                        <w:sz w:val="16"/>
+                                        <w:szCs w:val="16"/>
+                                      </w:rPr>
+                                    </w:pPr>
+                                    <w:r>
+                                      <w:rPr>
+                                        <w:b/>
+                                        <w:bCs/>
+                                        <w:sz w:val="16"/>
+                                        <w:szCs w:val="16"/>
+                                      </w:rPr>
+                                      <w:t xml:space="preserve">View Inline </w:t>
+                                    </w:r>
+                                    <w:proofErr w:type="gramStart"/>
+                                    <w:r>
+                                      <w:rPr>
+                                        <w:b/>
+                                        <w:bCs/>
+                                        <w:sz w:val="16"/>
+                                        <w:szCs w:val="16"/>
+                                      </w:rPr>
+                                      <w:t>Or</w:t>
+                                    </w:r>
+                                    <w:proofErr w:type="gramEnd"/>
+                                    <w:r>
+                                      <w:rPr>
+                                        <w:b/>
+                                        <w:bCs/>
+                                        <w:sz w:val="16"/>
+                                        <w:szCs w:val="16"/>
+                                      </w:rPr>
+                                      <w:t xml:space="preserve"> Download?</w:t>
+                                    </w:r>
+                                  </w:p>
+                                </w:txbxContent>
+                              </wps:txbx>
+                              <wps:bodyPr rot="0" spcFirstLastPara="0" vertOverflow="overflow" horzOverflow="overflow" vert="horz" wrap="square" lIns="91440" tIns="45720" rIns="91440" bIns="45720" numCol="1" spcCol="0" rtlCol="0" fromWordArt="0" anchor="t" anchorCtr="0" forceAA="0" compatLnSpc="1">
+                                <a:prstTxWarp prst="textNoShape">
+                                  <a:avLst/>
+                                </a:prstTxWarp>
+                                <a:noAutofit/>
+                              </wps:bodyPr>
+                            </wps:wsp>
+                          </wpg:wgp>
+                        </a:graphicData>
+                      </a:graphic>
+                      <wp14:sizeRelH relativeFrom="margin">
+                        <wp14:pctWidth>0</wp14:pctWidth>
+                      </wp14:sizeRelH>
+                      <wp14:sizeRelV relativeFrom="margin">
+                        <wp14:pctHeight>0</wp14:pctHeight>
+                      </wp14:sizeRelV>
+                    </wp:anchor>
+                  </w:drawing>
+                </mc:Choice>
+                <mc:Fallback>
+                  <w:pict>
+                    <v:group w14:anchorId="10751A9D" id="Group 13" o:spid="_x0000_s1026" style="position:absolute;left:0;text-align:left;margin-left:168.1pt;margin-top:166.7pt;width:119.85pt;height:45.75pt;z-index:251668480;mso-width-relative:margin;mso-height-relative:margin" coordsize="15220,7188" o:gfxdata="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">
+                      <v:shapetype id="_x0000_t110" coordsize="21600,21600" o:spt="110" path="m10800,l,10800,10800,21600,21600,10800xe">
+                        <v:stroke joinstyle="miter"/>
+                        <v:path gradientshapeok="t" o:connecttype="rect" textboxrect="5400,5400,16200,16200"/>
+                      </v:shapetype>
+                      <v:shape id="Flowchart: Decision 11" o:spid="_x0000_s1027" type="#_x0000_t110" style="position:absolute;width:15220;height:7188;visibility:visible;mso-wrap-style:square;v-text-anchor:middle" o:gfxdata="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" fillcolor="white [3212]" strokecolor="black [1600]" strokeweight="1pt"/>
+                      <v:shapetype id="_x0000_t202" coordsize="21600,21600" o:spt="202" path="m,l,21600r21600,l21600,xe">
+                        <v:stroke joinstyle="miter"/>
+                        <v:path gradientshapeok="t" o:connecttype="rect"/>
+                      </v:shapetype>
+                      <v:shape id="Text Box 12" o:spid="_x0000_s1028" type="#_x0000_t202" style="position:absolute;left:3329;top:1356;width:8560;height:4339;visibility:visible;mso-wrap-style:square;v-text-anchor:top" o:gfxdata="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" filled="f" stroked="f" strokeweight=".5pt">
+                        <v:textbox>
+                          <w:txbxContent>
+                            <w:p>
+                              <w:pPr>
+                                <w:jc w:val="center"/>
+                                <w:rPr>
+                                  <w:b/>
+                                  <w:bCs/>
+                                  <w:sz w:val="16"/>
+                                  <w:szCs w:val="16"/>
+                                </w:rPr>
+                              </w:pPr>
+                              <w:r>
+                                <w:rPr>
+                                  <w:b/>
+                                  <w:bCs/>
+                                  <w:sz w:val="16"/>
+                                  <w:szCs w:val="16"/>
+                                </w:rPr>
+                                <w:t xml:space="preserve">View Inline </w:t>
+                              </w:r>
+                              <w:proofErr w:type="gramStart"/>
+                              <w:r>
+                                <w:rPr>
+                                  <w:b/>
+                                  <w:bCs/>
+                                  <w:sz w:val="16"/>
+                                  <w:szCs w:val="16"/>
+                                </w:rPr>
+                                <w:t>Or</w:t>
+                              </w:r>
+                              <w:proofErr w:type="gramEnd"/>
+                              <w:r>
+                                <w:rPr>
+                                  <w:b/>
+                                  <w:bCs/>
+                                  <w:sz w:val="16"/>
+                                  <w:szCs w:val="16"/>
+                                </w:rPr>
+                                <w:t xml:space="preserve"> Download?</w:t>
+                              </w:r>
+                            </w:p>
+                          </w:txbxContent>
+                        </v:textbox>
+                      </v:shape>
+                    </v:group>
+                  </w:pict>
+                </mc:Fallback>
+              </mc:AlternateContent>
+            </w:r>
+            <w:r>
+              <w:rPr>
+                <w:noProof/>
+              </w:rPr>
+              <w:drawing>
+                <wp:inline distT="0" distB="0" distL="0" distR="0" wp14:anchorId="56E429A1" wp14:editId="1E5CABEF">
+                  <wp:extent cx="4326033" cy="3817088"/>
+                  <wp:effectExtent l="0" t="0" r="0" b="0"/>
+                  <wp:docPr id="4" name="Picture 4"/>
+                  <wp:cNvGraphicFramePr>
+                    <a:graphicFrameLocks xmlns:a="http://schemas.openxmlformats.org/drawingml/2006/main" noChangeAspect="1"/>
+                  </wp:cNvGraphicFramePr>
+                  <a:graphic xmlns:a="http://schemas.openxmlformats.org/drawingml/2006/main">
+                    <a:graphicData uri="http://schemas.openxmlformats.org/drawingml/2006/picture">
+                      <pic:pic xmlns:pic="http://schemas.openxmlformats.org/drawingml/2006/picture">
+                        <pic:nvPicPr>
+                          <pic:cNvPr id="0" name="Picture 42"/>
+                          <pic:cNvPicPr>
+                            <a:picLocks noChangeAspect="1" noChangeArrowheads="1"/>
+                          </pic:cNvPicPr>
+                        </pic:nvPicPr>
+                        <pic:blipFill>
+                          <a:blip r:embed="rId8" cstate="print">
+                            <a:extLst>
+                              <a:ext uri="{28A0092B-C50C-407E-A947-70E740481C1C}">
+                                <a14:useLocalDpi xmlns:a14="http://schemas.microsoft.com/office/drawing/2010/main" val="0"/>
+                              </a:ext>
+                            </a:extLst>
+                          </a:blip>
+                          <a:srcRect/>
+                          <a:stretch>
+                            <a:fillRect/>
+                          </a:stretch>
+                        </pic:blipFill>
+                        <pic:spPr bwMode="auto">
+                          <a:xfrm>
+                            <a:off x="0" y="0"/>
+                            <a:ext cx="4369181" cy="3855160"/>
+                          </a:xfrm>
+                          <a:prstGeom prst="rect">
+                            <a:avLst/>
+                          </a:prstGeom>
+                          <a:noFill/>
+                          <a:ln>
+                            <a:noFill/>
+                          </a:ln>
+                        </pic:spPr>
+                      </pic:pic>
+                    </a:graphicData>
+                  </a:graphic>
+                </wp:inline>
+              </w:drawing>
+            </w:r>
+            <w:bookmarkStart w:id="0" w:name="_GoBack"/>
+            <w:bookmarkEnd w:id="0"/>
+          </w:p>
+          <w:p>
+            <w:pPr>
+              <w:pStyle w:val="Heading3"/>
+            </w:pPr>
+            <w:r>
+              <w:t>Symbols Used</w:t>
+            </w:r>
+          </w:p>
+          <w:tbl>
+            <w:tblPr>
+              <w:tblW w:w="0" w:type="auto"/>
+              <w:tblCellSpacing w:w="15" w:type="dxa"/>
+              <w:tblCellMar>
+                <w:top w:w="15" w:type="dxa"/>
+                <w:left w:w="15" w:type="dxa"/>
+                <w:bottom w:w="15" w:type="dxa"/>
+                <w:right w:w="15" w:type="dxa"/>
+              </w:tblCellMar>
+              <w:tblLook w:val="04A0" w:firstRow="1" w:lastRow="0" w:firstColumn="1" w:lastColumn="0" w:noHBand="0" w:noVBand="1"/>
+            </w:tblPr>
+            <w:tblGrid>
+              <w:gridCol w:w="750"/>
+              <w:gridCol w:w="2199"/>
+            </w:tblGrid>
+            <w:tr>
+              <w:trPr>
+                <w:tblHeader/>
+                <w:tblCellSpacing w:w="15" w:type="dxa"/>
+              </w:trPr>
+              <w:tc>
+                <w:tcPr>
+                  <w:tcW w:w="0" w:type="auto"/>
+                  <w:vAlign w:val="center"/>
+                  <w:hideMark/>
+                </w:tcPr>
+                <w:p>
+                  <w:pPr>
+                    <w:framePr w:hSpace="180" w:wrap="around" w:vAnchor="text" w:hAnchor="text" w:x="-180" w:y="1"/>
+                    <w:suppressOverlap/>
+                    <w:rPr>
+                      <w:b/>
+                      <w:bCs/>
+                    </w:rPr>
+                  </w:pPr>
+                  <w:r>
+                    <w:rPr>
+                      <w:b/>
+                      <w:bCs/>
+                    </w:rPr>
+                    <w:t>Symbol</w:t>
+                  </w:r>
+                </w:p>
+              </w:tc>
+              <w:tc>
+                <w:tcPr>
+                  <w:tcW w:w="0" w:type="auto"/>
+                  <w:vAlign w:val="center"/>
+                  <w:hideMark/>
+                </w:tcPr>
+                <w:p>
+                  <w:pPr>
+                    <w:framePr w:hSpace="180" w:wrap="around" w:vAnchor="text" w:hAnchor="text" w:x="-180" w:y="1"/>
+                    <w:ind w:left="206" w:hanging="206"/>
+                    <w:suppressOverlap/>
+                    <w:jc w:val="center"/>
+                    <w:rPr>
+                      <w:b/>
+                      <w:bCs/>
+                    </w:rPr>
+                  </w:pPr>
+                  <w:r>
+                    <w:rPr>
+                      <w:b/>
+                      <w:bCs/>
+                    </w:rPr>
+                    <w:t>Meaning</w:t>
+                  </w:r>
+                </w:p>
+              </w:tc>
+            </w:tr>
+            <w:tr>
+              <w:trPr>
+                <w:tblCellSpacing w:w="15" w:type="dxa"/>
+              </w:trPr>
+              <w:tc>
+                <w:tcPr>
+                  <w:tcW w:w="0" w:type="auto"/>
+                  <w:vAlign w:val="center"/>
+                  <w:hideMark/>
+                </w:tcPr>
+                <w:p>
+                  <w:pPr>
+                    <w:framePr w:hSpace="180" w:wrap="around" w:vAnchor="text" w:hAnchor="text" w:x="-180" w:y="1"/>
+                    <w:suppressOverlap/>
+                  </w:pPr>
+                  <w:r>
+                    <w:rPr>
+                      <w:noProof/>
+                    </w:rPr>
+                    <mc:AlternateContent>
+                      <mc:Choice Requires="wps">
+                        <w:drawing>
+                          <wp:anchor distT="0" distB="0" distL="114300" distR="114300" simplePos="0" relativeHeight="251658240" behindDoc="0" locked="0" layoutInCell="1" allowOverlap="1" wp14:anchorId="586DF768" wp14:editId="7074438D">
+                            <wp:simplePos x="0" y="0"/>
+                            <wp:positionH relativeFrom="column">
+                              <wp:posOffset>-63500</wp:posOffset>
+                            </wp:positionH>
+                            <wp:positionV relativeFrom="paragraph">
+                              <wp:posOffset>-27940</wp:posOffset>
+                            </wp:positionV>
+                            <wp:extent cx="248920" cy="226060"/>
+                            <wp:effectExtent l="0" t="0" r="17780" b="21590"/>
+                            <wp:wrapNone/>
+                            <wp:docPr id="6" name="Oval 6"/>
+                            <wp:cNvGraphicFramePr/>
+                            <a:graphic xmlns:a="http://schemas.openxmlformats.org/drawingml/2006/main">
+                              <a:graphicData uri="http://schemas.microsoft.com/office/word/2010/wordprocessingShape">
+                                <wps:wsp>
+                                  <wps:cNvSpPr/>
+                                  <wps:spPr>
+                                    <a:xfrm>
+                                      <a:off x="0" y="0"/>
+                                      <a:ext cx="248920" cy="226060"/>
+                                    </a:xfrm>
+                                    <a:prstGeom prst="ellipse">
+                                      <a:avLst/>
+                                    </a:prstGeom>
+                                  </wps:spPr>
+                                  <wps:style>
+                                    <a:lnRef idx="2">
+                                      <a:schemeClr val="dk1">
+                                        <a:shade val="50000"/>
+                                      </a:schemeClr>
+                                    </a:lnRef>
+                                    <a:fillRef idx="1">
+                                      <a:schemeClr val="dk1"/>
+                                    </a:fillRef>
+                                    <a:effectRef idx="0">
+                                      <a:schemeClr val="dk1"/>
+                                    </a:effectRef>
+                                    <a:fontRef idx="minor">
+                                      <a:schemeClr val="lt1"/>
+                                    </a:fontRef>
+                                  </wps:style>
+                                  <wps:bodyPr rot="0" spcFirstLastPara="0" vertOverflow="overflow" horzOverflow="overflow" vert="horz" wrap="square" lIns="91440" tIns="45720" rIns="91440" bIns="45720" numCol="1" spcCol="0" rtlCol="0" fromWordArt="0" anchor="ctr" anchorCtr="0" forceAA="0" compatLnSpc="1">
+                                    <a:prstTxWarp prst="textNoShape">
+                                      <a:avLst/>
+                                    </a:prstTxWarp>
+                                    <a:noAutofit/>
+                                  </wps:bodyPr>
+                                </wps:wsp>
+                              </a:graphicData>
+                            </a:graphic>
+                            <wp14:sizeRelH relativeFrom="margin">
+                              <wp14:pctWidth>0</wp14:pctWidth>
+                            </wp14:sizeRelH>
+                            <wp14:sizeRelV relativeFrom="margin">
+                              <wp14:pctHeight>0</wp14:pctHeight>
+                            </wp14:sizeRelV>
+                          </wp:anchor>
+                        </w:drawing>
+                      </mc:Choice>
+                      <mc:Fallback>
+                        <w:pict>
+                          <v:oval w14:anchorId="1F34D2E0" id="Oval 6" o:spid="_x0000_s1026" style="position:absolute;margin-left:-5pt;margin-top:-2.2pt;width:19.6pt;height:17.8pt;z-index:251658240;visibility:visible;mso-wrap-style:square;mso-width-percent:0;mso-height-percent:0;mso-wrap-distance-left:9pt;mso-wrap-distance-top:0;mso-wrap-distance-right:9pt;mso-wrap-distance-bottom:0;mso-position-horizontal:absolute;mso-position-horizontal-relative:text;mso-position-vertical:absolute;mso-position-vertical-relative:text;mso-width-percent:0;mso-height-percent:0;mso-width-relative:margin;mso-height-relative:margin;v-text-anchor:middle" o:gfxdata="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" fillcolor="black [3200]" strokecolor="black [1600]" strokeweight="1pt">
+                            <v:stroke joinstyle="miter"/>
+                          </v:oval>
+                        </w:pict>
+                      </mc:Fallback>
+                    </mc:AlternateContent>
+                  </w:r>
+                  <w:r>
+                    <w:t>●</w:t>
+                  </w:r>
+                </w:p>
+              </w:tc>
+              <w:tc>
+                <w:tcPr>
+                  <w:tcW w:w="0" w:type="auto"/>
+                  <w:vAlign w:val="center"/>
+                  <w:hideMark/>
+                </w:tcPr>
+                <w:p>
+                  <w:pPr>
+                    <w:framePr w:hSpace="180" w:wrap="around" w:vAnchor="text" w:hAnchor="text" w:x="-180" w:y="1"/>
+                    <w:ind w:left="603" w:firstLine="96"/>
+                    <w:suppressOverlap/>
+                  </w:pPr>
+                  <w:r>
+                    <w:t>Start Node</w:t>
+                  </w:r>
+                </w:p>
+              </w:tc>
+            </w:tr>
+            <w:tr>
+              <w:trPr>
+                <w:tblCellSpacing w:w="15" w:type="dxa"/>
+              </w:trPr>
+              <w:tc>
+                <w:tcPr>
+                  <w:tcW w:w="0" w:type="auto"/>
+                  <w:vAlign w:val="center"/>
+                  <w:hideMark/>
+                </w:tcPr>
+                <w:p>
+                  <w:pPr>
+                    <w:framePr w:hSpace="180" w:wrap="around" w:vAnchor="text" w:hAnchor="text" w:x="-180" w:y="1"/>
+                    <w:suppressOverlap/>
+                  </w:pPr>
+                  <w:r>
+                    <w:rPr>
+                      <w:noProof/>
+                    </w:rPr>
+                    <mc:AlternateContent>
+                      <mc:Choice Requires="wps">
+                        <w:drawing>
+                          <wp:anchor distT="0" distB="0" distL="114300" distR="114300" simplePos="0" relativeHeight="251657216" behindDoc="0" locked="0" layoutInCell="1" allowOverlap="1" wp14:anchorId="17FE35D3" wp14:editId="37505CC7">
+                            <wp:simplePos x="0" y="0"/>
+                            <wp:positionH relativeFrom="column">
+                              <wp:posOffset>-50800</wp:posOffset>
+                            </wp:positionH>
+                            <wp:positionV relativeFrom="paragraph">
+                              <wp:posOffset>-74295</wp:posOffset>
+                            </wp:positionV>
+                            <wp:extent cx="250825" cy="140335"/>
+                            <wp:effectExtent l="0" t="0" r="15875" b="12065"/>
+                            <wp:wrapNone/>
+                            <wp:docPr id="5" name="Rectangle: Rounded Corners 5"/>
+                            <wp:cNvGraphicFramePr/>
+                            <a:graphic xmlns:a="http://schemas.openxmlformats.org/drawingml/2006/main">
+                              <a:graphicData uri="http://schemas.microsoft.com/office/word/2010/wordprocessingShape">
+                                <wps:wsp>
+                                  <wps:cNvSpPr/>
+                                  <wps:spPr>
+                                    <a:xfrm>
+                                      <a:off x="0" y="0"/>
+                                      <a:ext cx="250825" cy="140335"/>
+                                    </a:xfrm>
+                                    <a:prstGeom prst="roundRect">
+                                      <a:avLst/>
+                                    </a:prstGeom>
+                                    <a:solidFill>
+                                      <a:schemeClr val="bg1"/>
+                                    </a:solidFill>
+                                  </wps:spPr>
+                                  <wps:style>
+                                    <a:lnRef idx="2">
+                                      <a:schemeClr val="dk1">
+                                        <a:shade val="50000"/>
+                                      </a:schemeClr>
+                                    </a:lnRef>
+                                    <a:fillRef idx="1">
+                                      <a:schemeClr val="dk1"/>
+                                    </a:fillRef>
+                                    <a:effectRef idx="0">
+                                      <a:schemeClr val="dk1"/>
+                                    </a:effectRef>
+                                    <a:fontRef idx="minor">
+                                      <a:schemeClr val="lt1"/>
+                                    </a:fontRef>
+                                  </wps:style>
+                                  <wps:bodyPr rot="0" spcFirstLastPara="0" vertOverflow="overflow" horzOverflow="overflow" vert="horz" wrap="square" lIns="91440" tIns="45720" rIns="91440" bIns="45720" numCol="1" spcCol="0" rtlCol="0" fromWordArt="0" anchor="ctr" anchorCtr="0" forceAA="0" compatLnSpc="1">
+                                    <a:prstTxWarp prst="textNoShape">
+                                      <a:avLst/>
+                                    </a:prstTxWarp>
+                                    <a:noAutofit/>
+                                  </wps:bodyPr>
+                                </wps:wsp>
+                              </a:graphicData>
+                            </a:graphic>
+                            <wp14:sizeRelH relativeFrom="margin">
+                              <wp14:pctWidth>0</wp14:pctWidth>
+                            </wp14:sizeRelH>
+                            <wp14:sizeRelV relativeFrom="margin">
+                              <wp14:pctHeight>0</wp14:pctHeight>
+                            </wp14:sizeRelV>
+                          </wp:anchor>
+                        </w:drawing>
+                      </mc:Choice>
+                      <mc:Fallback>
+                        <w:pict>
+                          <v:roundrect w14:anchorId="253114AC" id="Rectangle: Rounded Corners 5" o:spid="_x0000_s1026" style="position:absolute;margin-left:-4pt;margin-top:-5.85pt;width:19.75pt;height:11.05pt;z-index:251657216;visibility:visible;mso-wrap-style:square;mso-width-percent:0;mso-height-percent:0;mso-wrap-distance-left:9pt;mso-wrap-distance-top:0;mso-wrap-distance-right:9pt;mso-wrap-distance-bottom:0;mso-position-horizontal:absolute;mso-position-horizontal-relative:text;mso-position-vertical:absolute;mso-position-vertical-relative:text;mso-width-percent:0;mso-height-percent:0;mso-width-relative:margin;mso-height-relative:margin;v-text-anchor:middle" arcsize="10923f" o:gfxdata="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" fillcolor="white [3212]" strokecolor="black [1600]" strokeweight="1pt">
+                            <v:stroke joinstyle="miter"/>
+                          </v:roundrect>
+                        </w:pict>
+                      </mc:Fallback>
+                    </mc:AlternateContent>
+                  </w:r>
+                </w:p>
+              </w:tc>
+              <w:tc>
+                <w:tcPr>
+                  <w:tcW w:w="0" w:type="auto"/>
+                  <w:vAlign w:val="center"/>
+                  <w:hideMark/>
+                </w:tcPr>
+                <w:p>
+                  <w:pPr>
+                    <w:framePr w:hSpace="180" w:wrap="around" w:vAnchor="text" w:hAnchor="text" w:x="-180" w:y="1"/>
+                    <w:ind w:left="603" w:firstLine="96"/>
+                    <w:suppressOverlap/>
+                  </w:pPr>
+                  <w:r>
+                    <w:t>Activity / Action</w:t>
+                  </w:r>
+                </w:p>
+              </w:tc>
+            </w:tr>
+            <w:tr>
+              <w:trPr>
+                <w:tblCellSpacing w:w="15" w:type="dxa"/>
+              </w:trPr>
+              <w:tc>
+                <w:tcPr>
+                  <w:tcW w:w="0" w:type="auto"/>
+                  <w:vAlign w:val="center"/>
+                  <w:hideMark/>
+                </w:tcPr>
+                <w:p>
+                  <w:pPr>
+                    <w:framePr w:hSpace="180" w:wrap="around" w:vAnchor="text" w:hAnchor="text" w:x="-180" w:y="1"/>
+                    <w:suppressOverlap/>
+                  </w:pPr>
+                  <w:r>
+                    <w:rPr>
+                      <w:noProof/>
+                    </w:rPr>
+                    <mc:AlternateContent>
+                      <mc:Choice Requires="wps">
+                        <w:drawing>
+                          <wp:anchor distT="0" distB="0" distL="114300" distR="114300" simplePos="0" relativeHeight="251659264" behindDoc="0" locked="0" layoutInCell="1" allowOverlap="1" wp14:anchorId="4EB2EB71" wp14:editId="21040F25">
+                            <wp:simplePos x="0" y="0"/>
+                            <wp:positionH relativeFrom="column">
+                              <wp:posOffset>-16510</wp:posOffset>
+                            </wp:positionH>
+                            <wp:positionV relativeFrom="paragraph">
+                              <wp:posOffset>-17145</wp:posOffset>
+                            </wp:positionV>
+                            <wp:extent cx="187325" cy="187325"/>
+                            <wp:effectExtent l="57150" t="57150" r="22225" b="60325"/>
+                            <wp:wrapNone/>
+                            <wp:docPr id="7" name="Rectangle 7"/>
+                            <wp:cNvGraphicFramePr/>
+                            <a:graphic xmlns:a="http://schemas.openxmlformats.org/drawingml/2006/main">
+                              <a:graphicData uri="http://schemas.microsoft.com/office/word/2010/wordprocessingShape">
+                                <wps:wsp>
+                                  <wps:cNvSpPr/>
+                                  <wps:spPr>
+                                    <a:xfrm rot="2725754">
+                                      <a:off x="0" y="0"/>
+                                      <a:ext cx="187325" cy="187325"/>
+                                    </a:xfrm>
+                                    <a:prstGeom prst="rect">
+                                      <a:avLst/>
+                                    </a:prstGeom>
+                                    <a:solidFill>
+                                      <a:schemeClr val="bg1"/>
+                                    </a:solidFill>
+                                  </wps:spPr>
+                                  <wps:style>
+                                    <a:lnRef idx="2">
+                                      <a:schemeClr val="dk1">
+                                        <a:shade val="50000"/>
+                                      </a:schemeClr>
+                                    </a:lnRef>
+                                    <a:fillRef idx="1">
+                                      <a:schemeClr val="dk1"/>
+                                    </a:fillRef>
+                                    <a:effectRef idx="0">
+                                      <a:schemeClr val="dk1"/>
+                                    </a:effectRef>
+                                    <a:fontRef idx="minor">
+                                      <a:schemeClr val="lt1"/>
+                                    </a:fontRef>
+                                  </wps:style>
+                                  <wps:bodyPr rot="0" spcFirstLastPara="0" vertOverflow="overflow" horzOverflow="overflow" vert="horz" wrap="square" lIns="91440" tIns="45720" rIns="91440" bIns="45720" numCol="1" spcCol="0" rtlCol="0" fromWordArt="0" anchor="ctr" anchorCtr="0" forceAA="0" compatLnSpc="1">
+                                    <a:prstTxWarp prst="textNoShape">
+                                      <a:avLst/>
+                                    </a:prstTxWarp>
+                                    <a:noAutofit/>
+                                  </wps:bodyPr>
+                                </wps:wsp>
+                              </a:graphicData>
+                            </a:graphic>
+                            <wp14:sizeRelH relativeFrom="margin">
+                              <wp14:pctWidth>0</wp14:pctWidth>
+                            </wp14:sizeRelH>
+                            <wp14:sizeRelV relativeFrom="margin">
+                              <wp14:pctHeight>0</wp14:pctHeight>
+                            </wp14:sizeRelV>
+                          </wp:anchor>
+                        </w:drawing>
+                      </mc:Choice>
+                      <mc:Fallback>
+                        <w:pict>
+                          <v:rect w14:anchorId="05D816C0" id="Rectangle 7" o:spid="_x0000_s1026" style="position:absolute;margin-left:-1.3pt;margin-top:-1.35pt;width:14.75pt;height:14.75pt;rotation:2977250fd;z-index:251659264;visibility:visible;mso-wrap-style:square;mso-width-percent:0;mso-height-percent:0;mso-wrap-distance-left:9pt;mso-wrap-distance-top:0;mso-wrap-distance-right:9pt;mso-wrap-distance-bottom:0;mso-position-horizontal:absolute;mso-position-horizontal-relative:text;mso-position-vertical:absolute;mso-position-vertical-relative:text;mso-width-percent:0;mso-height-percent:0;mso-width-relative:margin;mso-height-relative:margin;v-text-anchor:middle" o:gfxdata="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" fillcolor="white [3212]" strokecolor="black [1600]" strokeweight="1pt"/>
+                        </w:pict>
+                      </mc:Fallback>
+                    </mc:AlternateContent>
+                  </w:r>
+                  <w:r>
+                    <w:rPr>
+                      <w:rFonts w:ascii="Cambria Math" w:hAnsi="Cambria Math" w:cs="Cambria Math"/>
+                    </w:rPr>
+                    <w:t>◇</w:t>
+                  </w:r>
+                </w:p>
+              </w:tc>
+              <w:tc>
+                <w:tcPr>
+                  <w:tcW w:w="0" w:type="auto"/>
+                  <w:vAlign w:val="center"/>
+                  <w:hideMark/>
+                </w:tcPr>
+                <w:p>
+                  <w:pPr>
+                    <w:framePr w:hSpace="180" w:wrap="around" w:vAnchor="text" w:hAnchor="text" w:x="-180" w:y="1"/>
+                    <w:ind w:left="603" w:firstLine="96"/>
+                    <w:suppressOverlap/>
+                  </w:pPr>
+                  <w:r>
+                    <w:t>Decision Node</w:t>
+                  </w:r>
+                </w:p>
+              </w:tc>
+            </w:tr>
+            <w:tr>
+              <w:trPr>
+                <w:tblCellSpacing w:w="15" w:type="dxa"/>
+              </w:trPr>
+              <w:tc>
+                <w:tcPr>
+                  <w:tcW w:w="0" w:type="auto"/>
+                  <w:vAlign w:val="center"/>
+                  <w:hideMark/>
+                </w:tcPr>
+                <w:p>
+                  <w:pPr>
+                    <w:framePr w:hSpace="180" w:wrap="around" w:vAnchor="text" w:hAnchor="text" w:x="-180" w:y="1"/>
+                    <w:suppressOverlap/>
+                  </w:pPr>
+                  <w:r>
+                    <w:rPr>
+                      <w:noProof/>
+                    </w:rPr>
+                    <mc:AlternateContent>
+                      <mc:Choice Requires="wpg">
+                        <w:drawing>
+                          <wp:anchor distT="0" distB="0" distL="114300" distR="114300" simplePos="0" relativeHeight="251665408" behindDoc="0" locked="0" layoutInCell="1" allowOverlap="1" wp14:anchorId="34096D27" wp14:editId="33C5B18B">
+                            <wp:simplePos x="0" y="0"/>
+                            <wp:positionH relativeFrom="column">
+                              <wp:posOffset>-52705</wp:posOffset>
+                            </wp:positionH>
+                            <wp:positionV relativeFrom="paragraph">
+                              <wp:posOffset>-50165</wp:posOffset>
+                            </wp:positionV>
+                            <wp:extent cx="222885" cy="222885"/>
+                            <wp:effectExtent l="0" t="0" r="24765" b="24765"/>
+                            <wp:wrapNone/>
+                            <wp:docPr id="10" name="Group 10"/>
+                            <wp:cNvGraphicFramePr/>
+                            <a:graphic xmlns:a="http://schemas.openxmlformats.org/drawingml/2006/main">
+                              <a:graphicData uri="http://schemas.microsoft.com/office/word/2010/wordprocessingGroup">
+                                <wpg:wgp>
+                                  <wpg:cNvGrpSpPr/>
+                                  <wpg:grpSpPr>
+                                    <a:xfrm>
+                                      <a:off x="0" y="0"/>
+                                      <a:ext cx="222885" cy="222885"/>
+                                      <a:chOff x="0" y="0"/>
+                                      <a:chExt cx="222885" cy="222885"/>
+                                    </a:xfrm>
+                                  </wpg:grpSpPr>
+                                  <wps:wsp>
+                                    <wps:cNvPr id="8" name="Oval 8"/>
+                                    <wps:cNvSpPr/>
+                                    <wps:spPr>
+                                      <a:xfrm>
+                                        <a:off x="0" y="0"/>
+                                        <a:ext cx="222885" cy="222885"/>
+                                      </a:xfrm>
+                                      <a:prstGeom prst="ellipse">
+                                        <a:avLst/>
+                                      </a:prstGeom>
+                                      <a:solidFill>
+                                        <a:schemeClr val="bg1"/>
+                                      </a:solidFill>
+                                    </wps:spPr>
+                                    <wps:style>
+                                      <a:lnRef idx="2">
+                                        <a:schemeClr val="dk1">
+                                          <a:shade val="50000"/>
+                                        </a:schemeClr>
+                                      </a:lnRef>
+                                      <a:fillRef idx="1">
+                                        <a:schemeClr val="dk1"/>
+                                      </a:fillRef>
+                                      <a:effectRef idx="0">
+                                        <a:schemeClr val="dk1"/>
+                                      </a:effectRef>
+                                      <a:fontRef idx="minor">
+                                        <a:schemeClr val="lt1"/>
+                                      </a:fontRef>
+                                    </wps:style>
+                                    <wps:bodyPr rot="0" spcFirstLastPara="0" vertOverflow="overflow" horzOverflow="overflow" vert="horz" wrap="square" lIns="91440" tIns="45720" rIns="91440" bIns="45720" numCol="1" spcCol="0" rtlCol="0" fromWordArt="0" anchor="ctr" anchorCtr="0" forceAA="0" compatLnSpc="1">
+                                      <a:prstTxWarp prst="textNoShape">
+                                        <a:avLst/>
+                                      </a:prstTxWarp>
+                                      <a:noAutofit/>
+                                    </wps:bodyPr>
+                                  </wps:wsp>
+                                  <wps:wsp>
+                                    <wps:cNvPr id="9" name="Oval 9"/>
+                                    <wps:cNvSpPr/>
+                                    <wps:spPr>
+                                      <a:xfrm>
+                                        <a:off x="52529" y="48639"/>
+                                        <a:ext cx="127635" cy="127635"/>
+                                      </a:xfrm>
+                                      <a:prstGeom prst="ellipse">
+                                        <a:avLst/>
+                                      </a:prstGeom>
+                                      <a:solidFill>
+                                        <a:schemeClr val="bg1"/>
+                                      </a:solidFill>
+                                    </wps:spPr>
+                                    <wps:style>
+                                      <a:lnRef idx="2">
+                                        <a:schemeClr val="dk1">
+                                          <a:shade val="50000"/>
+                                        </a:schemeClr>
+                                      </a:lnRef>
+                                      <a:fillRef idx="1">
+                                        <a:schemeClr val="dk1"/>
+                                      </a:fillRef>
+                                      <a:effectRef idx="0">
+                                        <a:schemeClr val="dk1"/>
+                                      </a:effectRef>
+                                      <a:fontRef idx="minor">
+                                        <a:schemeClr val="lt1"/>
+                                      </a:fontRef>
+                                    </wps:style>
+                                    <wps:bodyPr rot="0" spcFirstLastPara="0" vertOverflow="overflow" horzOverflow="overflow" vert="horz" wrap="square" lIns="91440" tIns="45720" rIns="91440" bIns="45720" numCol="1" spcCol="0" rtlCol="0" fromWordArt="0" anchor="ctr" anchorCtr="0" forceAA="0" compatLnSpc="1">
+                                      <a:prstTxWarp prst="textNoShape">
+                                        <a:avLst/>
+                                      </a:prstTxWarp>
+                                      <a:noAutofit/>
+                                    </wps:bodyPr>
+                                  </wps:wsp>
+                                </wpg:wgp>
+                              </a:graphicData>
+                            </a:graphic>
+                            <wp14:sizeRelH relativeFrom="margin">
+                              <wp14:pctWidth>0</wp14:pctWidth>
+                            </wp14:sizeRelH>
+                            <wp14:sizeRelV relativeFrom="margin">
+                              <wp14:pctHeight>0</wp14:pctHeight>
+                            </wp14:sizeRelV>
+                          </wp:anchor>
+                        </w:drawing>
+                      </mc:Choice>
+                      <mc:Fallback>
+                        <w:pict>
+                          <v:group w14:anchorId="67DD5643" id="Group 10" o:spid="_x0000_s1026" style="position:absolute;margin-left:-4.15pt;margin-top:-3.95pt;width:17.55pt;height:17.55pt;z-index:251665408;mso-width-relative:margin;mso-height-relative:margin" coordsize="222885,222885" o:gfxdata="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">
+                            <v:oval id="Oval 8" o:spid="_x0000_s1027" style="position:absolute;width:222885;height:222885;visibility:visible;mso-wrap-style:square;v-text-anchor:middle" o:gfxdata="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" fillcolor="white [3212]" strokecolor="black [1600]" strokeweight="1pt">
+                              <v:stroke joinstyle="miter"/>
+                            </v:oval>
+                            <v:oval id="Oval 9" o:spid="_x0000_s1028" style="position:absolute;left:52529;top:48639;width:127635;height:127635;visibility:visible;mso-wrap-style:square;v-text-anchor:middle" o:gfxdata="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" fillcolor="white [3212]" strokecolor="black [1600]" strokeweight="1pt">
+                              <v:stroke joinstyle="miter"/>
+                            </v:oval>
+                          </v:group>
+                        </w:pict>
+                      </mc:Fallback>
+                    </mc:AlternateContent>
+                  </w:r>
+                </w:p>
+              </w:tc>
+              <w:tc>
+                <w:tcPr>
+                  <w:tcW w:w="0" w:type="auto"/>
+                  <w:vAlign w:val="center"/>
+                  <w:hideMark/>
+                </w:tcPr>
+                <w:p>
+                  <w:pPr>
+                    <w:framePr w:hSpace="180" w:wrap="around" w:vAnchor="text" w:hAnchor="text" w:x="-180" w:y="1"/>
+                    <w:ind w:left="603" w:firstLine="96"/>
+                    <w:suppressOverlap/>
+                  </w:pPr>
+                  <w:r>
+                    <w:t>End Node</w:t>
+                  </w:r>
+                </w:p>
+              </w:tc>
+            </w:tr>
+          </w:tbl>
+          <w:p/>
+        </w:tc>
+        <w:tc>
+          <w:tcPr>
+            <w:tcW w:w="50" w:type="dxa"/>
+            <w:vAlign w:val="center"/>
+          </w:tcPr>
+          <w:p>
+            <w:pPr>
+              <w:tabs>
+                <w:tab w:val="left" w:pos="513"/>
+              </w:tabs>
+              <w:ind w:left="513"/>
+            </w:pPr>
+          </w:p>
+        </w:tc>
+      </w:tr>
+    </w:tbl>
+    <w:p>
+      <w:r>
+        <w:br w:type="textWrapping" w:clear="all"/>
+      </w:r>
+    </w:p>
     <w:sectPr>
       <w:pgSz w:w="12240" w:h="15840"/>
-      <w:pgMar w:top="1440" w:right="1440" w:bottom="1440" w:left="1440" w:header="720" w:footer="720" w:gutter="0"/>
+      <w:pgMar w:top="1440" w:right="1440" w:bottom="1080" w:left="1440" w:header="720" w:footer="720" w:gutter="0"/>
       <w:cols w:space="720"/>
       <w:docGrid w:linePitch="360"/>
     </w:sectPr>
   </w:body>
 </w:document>
+</file>
+
+<file path=word/endnotes.xml><?xml version="1.0" encoding="utf-8"?>
+<w:endnotes xmlns:wpc="http://schemas.microsoft.com/office/word/2010/wordprocessingCanvas" xmlns:cx="http://schemas.microsoft.com/office/drawing/2014/chartex" xmlns:cx1="http://schemas.microsoft.com/office/drawing/2015/9/8/chartex" xmlns:cx2="http://schemas.microsoft.com/office/drawing/2015/10/21/chartex" xmlns:cx3="http://schemas.microsoft.com/office/drawing/2016/5/9/chartex" xmlns:cx4="http://schemas.microsoft.com/office/drawing/2016/5/10/chartex" xmlns:cx5="http://schemas.microsoft.com/office/drawing/2016/5/11/chartex" xmlns:cx6="http://schemas.microsoft.com/office/drawing/2016/5/12/chartex" xmlns:cx7="http://schemas.microsoft.com/office/drawing/2016/5/13/chartex" xmlns:cx8="http://schemas.microsoft.com/office/drawing/2016/5/14/chartex" xmlns:mc="http://schemas.openxmlformats.org/markup-compatibility/2006" xmlns:aink="http://schemas.microsoft.com/office/drawing/2016/ink" xmlns:am3d="http://schemas.microsoft.com/office/drawing/2017/model3d" xmlns:o="urn:schemas-microsoft-com:office:office" xmlns:r="http://schemas.openxmlformats.org/officeDocument/2006/relationships" xmlns:m="http://schemas.openxmlformats.org/officeDocument/2006/math" xmlns:v="urn:schemas-microsoft-com:vml" xmlns:wp14="http://schemas.microsoft.com/office/word/2010/wordprocessingDrawing" xmlns:wp="http://schemas.openxmlformats.org/drawingml/2006/wordprocessingDrawing" xmlns:w10="urn:schemas-microsoft-com:office:word" xmlns:w="http://schemas.openxmlformats.org/wordprocessingml/2006/main" xmlns:w14="http://schemas.microsoft.com/office/word/2010/wordml" xmlns:w15="http://schemas.microsoft.com/office/word/2012/wordml" xmlns:w16cid="http://schemas.microsoft.com/office/word/2016/wordml/cid" xmlns:w16se="http://schemas.microsoft.com/office/word/2015/wordml/symex" xmlns:wpg="http://schemas.microsoft.com/office/word/2010/wordprocessingGroup" xmlns:wpi="http://schemas.microsoft.com/office/word/2010/wordprocessingInk" xmlns:wne="http://schemas.microsoft.com/office/word/2006/wordml" xmlns:wps="http://schemas.microsoft.com/office/word/2010/wordprocessingShape" mc:Ignorable="w14 w15 w16se w16cid wp14">
+  <w:endnote w:type="separator" w:id="-1">
+    <w:p>
+      <w:pPr>
+        <w:spacing w:after="0" w:line="240" w:lineRule="auto"/>
+      </w:pPr>
+      <w:r>
+        <w:separator/>
+      </w:r>
+    </w:p>
+  </w:endnote>
+  <w:endnote w:type="continuationSeparator" w:id="0">
+    <w:p>
+      <w:pPr>
+        <w:spacing w:after="0" w:line="240" w:lineRule="auto"/>
+      </w:pPr>
+      <w:r>
+        <w:continuationSeparator/>
+      </w:r>
+    </w:p>
+  </w:endnote>
+</w:endnotes>
+</file>
+
+<file path=word/footnotes.xml><?xml version="1.0" encoding="utf-8"?>
+<w:footnotes xmlns:wpc="http://schemas.microsoft.com/office/word/2010/wordprocessingCanvas" xmlns:cx="http://schemas.microsoft.com/office/drawing/2014/chartex" xmlns:cx1="http://schemas.microsoft.com/office/drawing/2015/9/8/chartex" xmlns:cx2="http://schemas.microsoft.com/office/drawing/2015/10/21/chartex" xmlns:cx3="http://schemas.microsoft.com/office/drawing/2016/5/9/chartex" xmlns:cx4="http://schemas.microsoft.com/office/drawing/2016/5/10/chartex" xmlns:cx5="http://schemas.microsoft.com/office/drawing/2016/5/11/chartex" xmlns:cx6="http://schemas.microsoft.com/office/drawing/2016/5/12/chartex" xmlns:cx7="http://schemas.microsoft.com/office/drawing/2016/5/13/chartex" xmlns:cx8="http://schemas.microsoft.com/office/drawing/2016/5/14/chartex" xmlns:mc="http://schemas.openxmlformats.org/markup-compatibility/2006" xmlns:aink="http://schemas.microsoft.com/office/drawing/2016/ink" xmlns:am3d="http://schemas.microsoft.com/office/drawing/2017/model3d" xmlns:o="urn:schemas-microsoft-com:office:office" xmlns:r="http://schemas.openxmlformats.org/officeDocument/2006/relationships" xmlns:m="http://schemas.openxmlformats.org/officeDocument/2006/math" xmlns:v="urn:schemas-microsoft-com:vml" xmlns:wp14="http://schemas.microsoft.com/office/word/2010/wordprocessingDrawing" xmlns:wp="http://schemas.openxmlformats.org/drawingml/2006/wordprocessingDrawing" xmlns:w10="urn:schemas-microsoft-com:office:word" xmlns:w="http://schemas.openxmlformats.org/wordprocessingml/2006/main" xmlns:w14="http://schemas.microsoft.com/office/word/2010/wordml" xmlns:w15="http://schemas.microsoft.com/office/word/2012/wordml" xmlns:w16cid="http://schemas.microsoft.com/office/word/2016/wordml/cid" xmlns:w16se="http://schemas.microsoft.com/office/word/2015/wordml/symex" xmlns:wpg="http://schemas.microsoft.com/office/word/2010/wordprocessingGroup" xmlns:wpi="http://schemas.microsoft.com/office/word/2010/wordprocessingInk" xmlns:wne="http://schemas.microsoft.com/office/word/2006/wordml" xmlns:wps="http://schemas.microsoft.com/office/word/2010/wordprocessingShape" mc:Ignorable="w14 w15 w16se w16cid wp14">
+  <w:footnote w:type="separator" w:id="-1">
+    <w:p>
+      <w:pPr>
+        <w:spacing w:after="0" w:line="240" w:lineRule="auto"/>
+      </w:pPr>
+      <w:r>
+        <w:separator/>
+      </w:r>
+    </w:p>
+  </w:footnote>
+  <w:footnote w:type="continuationSeparator" w:id="0">
+    <w:p>
+      <w:pPr>
+        <w:spacing w:after="0" w:line="240" w:lineRule="auto"/>
+      </w:pPr>
+      <w:r>
+        <w:continuationSeparator/>
+      </w:r>
+    </w:p>
+  </w:footnote>
+</w:footnotes>
 </file>
 
 <file path=word/numbering.xml><?xml version="1.0" encoding="utf-8"?>
@@ -2069,6 +5066,119 @@
     </w:lvl>
   </w:abstractNum>
   <w:abstractNum w:abstractNumId="2" w15:restartNumberingAfterBreak="0">
+    <w:nsid w:val="15C4396A"/>
+    <w:multiLevelType w:val="multilevel"/>
+    <w:tmpl w:val="A740E8C0"/>
+    <w:lvl w:ilvl="0">
+      <w:start w:val="1"/>
+      <w:numFmt w:val="decimal"/>
+      <w:lvlText w:val="%1."/>
+      <w:lvlJc w:val="left"/>
+      <w:pPr>
+        <w:tabs>
+          <w:tab w:val="num" w:pos="720"/>
+        </w:tabs>
+        <w:ind w:left="720" w:hanging="360"/>
+      </w:pPr>
+    </w:lvl>
+    <w:lvl w:ilvl="1" w:tentative="1">
+      <w:start w:val="1"/>
+      <w:numFmt w:val="decimal"/>
+      <w:lvlText w:val="%2."/>
+      <w:lvlJc w:val="left"/>
+      <w:pPr>
+        <w:tabs>
+          <w:tab w:val="num" w:pos="1440"/>
+        </w:tabs>
+        <w:ind w:left="1440" w:hanging="360"/>
+      </w:pPr>
+    </w:lvl>
+    <w:lvl w:ilvl="2" w:tentative="1">
+      <w:start w:val="1"/>
+      <w:numFmt w:val="decimal"/>
+      <w:lvlText w:val="%3."/>
+      <w:lvlJc w:val="left"/>
+      <w:pPr>
+        <w:tabs>
+          <w:tab w:val="num" w:pos="2160"/>
+        </w:tabs>
+        <w:ind w:left="2160" w:hanging="360"/>
+      </w:pPr>
+    </w:lvl>
+    <w:lvl w:ilvl="3" w:tentative="1">
+      <w:start w:val="1"/>
+      <w:numFmt w:val="decimal"/>
+      <w:lvlText w:val="%4."/>
+      <w:lvlJc w:val="left"/>
+      <w:pPr>
+        <w:tabs>
+          <w:tab w:val="num" w:pos="2880"/>
+        </w:tabs>
+        <w:ind w:left="2880" w:hanging="360"/>
+      </w:pPr>
+    </w:lvl>
+    <w:lvl w:ilvl="4" w:tentative="1">
+      <w:start w:val="1"/>
+      <w:numFmt w:val="decimal"/>
+      <w:lvlText w:val="%5."/>
+      <w:lvlJc w:val="left"/>
+      <w:pPr>
+        <w:tabs>
+          <w:tab w:val="num" w:pos="3600"/>
+        </w:tabs>
+        <w:ind w:left="3600" w:hanging="360"/>
+      </w:pPr>
+    </w:lvl>
+    <w:lvl w:ilvl="5" w:tentative="1">
+      <w:start w:val="1"/>
+      <w:numFmt w:val="decimal"/>
+      <w:lvlText w:val="%6."/>
+      <w:lvlJc w:val="left"/>
+      <w:pPr>
+        <w:tabs>
+          <w:tab w:val="num" w:pos="4320"/>
+        </w:tabs>
+        <w:ind w:left="4320" w:hanging="360"/>
+      </w:pPr>
+    </w:lvl>
+    <w:lvl w:ilvl="6" w:tentative="1">
+      <w:start w:val="1"/>
+      <w:numFmt w:val="decimal"/>
+      <w:lvlText w:val="%7."/>
+      <w:lvlJc w:val="left"/>
+      <w:pPr>
+        <w:tabs>
+          <w:tab w:val="num" w:pos="5040"/>
+        </w:tabs>
+        <w:ind w:left="5040" w:hanging="360"/>
+      </w:pPr>
+    </w:lvl>
+    <w:lvl w:ilvl="7" w:tentative="1">
+      <w:start w:val="1"/>
+      <w:numFmt w:val="decimal"/>
+      <w:lvlText w:val="%8."/>
+      <w:lvlJc w:val="left"/>
+      <w:pPr>
+        <w:tabs>
+          <w:tab w:val="num" w:pos="5760"/>
+        </w:tabs>
+        <w:ind w:left="5760" w:hanging="360"/>
+      </w:pPr>
+    </w:lvl>
+    <w:lvl w:ilvl="8" w:tentative="1">
+      <w:start w:val="1"/>
+      <w:numFmt w:val="decimal"/>
+      <w:lvlText w:val="%9."/>
+      <w:lvlJc w:val="left"/>
+      <w:pPr>
+        <w:tabs>
+          <w:tab w:val="num" w:pos="6480"/>
+        </w:tabs>
+        <w:ind w:left="6480" w:hanging="360"/>
+      </w:pPr>
+    </w:lvl>
+  </w:abstractNum>
+  <w:abstractNum w:abstractNumId="3" w15:restartNumberingAfterBreak="0">
     <w:nsid w:val="1E780B38"/>
     <w:multiLevelType w:val="multilevel"/>
     <w:tmpl w:val="3B36DB06"/>
@@ -2217,7 +5327,7 @@
       </w:rPr>
     </w:lvl>
   </w:abstractNum>
-  <w:abstractNum w:abstractNumId="3" w15:restartNumberingAfterBreak="0">
+  <w:abstractNum w:abstractNumId="4" w15:restartNumberingAfterBreak="0">
     <w:nsid w:val="334D4D5F"/>
     <w:multiLevelType w:val="multilevel"/>
     <w:tmpl w:val="01E639C0"/>
@@ -2366,7 +5476,7 @@
       </w:rPr>
     </w:lvl>
   </w:abstractNum>
-  <w:abstractNum w:abstractNumId="4" w15:restartNumberingAfterBreak="0">
+  <w:abstractNum w:abstractNumId="5" w15:restartNumberingAfterBreak="0">
     <w:nsid w:val="4A2D6202"/>
     <w:multiLevelType w:val="multilevel"/>
     <w:tmpl w:val="573E5496"/>
@@ -2515,20 +5625,327 @@
       </w:rPr>
     </w:lvl>
   </w:abstractNum>
+  <w:abstractNum w:abstractNumId="6" w15:restartNumberingAfterBreak="0">
+    <w:nsid w:val="60195D4E"/>
+    <w:multiLevelType w:val="multilevel"/>
+    <w:tmpl w:val="80DE48F2"/>
+    <w:lvl w:ilvl="0">
+      <w:start w:val="1"/>
+      <w:numFmt w:val="bullet"/>
+      <w:lvlText w:val=""/>
+      <w:lvlJc w:val="left"/>
+      <w:pPr>
+        <w:tabs>
+          <w:tab w:val="num" w:pos="720"/>
+        </w:tabs>
+        <w:ind w:left="720" w:hanging="360"/>
+      </w:pPr>
+      <w:rPr>
+        <w:rFonts w:ascii="Symbol" w:hAnsi="Symbol" w:hint="default"/>
+        <w:sz w:val="20"/>
+      </w:rPr>
+    </w:lvl>
+    <w:lvl w:ilvl="1" w:tentative="1">
+      <w:start w:val="1"/>
+      <w:numFmt w:val="bullet"/>
+      <w:lvlText w:val="o"/>
+      <w:lvlJc w:val="left"/>
+      <w:pPr>
+        <w:tabs>
+          <w:tab w:val="num" w:pos="1440"/>
+        </w:tabs>
+        <w:ind w:left="1440" w:hanging="360"/>
+      </w:pPr>
+      <w:rPr>
+        <w:rFonts w:ascii="Courier New" w:hAnsi="Courier New" w:hint="default"/>
+        <w:sz w:val="20"/>
+      </w:rPr>
+    </w:lvl>
+    <w:lvl w:ilvl="2" w:tentative="1">
+      <w:start w:val="1"/>
+      <w:numFmt w:val="bullet"/>
+      <w:lvlText w:val=""/>
+      <w:lvlJc w:val="left"/>
+      <w:pPr>
+        <w:tabs>
+          <w:tab w:val="num" w:pos="2160"/>
+        </w:tabs>
+        <w:ind w:left="2160" w:hanging="360"/>
+      </w:pPr>
+      <w:rPr>
+        <w:rFonts w:ascii="Wingdings" w:hAnsi="Wingdings" w:hint="default"/>
+        <w:sz w:val="20"/>
+      </w:rPr>
+    </w:lvl>
+    <w:lvl w:ilvl="3" w:tentative="1">
+      <w:start w:val="1"/>
+      <w:numFmt w:val="bullet"/>
+      <w:lvlText w:val=""/>
+      <w:lvlJc w:val="left"/>
+      <w:pPr>
+        <w:tabs>
+          <w:tab w:val="num" w:pos="2880"/>
+        </w:tabs>
+        <w:ind w:left="2880" w:hanging="360"/>
+      </w:pPr>
+      <w:rPr>
+        <w:rFonts w:ascii="Wingdings" w:hAnsi="Wingdings" w:hint="default"/>
+        <w:sz w:val="20"/>
+      </w:rPr>
+    </w:lvl>
+    <w:lvl w:ilvl="4" w:tentative="1">
+      <w:start w:val="1"/>
+      <w:numFmt w:val="bullet"/>
+      <w:lvlText w:val=""/>
+      <w:lvlJc w:val="left"/>
+      <w:pPr>
+        <w:tabs>
+          <w:tab w:val="num" w:pos="3600"/>
+        </w:tabs>
+        <w:ind w:left="3600" w:hanging="360"/>
+      </w:pPr>
+      <w:rPr>
+        <w:rFonts w:ascii="Wingdings" w:hAnsi="Wingdings" w:hint="default"/>
+        <w:sz w:val="20"/>
+      </w:rPr>
+    </w:lvl>
+    <w:lvl w:ilvl="5" w:tentative="1">
+      <w:start w:val="1"/>
+      <w:numFmt w:val="bullet"/>
+      <w:lvlText w:val=""/>
+      <w:lvlJc w:val="left"/>
+      <w:pPr>
+        <w:tabs>
+          <w:tab w:val="num" w:pos="4320"/>
+        </w:tabs>
+        <w:ind w:left="4320" w:hanging="360"/>
+      </w:pPr>
+      <w:rPr>
+        <w:rFonts w:ascii="Wingdings" w:hAnsi="Wingdings" w:hint="default"/>
+        <w:sz w:val="20"/>
+      </w:rPr>
+    </w:lvl>
+    <w:lvl w:ilvl="6" w:tentative="1">
+      <w:start w:val="1"/>
+      <w:numFmt w:val="bullet"/>
+      <w:lvlText w:val=""/>
+      <w:lvlJc w:val="left"/>
+      <w:pPr>
+        <w:tabs>
+          <w:tab w:val="num" w:pos="5040"/>
+        </w:tabs>
+        <w:ind w:left="5040" w:hanging="360"/>
+      </w:pPr>
+      <w:rPr>
+        <w:rFonts w:ascii="Wingdings" w:hAnsi="Wingdings" w:hint="default"/>
+        <w:sz w:val="20"/>
+      </w:rPr>
+    </w:lvl>
+    <w:lvl w:ilvl="7" w:tentative="1">
+      <w:start w:val="1"/>
+      <w:numFmt w:val="bullet"/>
+      <w:lvlText w:val=""/>
+      <w:lvlJc w:val="left"/>
+      <w:pPr>
+        <w:tabs>
+          <w:tab w:val="num" w:pos="5760"/>
+        </w:tabs>
+        <w:ind w:left="5760" w:hanging="360"/>
+      </w:pPr>
+      <w:rPr>
+        <w:rFonts w:ascii="Wingdings" w:hAnsi="Wingdings" w:hint="default"/>
+        <w:sz w:val="20"/>
+      </w:rPr>
+    </w:lvl>
+    <w:lvl w:ilvl="8" w:tentative="1">
+      <w:start w:val="1"/>
+      <w:numFmt w:val="bullet"/>
+      <w:lvlText w:val=""/>
+      <w:lvlJc w:val="left"/>
+      <w:pPr>
+        <w:tabs>
+          <w:tab w:val="num" w:pos="6480"/>
+        </w:tabs>
+        <w:ind w:left="6480" w:hanging="360"/>
+      </w:pPr>
+      <w:rPr>
+        <w:rFonts w:ascii="Wingdings" w:hAnsi="Wingdings" w:hint="default"/>
+        <w:sz w:val="20"/>
+      </w:rPr>
+    </w:lvl>
+  </w:abstractNum>
+  <w:abstractNum w:abstractNumId="7" w15:restartNumberingAfterBreak="0">
+    <w:nsid w:val="7565782C"/>
+    <w:multiLevelType w:val="multilevel"/>
+    <w:tmpl w:val="116832D6"/>
+    <w:lvl w:ilvl="0">
+      <w:start w:val="1"/>
+      <w:numFmt w:val="bullet"/>
+      <w:lvlText w:val=""/>
+      <w:lvlJc w:val="left"/>
+      <w:pPr>
+        <w:tabs>
+          <w:tab w:val="num" w:pos="720"/>
+        </w:tabs>
+        <w:ind w:left="720" w:hanging="360"/>
+      </w:pPr>
+      <w:rPr>
+        <w:rFonts w:ascii="Symbol" w:hAnsi="Symbol" w:hint="default"/>
+        <w:sz w:val="20"/>
+      </w:rPr>
+    </w:lvl>
+    <w:lvl w:ilvl="1" w:tentative="1">
+      <w:start w:val="1"/>
+      <w:numFmt w:val="bullet"/>
+      <w:lvlText w:val="o"/>
+      <w:lvlJc w:val="left"/>
+      <w:pPr>
+        <w:tabs>
+          <w:tab w:val="num" w:pos="1440"/>
+        </w:tabs>
+        <w:ind w:left="1440" w:hanging="360"/>
+      </w:pPr>
+      <w:rPr>
+        <w:rFonts w:ascii="Courier New" w:hAnsi="Courier New" w:hint="default"/>
+        <w:sz w:val="20"/>
+      </w:rPr>
+    </w:lvl>
+    <w:lvl w:ilvl="2" w:tentative="1">
+      <w:start w:val="1"/>
+      <w:numFmt w:val="bullet"/>
+      <w:lvlText w:val=""/>
+      <w:lvlJc w:val="left"/>
+      <w:pPr>
+        <w:tabs>
+          <w:tab w:val="num" w:pos="2160"/>
+        </w:tabs>
+        <w:ind w:left="2160" w:hanging="360"/>
+      </w:pPr>
+      <w:rPr>
+        <w:rFonts w:ascii="Wingdings" w:hAnsi="Wingdings" w:hint="default"/>
+        <w:sz w:val="20"/>
+      </w:rPr>
+    </w:lvl>
+    <w:lvl w:ilvl="3" w:tentative="1">
+      <w:start w:val="1"/>
+      <w:numFmt w:val="bullet"/>
+      <w:lvlText w:val=""/>
+      <w:lvlJc w:val="left"/>
+      <w:pPr>
+        <w:tabs>
+          <w:tab w:val="num" w:pos="2880"/>
+        </w:tabs>
+        <w:ind w:left="2880" w:hanging="360"/>
+      </w:pPr>
+      <w:rPr>
+        <w:rFonts w:ascii="Wingdings" w:hAnsi="Wingdings" w:hint="default"/>
+        <w:sz w:val="20"/>
+      </w:rPr>
+    </w:lvl>
+    <w:lvl w:ilvl="4" w:tentative="1">
+      <w:start w:val="1"/>
+      <w:numFmt w:val="bullet"/>
+      <w:lvlText w:val=""/>
+      <w:lvlJc w:val="left"/>
+      <w:pPr>
+        <w:tabs>
+          <w:tab w:val="num" w:pos="3600"/>
+        </w:tabs>
+        <w:ind w:left="3600" w:hanging="360"/>
+      </w:pPr>
+      <w:rPr>
+        <w:rFonts w:ascii="Wingdings" w:hAnsi="Wingdings" w:hint="default"/>
+        <w:sz w:val="20"/>
+      </w:rPr>
+    </w:lvl>
+    <w:lvl w:ilvl="5" w:tentative="1">
+      <w:start w:val="1"/>
+      <w:numFmt w:val="bullet"/>
+      <w:lvlText w:val=""/>
+      <w:lvlJc w:val="left"/>
+      <w:pPr>
+        <w:tabs>
+          <w:tab w:val="num" w:pos="4320"/>
+        </w:tabs>
+        <w:ind w:left="4320" w:hanging="360"/>
+      </w:pPr>
+      <w:rPr>
+        <w:rFonts w:ascii="Wingdings" w:hAnsi="Wingdings" w:hint="default"/>
+        <w:sz w:val="20"/>
+      </w:rPr>
+    </w:lvl>
+    <w:lvl w:ilvl="6" w:tentative="1">
+      <w:start w:val="1"/>
+      <w:numFmt w:val="bullet"/>
+      <w:lvlText w:val=""/>
+      <w:lvlJc w:val="left"/>
+      <w:pPr>
+        <w:tabs>
+          <w:tab w:val="num" w:pos="5040"/>
+        </w:tabs>
+        <w:ind w:left="5040" w:hanging="360"/>
+      </w:pPr>
+      <w:rPr>
+        <w:rFonts w:ascii="Wingdings" w:hAnsi="Wingdings" w:hint="default"/>
+        <w:sz w:val="20"/>
+      </w:rPr>
+    </w:lvl>
+    <w:lvl w:ilvl="7" w:tentative="1">
+      <w:start w:val="1"/>
+      <w:numFmt w:val="bullet"/>
+      <w:lvlText w:val=""/>
+      <w:lvlJc w:val="left"/>
+      <w:pPr>
+        <w:tabs>
+          <w:tab w:val="num" w:pos="5760"/>
+        </w:tabs>
+        <w:ind w:left="5760" w:hanging="360"/>
+      </w:pPr>
+      <w:rPr>
+        <w:rFonts w:ascii="Wingdings" w:hAnsi="Wingdings" w:hint="default"/>
+        <w:sz w:val="20"/>
+      </w:rPr>
+    </w:lvl>
+    <w:lvl w:ilvl="8" w:tentative="1">
+      <w:start w:val="1"/>
+      <w:numFmt w:val="bullet"/>
+      <w:lvlText w:val=""/>
+      <w:lvlJc w:val="left"/>
+      <w:pPr>
+        <w:tabs>
+          <w:tab w:val="num" w:pos="6480"/>
+        </w:tabs>
+        <w:ind w:left="6480" w:hanging="360"/>
+      </w:pPr>
+      <w:rPr>
+        <w:rFonts w:ascii="Wingdings" w:hAnsi="Wingdings" w:hint="default"/>
+        <w:sz w:val="20"/>
+      </w:rPr>
+    </w:lvl>
+  </w:abstractNum>
   <w:num w:numId="1">
-    <w:abstractNumId w:val="3"/>
+    <w:abstractNumId w:val="4"/>
   </w:num>
   <w:num w:numId="2">
     <w:abstractNumId w:val="1"/>
   </w:num>
   <w:num w:numId="3">
-    <w:abstractNumId w:val="2"/>
+    <w:abstractNumId w:val="3"/>
   </w:num>
   <w:num w:numId="4">
     <w:abstractNumId w:val="0"/>
   </w:num>
   <w:num w:numId="5">
-    <w:abstractNumId w:val="4"/>
+    <w:abstractNumId w:val="5"/>
+  </w:num>
+  <w:num w:numId="6">
+    <w:abstractNumId w:val="7"/>
+  </w:num>
+  <w:num w:numId="7">
+    <w:abstractNumId w:val="6"/>
+  </w:num>
+  <w:num w:numId="8">
+    <w:abstractNumId w:val="2"/>
   </w:num>
 </w:numbering>
 </file>
@@ -3097,6 +6514,126 @@
       <w:szCs w:val="26"/>
     </w:rPr>
   </w:style>
+  <w:style w:type="paragraph" w:styleId="Header">
+    <w:name w:val="header"/>
+    <w:basedOn w:val="Normal"/>
+    <w:link w:val="HeaderChar"/>
+    <w:uiPriority w:val="99"/>
+    <w:unhideWhenUsed/>
+    <w:rsid w:val="00F17871"/>
+    <w:pPr>
+      <w:tabs>
+        <w:tab w:val="center" w:pos="4680"/>
+        <w:tab w:val="right" w:pos="9360"/>
+      </w:tabs>
+      <w:spacing w:after="0" w:line="240" w:lineRule="auto"/>
+    </w:pPr>
+  </w:style>
+  <w:style w:type="character" w:customStyle="1" w:styleId="HeaderChar">
+    <w:name w:val="Header Char"/>
+    <w:basedOn w:val="DefaultParagraphFont"/>
+    <w:link w:val="Header"/>
+    <w:uiPriority w:val="99"/>
+    <w:rsid w:val="00F17871"/>
+  </w:style>
+  <w:style w:type="paragraph" w:styleId="Footer">
+    <w:name w:val="footer"/>
+    <w:basedOn w:val="Normal"/>
+    <w:link w:val="FooterChar"/>
+    <w:uiPriority w:val="99"/>
+    <w:unhideWhenUsed/>
+    <w:rsid w:val="00F17871"/>
+    <w:pPr>
+      <w:tabs>
+        <w:tab w:val="center" w:pos="4680"/>
+        <w:tab w:val="right" w:pos="9360"/>
+      </w:tabs>
+      <w:spacing w:after="0" w:line="240" w:lineRule="auto"/>
+    </w:pPr>
+  </w:style>
+  <w:style w:type="character" w:customStyle="1" w:styleId="FooterChar">
+    <w:name w:val="Footer Char"/>
+    <w:basedOn w:val="DefaultParagraphFont"/>
+    <w:link w:val="Footer"/>
+    <w:uiPriority w:val="99"/>
+    <w:rsid w:val="00F17871"/>
+  </w:style>
+  <w:style w:type="character" w:styleId="Emphasis">
+    <w:name w:val="Emphasis"/>
+    <w:basedOn w:val="DefaultParagraphFont"/>
+    <w:uiPriority w:val="20"/>
+    <w:qFormat/>
+    <w:rsid w:val="00F17871"/>
+    <w:rPr>
+      <w:i/>
+      <w:iCs/>
+    </w:rPr>
+  </w:style>
+  <w:style w:type="paragraph" w:styleId="HTMLPreformatted">
+    <w:name w:val="HTML Preformatted"/>
+    <w:basedOn w:val="Normal"/>
+    <w:link w:val="HTMLPreformattedChar"/>
+    <w:uiPriority w:val="99"/>
+    <w:semiHidden/>
+    <w:unhideWhenUsed/>
+    <w:rsid w:val="00F17871"/>
+    <w:pPr>
+      <w:tabs>
+        <w:tab w:val="left" w:pos="916"/>
+        <w:tab w:val="left" w:pos="1832"/>
+        <w:tab w:val="left" w:pos="2748"/>
+        <w:tab w:val="left" w:pos="3664"/>
+        <w:tab w:val="left" w:pos="4580"/>
+        <w:tab w:val="left" w:pos="5496"/>
+        <w:tab w:val="left" w:pos="6412"/>
+        <w:tab w:val="left" w:pos="7328"/>
+        <w:tab w:val="left" w:pos="8244"/>
+        <w:tab w:val="left" w:pos="9160"/>
+        <w:tab w:val="left" w:pos="10076"/>
+        <w:tab w:val="left" w:pos="10992"/>
+        <w:tab w:val="left" w:pos="11908"/>
+        <w:tab w:val="left" w:pos="12824"/>
+        <w:tab w:val="left" w:pos="13740"/>
+        <w:tab w:val="left" w:pos="14656"/>
+      </w:tabs>
+      <w:spacing w:after="0" w:line="240" w:lineRule="auto"/>
+    </w:pPr>
+    <w:rPr>
+      <w:rFonts w:ascii="Courier New" w:eastAsia="Times New Roman" w:hAnsi="Courier New" w:cs="Courier New"/>
+      <w:kern w:val="0"/>
+      <w:sz w:val="20"/>
+      <w:szCs w:val="20"/>
+      <w14:ligatures w14:val="none"/>
+    </w:rPr>
+  </w:style>
+  <w:style w:type="character" w:customStyle="1" w:styleId="HTMLPreformattedChar">
+    <w:name w:val="HTML Preformatted Char"/>
+    <w:basedOn w:val="DefaultParagraphFont"/>
+    <w:link w:val="HTMLPreformatted"/>
+    <w:uiPriority w:val="99"/>
+    <w:semiHidden/>
+    <w:rsid w:val="00F17871"/>
+    <w:rPr>
+      <w:rFonts w:ascii="Courier New" w:eastAsia="Times New Roman" w:hAnsi="Courier New" w:cs="Courier New"/>
+      <w:kern w:val="0"/>
+      <w:sz w:val="20"/>
+      <w:szCs w:val="20"/>
+      <w14:ligatures w14:val="none"/>
+    </w:rPr>
+  </w:style>
+  <w:style w:type="character" w:styleId="HTMLCode">
+    <w:name w:val="HTML Code"/>
+    <w:basedOn w:val="DefaultParagraphFont"/>
+    <w:uiPriority w:val="99"/>
+    <w:semiHidden/>
+    <w:unhideWhenUsed/>
+    <w:rsid w:val="00F17871"/>
+    <w:rPr>
+      <w:rFonts w:ascii="Courier New" w:eastAsia="Times New Roman" w:hAnsi="Courier New" w:cs="Courier New"/>
+      <w:sz w:val="20"/>
+      <w:szCs w:val="20"/>
+    </w:rPr>
+  </w:style>
 </w:styles>
 </file>
 

</xml_diff>

<commit_message>
Add Day 4: site map and wireframes design
</commit_message>
<xml_diff>
--- a/report/Problem Statement.docx
+++ b/report/Problem Statement.docx
@@ -45,7 +45,7 @@
     <w:p>
       <w:r>
         <w:pict w14:anchorId="53CC6B54">
-          <v:rect id="_x0000_i1025" style="width:0;height:1.5pt" o:hralign="center" o:hrstd="t" o:hr="t" fillcolor="#a0a0a0" stroked="f"/>
+          <v:rect id="_x0000_i1102" style="width:0;height:1.5pt" o:hralign="center" o:hrstd="t" o:hr="t" fillcolor="#a0a0a0" stroked="f"/>
         </w:pict>
       </w:r>
     </w:p>
@@ -168,7 +168,7 @@
     <w:p>
       <w:r>
         <w:pict w14:anchorId="643E538C">
-          <v:rect id="_x0000_i1026" style="width:0;height:1.5pt" o:hralign="center" o:hrstd="t" o:hr="t" fillcolor="#a0a0a0" stroked="f"/>
+          <v:rect id="_x0000_i1103" style="width:0;height:1.5pt" o:hralign="center" o:hrstd="t" o:hr="t" fillcolor="#a0a0a0" stroked="f"/>
         </w:pict>
       </w:r>
     </w:p>
@@ -461,7 +461,7 @@
     <w:p>
       <w:r>
         <w:pict w14:anchorId="4618207D">
-          <v:rect id="_x0000_i1027" style="width:0;height:1.5pt" o:hralign="center" o:hrstd="t" o:hr="t" fillcolor="#a0a0a0" stroked="f"/>
+          <v:rect id="_x0000_i1104" style="width:0;height:1.5pt" o:hralign="center" o:hrstd="t" o:hr="t" fillcolor="#a0a0a0" stroked="f"/>
         </w:pict>
       </w:r>
     </w:p>
@@ -755,7 +755,7 @@
     <w:p>
       <w:r>
         <w:pict w14:anchorId="26A33434">
-          <v:rect id="_x0000_i1028" style="width:0;height:1.5pt" o:hralign="center" o:hrstd="t" o:hr="t" fillcolor="#a0a0a0" stroked="f"/>
+          <v:rect id="_x0000_i1105" style="width:0;height:1.5pt" o:hralign="center" o:hrstd="t" o:hr="t" fillcolor="#a0a0a0" stroked="f"/>
         </w:pict>
       </w:r>
     </w:p>
@@ -967,7 +967,7 @@
     <w:p>
       <w:r>
         <w:pict w14:anchorId="34899E99">
-          <v:rect id="_x0000_i1029" style="width:0;height:1.5pt" o:hralign="center" o:hrstd="t" o:hr="t" fillcolor="#a0a0a0" stroked="f"/>
+          <v:rect id="_x0000_i1106" style="width:0;height:1.5pt" o:hralign="center" o:hrstd="t" o:hr="t" fillcolor="#a0a0a0" stroked="f"/>
         </w:pict>
       </w:r>
     </w:p>
@@ -1360,7 +1360,7 @@
     <w:p>
       <w:r>
         <w:pict w14:anchorId="1E961320">
-          <v:rect id="_x0000_i1030" style="width:0;height:1.5pt" o:hralign="center" o:hrstd="t" o:hr="t" fillcolor="#a0a0a0" stroked="f"/>
+          <v:rect id="_x0000_i1107" style="width:0;height:1.5pt" o:hralign="center" o:hrstd="t" o:hr="t" fillcolor="#a0a0a0" stroked="f"/>
         </w:pict>
       </w:r>
     </w:p>
@@ -1968,7 +1968,7 @@
                     </pic:cNvPicPr>
                   </pic:nvPicPr>
                   <pic:blipFill>
-                    <a:blip r:embed="rId7" cstate="print">
+                    <a:blip r:embed="rId8" cstate="print">
                       <a:extLst>
                         <a:ext uri="{28A0092B-C50C-407E-A947-70E740481C1C}">
                           <a14:useLocalDpi xmlns:a14="http://schemas.microsoft.com/office/drawing/2010/main" val="0"/>
@@ -2004,7 +2004,7 @@
       <w:r>
         <w:lastRenderedPageBreak/>
         <w:pict w14:anchorId="3983BD3B">
-          <v:rect id="_x0000_i1036" style="width:0;height:1.5pt" o:hralign="center" o:hrstd="t" o:hr="t" fillcolor="#a0a0a0" stroked="f"/>
+          <v:rect id="_x0000_i1108" style="width:0;height:1.5pt" o:hralign="center" o:hrstd="t" o:hr="t" fillcolor="#a0a0a0" stroked="f"/>
         </w:pict>
       </w:r>
     </w:p>
@@ -2270,7 +2270,7 @@
     <w:p>
       <w:r>
         <w:pict w14:anchorId="6B197895">
-          <v:rect id="_x0000_i1056" style="width:0;height:1.5pt" o:hralign="center" o:hrstd="t" o:hr="t" fillcolor="#a0a0a0" stroked="f"/>
+          <v:rect id="_x0000_i1109" style="width:0;height:1.5pt" o:hralign="center" o:hrstd="t" o:hr="t" fillcolor="#a0a0a0" stroked="f"/>
         </w:pict>
       </w:r>
     </w:p>
@@ -2528,7 +2528,7 @@
     <w:p>
       <w:r>
         <w:pict w14:anchorId="4B33DA93">
-          <v:rect id="_x0000_i1057" style="width:0;height:1.5pt" o:hralign="center" o:hrstd="t" o:hr="t" fillcolor="#a0a0a0" stroked="f"/>
+          <v:rect id="_x0000_i1110" style="width:0;height:1.5pt" o:hralign="center" o:hrstd="t" o:hr="t" fillcolor="#a0a0a0" stroked="f"/>
         </w:pict>
       </w:r>
     </w:p>
@@ -2787,7 +2787,7 @@
     <w:p>
       <w:r>
         <w:pict w14:anchorId="1F55095A">
-          <v:rect id="_x0000_i1058" style="width:0;height:1.5pt" o:hralign="center" o:hrstd="t" o:hr="t" fillcolor="#a0a0a0" stroked="f"/>
+          <v:rect id="_x0000_i1111" style="width:0;height:1.5pt" o:hralign="center" o:hrstd="t" o:hr="t" fillcolor="#a0a0a0" stroked="f"/>
         </w:pict>
       </w:r>
     </w:p>
@@ -3045,7 +3045,7 @@
     <w:p>
       <w:r>
         <w:pict w14:anchorId="1C549445">
-          <v:rect id="_x0000_i1059" style="width:0;height:1.5pt" o:hralign="center" o:hrstd="t" o:hr="t" fillcolor="#a0a0a0" stroked="f"/>
+          <v:rect id="_x0000_i1112" style="width:0;height:1.5pt" o:hralign="center" o:hrstd="t" o:hr="t" fillcolor="#a0a0a0" stroked="f"/>
         </w:pict>
       </w:r>
     </w:p>
@@ -3303,7 +3303,7 @@
     <w:p>
       <w:r>
         <w:pict w14:anchorId="73C8D4FC">
-          <v:rect id="_x0000_i1070" style="width:0;height:1.5pt" o:hralign="center" o:hrstd="t" o:hr="t" fillcolor="#a0a0a0" stroked="f"/>
+          <v:rect id="_x0000_i1113" style="width:0;height:1.5pt" o:hralign="center" o:hrstd="t" o:hr="t" fillcolor="#a0a0a0" stroked="f"/>
         </w:pict>
       </w:r>
     </w:p>
@@ -3337,8 +3337,8 @@
         <w:tblLook w:val="04A0" w:firstRow="1" w:lastRow="0" w:firstColumn="1" w:lastColumn="0" w:noHBand="0" w:noVBand="1"/>
       </w:tblPr>
       <w:tblGrid>
-        <w:gridCol w:w="9360"/>
-        <w:gridCol w:w="95"/>
+        <w:gridCol w:w="10873"/>
+        <w:gridCol w:w="81"/>
       </w:tblGrid>
       <w:tr>
         <w:trPr>
@@ -4052,7 +4052,7 @@
                           </pic:cNvPicPr>
                         </pic:nvPicPr>
                         <pic:blipFill>
-                          <a:blip r:embed="rId8" cstate="print">
+                          <a:blip r:embed="rId9" cstate="print">
                             <a:extLst>
                               <a:ext uri="{28A0092B-C50C-407E-A947-70E740481C1C}">
                                 <a14:useLocalDpi xmlns:a14="http://schemas.microsoft.com/office/drawing/2010/main" val="0"/>
@@ -4083,8 +4083,6 @@
                 </wp:inline>
               </w:drawing>
             </w:r>
-            <w:bookmarkStart w:id="0" w:name="_GoBack"/>
-            <w:bookmarkEnd w:id="0"/>
           </w:p>
           <w:p>
             <w:pPr>
@@ -4107,8 +4105,8 @@
               <w:tblLook w:val="04A0" w:firstRow="1" w:lastRow="0" w:firstColumn="1" w:lastColumn="0" w:noHBand="0" w:noVBand="1"/>
             </w:tblPr>
             <w:tblGrid>
-              <w:gridCol w:w="750"/>
-              <w:gridCol w:w="2199"/>
+              <w:gridCol w:w="9267"/>
+              <w:gridCol w:w="1531"/>
             </w:tblGrid>
             <w:tr>
               <w:trPr>
@@ -4250,7 +4248,7 @@
                       </mc:Choice>
                       <mc:Fallback>
                         <w:pict>
-                          <v:oval w14:anchorId="1F34D2E0" id="Oval 6" o:spid="_x0000_s1026" style="position:absolute;margin-left:-5pt;margin-top:-2.2pt;width:19.6pt;height:17.8pt;z-index:251658240;visibility:visible;mso-wrap-style:square;mso-width-percent:0;mso-height-percent:0;mso-wrap-distance-left:9pt;mso-wrap-distance-top:0;mso-wrap-distance-right:9pt;mso-wrap-distance-bottom:0;mso-position-horizontal:absolute;mso-position-horizontal-relative:text;mso-position-vertical:absolute;mso-position-vertical-relative:text;mso-width-percent:0;mso-height-percent:0;mso-width-relative:margin;mso-height-relative:margin;v-text-anchor:middle" o:gfxdata="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" fillcolor="black [3200]" strokecolor="black [1600]" strokeweight="1pt">
+                          <v:oval w14:anchorId="3FE93C47" id="Oval 6" o:spid="_x0000_s1026" style="position:absolute;margin-left:-5pt;margin-top:-2.2pt;width:19.6pt;height:17.8pt;z-index:251658240;visibility:visible;mso-wrap-style:square;mso-width-percent:0;mso-height-percent:0;mso-wrap-distance-left:9pt;mso-wrap-distance-top:0;mso-wrap-distance-right:9pt;mso-wrap-distance-bottom:0;mso-position-horizontal:absolute;mso-position-horizontal-relative:text;mso-position-vertical:absolute;mso-position-vertical-relative:text;mso-width-percent:0;mso-height-percent:0;mso-width-relative:margin;mso-height-relative:margin;v-text-anchor:middle" o:gfxdata="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" fillcolor="black [3200]" strokecolor="black [1600]" strokeweight="1pt">
                             <v:stroke joinstyle="miter"/>
                           </v:oval>
                         </w:pict>
@@ -4367,7 +4365,7 @@
                       </mc:Choice>
                       <mc:Fallback>
                         <w:pict>
-                          <v:roundrect w14:anchorId="253114AC" id="Rectangle: Rounded Corners 5" o:spid="_x0000_s1026" style="position:absolute;margin-left:-4pt;margin-top:-5.85pt;width:19.75pt;height:11.05pt;z-index:251657216;visibility:visible;mso-wrap-style:square;mso-width-percent:0;mso-height-percent:0;mso-wrap-distance-left:9pt;mso-wrap-distance-top:0;mso-wrap-distance-right:9pt;mso-wrap-distance-bottom:0;mso-position-horizontal:absolute;mso-position-horizontal-relative:text;mso-position-vertical:absolute;mso-position-vertical-relative:text;mso-width-percent:0;mso-height-percent:0;mso-width-relative:margin;mso-height-relative:margin;v-text-anchor:middle" arcsize="10923f" o:gfxdata="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" fillcolor="white [3212]" strokecolor="black [1600]" strokeweight="1pt">
+                          <v:roundrect w14:anchorId="2593D554" id="Rectangle: Rounded Corners 5" o:spid="_x0000_s1026" style="position:absolute;margin-left:-4pt;margin-top:-5.85pt;width:19.75pt;height:11.05pt;z-index:251657216;visibility:visible;mso-wrap-style:square;mso-width-percent:0;mso-height-percent:0;mso-wrap-distance-left:9pt;mso-wrap-distance-top:0;mso-wrap-distance-right:9pt;mso-wrap-distance-bottom:0;mso-position-horizontal:absolute;mso-position-horizontal-relative:text;mso-position-vertical:absolute;mso-position-vertical-relative:text;mso-width-percent:0;mso-height-percent:0;mso-width-relative:margin;mso-height-relative:margin;v-text-anchor:middle" arcsize="10923f" o:gfxdata="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" fillcolor="white [3212]" strokecolor="black [1600]" strokeweight="1pt">
                             <v:stroke joinstyle="miter"/>
                           </v:roundrect>
                         </w:pict>
@@ -4481,7 +4479,7 @@
                       </mc:Choice>
                       <mc:Fallback>
                         <w:pict>
-                          <v:rect w14:anchorId="05D816C0" id="Rectangle 7" o:spid="_x0000_s1026" style="position:absolute;margin-left:-1.3pt;margin-top:-1.35pt;width:14.75pt;height:14.75pt;rotation:2977250fd;z-index:251659264;visibility:visible;mso-wrap-style:square;mso-width-percent:0;mso-height-percent:0;mso-wrap-distance-left:9pt;mso-wrap-distance-top:0;mso-wrap-distance-right:9pt;mso-wrap-distance-bottom:0;mso-position-horizontal:absolute;mso-position-horizontal-relative:text;mso-position-vertical:absolute;mso-position-vertical-relative:text;mso-width-percent:0;mso-height-percent:0;mso-width-relative:margin;mso-height-relative:margin;v-text-anchor:middle" o:gfxdata="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" fillcolor="white [3212]" strokecolor="black [1600]" strokeweight="1pt"/>
+                          <v:rect w14:anchorId="68665A99" id="Rectangle 7" o:spid="_x0000_s1026" style="position:absolute;margin-left:-1.3pt;margin-top:-1.35pt;width:14.75pt;height:14.75pt;rotation:2977250fd;z-index:251659264;visibility:visible;mso-wrap-style:square;mso-width-percent:0;mso-height-percent:0;mso-wrap-distance-left:9pt;mso-wrap-distance-top:0;mso-wrap-distance-right:9pt;mso-wrap-distance-bottom:0;mso-position-horizontal:absolute;mso-position-horizontal-relative:text;mso-position-vertical:absolute;mso-position-vertical-relative:text;mso-width-percent:0;mso-height-percent:0;mso-width-relative:margin;mso-height-relative:margin;v-text-anchor:middle" o:gfxdata="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" fillcolor="white [3212]" strokecolor="black [1600]" strokeweight="1pt"/>
                         </w:pict>
                       </mc:Fallback>
                     </mc:AlternateContent>
@@ -4649,7 +4647,7 @@
                       </mc:Choice>
                       <mc:Fallback>
                         <w:pict>
-                          <v:group w14:anchorId="67DD5643" id="Group 10" o:spid="_x0000_s1026" style="position:absolute;margin-left:-4.15pt;margin-top:-3.95pt;width:17.55pt;height:17.55pt;z-index:251665408;mso-width-relative:margin;mso-height-relative:margin" coordsize="222885,222885" o:gfxdata="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">
+                          <v:group w14:anchorId="62DBB2CA" id="Group 10" o:spid="_x0000_s1026" style="position:absolute;margin-left:-4.15pt;margin-top:-3.95pt;width:17.55pt;height:17.55pt;z-index:251665408;mso-width-relative:margin;mso-height-relative:margin" coordsize="222885,222885" o:gfxdata="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">
                             <v:oval id="Oval 8" o:spid="_x0000_s1027" style="position:absolute;width:222885;height:222885;visibility:visible;mso-wrap-style:square;v-text-anchor:middle" o:gfxdata="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" fillcolor="white [3212]" strokecolor="black [1600]" strokeweight="1pt">
                               <v:stroke joinstyle="miter"/>
                             </v:oval>
@@ -4681,6 +4679,283 @@
                 </w:p>
               </w:tc>
             </w:tr>
+            <w:tr>
+              <w:trPr>
+                <w:tblCellSpacing w:w="15" w:type="dxa"/>
+              </w:trPr>
+              <w:tc>
+                <w:tcPr>
+                  <w:tcW w:w="0" w:type="auto"/>
+                  <w:vAlign w:val="center"/>
+                </w:tcPr>
+                <w:p>
+                  <w:pPr>
+                    <w:framePr w:hSpace="180" w:wrap="around" w:vAnchor="text" w:hAnchor="text" w:x="-180" w:y="1"/>
+                    <w:suppressOverlap/>
+                    <w:rPr>
+                      <w:noProof/>
+                    </w:rPr>
+                  </w:pPr>
+                </w:p>
+                <w:p>
+                  <w:pPr>
+                    <w:framePr w:hSpace="180" w:wrap="around" w:vAnchor="text" w:hAnchor="text" w:x="-180" w:y="1"/>
+                    <w:suppressOverlap/>
+                    <w:rPr>
+                      <w:noProof/>
+                    </w:rPr>
+                  </w:pPr>
+                </w:p>
+                <w:p>
+                  <w:pPr>
+                    <w:framePr w:hSpace="180" w:wrap="around" w:vAnchor="text" w:hAnchor="text" w:x="-180" w:y="1"/>
+                    <w:suppressOverlap/>
+                    <w:rPr>
+                      <w:noProof/>
+                    </w:rPr>
+                  </w:pPr>
+                </w:p>
+                <w:p>
+                  <w:pPr>
+                    <w:framePr w:hSpace="180" w:wrap="around" w:vAnchor="text" w:hAnchor="text" w:x="-180" w:y="1"/>
+                    <w:suppressOverlap/>
+                    <w:rPr>
+                      <w:noProof/>
+                    </w:rPr>
+                  </w:pPr>
+                </w:p>
+                <w:p>
+                  <w:pPr>
+                    <w:framePr w:hSpace="180" w:wrap="around" w:vAnchor="text" w:hAnchor="text" w:x="-180" w:y="1"/>
+                    <w:suppressOverlap/>
+                    <w:rPr>
+                      <w:noProof/>
+                    </w:rPr>
+                  </w:pPr>
+                </w:p>
+                <w:p>
+                  <w:pPr>
+                    <w:framePr w:hSpace="180" w:wrap="around" w:vAnchor="text" w:hAnchor="text" w:x="-180" w:y="1"/>
+                    <w:suppressOverlap/>
+                    <w:rPr>
+                      <w:noProof/>
+                    </w:rPr>
+                  </w:pPr>
+                </w:p>
+                <w:p>
+                  <w:pPr>
+                    <w:pStyle w:val="Heading1"/>
+                  </w:pPr>
+                  <w:r>
+                    <w:t>1.8 Sitemap</w:t>
+                  </w:r>
+                </w:p>
+                <w:p>
+                  <w:pPr>
+                    <w:pStyle w:val="NormalWeb"/>
+                  </w:pPr>
+                  <w:r>
+                    <w:t>The sitemap shows the structure of the Personal Portfolio Website and the relationships between its sections. It helps users navigate the website easily and find information quickly.</w:t>
+                  </w:r>
+                </w:p>
+                <w:p>
+                  <w:pPr>
+                    <w:pStyle w:val="Heading2"/>
+                  </w:pPr>
+                  <w:r>
+                    <w:t>1.8.1 Sitemap Diagram</w:t>
+                  </w:r>
+                </w:p>
+                <w:p>
+                  <w:pPr>
+                    <w:pStyle w:val="NormalWeb"/>
+                  </w:pPr>
+                  <w:r>
+                    <w:rPr>
+                      <w:noProof/>
+                    </w:rPr>
+                    <w:drawing>
+                      <wp:inline distT="0" distB="0" distL="0" distR="0" wp14:anchorId="304F88A5" wp14:editId="0FA46E55">
+                        <wp:extent cx="5837274" cy="2834005"/>
+                        <wp:effectExtent l="0" t="0" r="0" b="0"/>
+                        <wp:docPr id="16" name="Picture 16" descr="C:\Users\Theekshana\AppData\Local\Microsoft\Windows\INetCache\Content.MSO\913F5311.tmp"/>
+                        <wp:cNvGraphicFramePr>
+                          <a:graphicFrameLocks xmlns:a="http://schemas.openxmlformats.org/drawingml/2006/main" noChangeAspect="1"/>
+                        </wp:cNvGraphicFramePr>
+                        <a:graphic xmlns:a="http://schemas.openxmlformats.org/drawingml/2006/main">
+                          <a:graphicData uri="http://schemas.openxmlformats.org/drawingml/2006/picture">
+                            <pic:pic xmlns:pic="http://schemas.openxmlformats.org/drawingml/2006/picture">
+                              <pic:nvPicPr>
+                                <pic:cNvPr id="0" name="Picture 90" descr="C:\Users\Theekshana\AppData\Local\Microsoft\Windows\INetCache\Content.MSO\913F5311.tmp"/>
+                                <pic:cNvPicPr>
+                                  <a:picLocks noChangeAspect="1" noChangeArrowheads="1"/>
+                                </pic:cNvPicPr>
+                              </pic:nvPicPr>
+                              <pic:blipFill>
+                                <a:blip r:embed="rId10" cstate="print">
+                                  <a:extLst>
+                                    <a:ext uri="{28A0092B-C50C-407E-A947-70E740481C1C}">
+                                      <a14:useLocalDpi xmlns:a14="http://schemas.microsoft.com/office/drawing/2010/main" val="0"/>
+                                    </a:ext>
+                                  </a:extLst>
+                                </a:blip>
+                                <a:srcRect/>
+                                <a:stretch>
+                                  <a:fillRect/>
+                                </a:stretch>
+                              </pic:blipFill>
+                              <pic:spPr bwMode="auto">
+                                <a:xfrm rot="10800000" flipH="1" flipV="1">
+                                  <a:off x="0" y="0"/>
+                                  <a:ext cx="6018203" cy="2921846"/>
+                                </a:xfrm>
+                                <a:prstGeom prst="rect">
+                                  <a:avLst/>
+                                </a:prstGeom>
+                                <a:noFill/>
+                                <a:ln>
+                                  <a:noFill/>
+                                </a:ln>
+                              </pic:spPr>
+                            </pic:pic>
+                          </a:graphicData>
+                        </a:graphic>
+                      </wp:inline>
+                    </w:drawing>
+                  </w:r>
+                </w:p>
+                <w:p>
+                  <w:pPr>
+                    <w:pStyle w:val="Heading2"/>
+                  </w:pPr>
+                  <w:r>
+                    <w:t>1.8.2 Sitemap Description</w:t>
+                  </w:r>
+                </w:p>
+                <w:p>
+                  <w:pPr>
+                    <w:pStyle w:val="NormalWeb"/>
+                  </w:pPr>
+                  <w:r>
+                    <w:t>The website consists of the following sections:</w:t>
+                  </w:r>
+                </w:p>
+                <w:p>
+                  <w:pPr>
+                    <w:pStyle w:val="NormalWeb"/>
+                    <w:numPr>
+                      <w:ilvl w:val="0"/>
+                      <w:numId w:val="9"/>
+                    </w:numPr>
+                  </w:pPr>
+                  <w:r>
+                    <w:t>Home</w:t>
+                  </w:r>
+                </w:p>
+                <w:p>
+                  <w:pPr>
+                    <w:pStyle w:val="NormalWeb"/>
+                    <w:numPr>
+                      <w:ilvl w:val="0"/>
+                      <w:numId w:val="9"/>
+                    </w:numPr>
+                  </w:pPr>
+                  <w:r>
+                    <w:t>About</w:t>
+                  </w:r>
+                </w:p>
+                <w:p>
+                  <w:pPr>
+                    <w:pStyle w:val="NormalWeb"/>
+                    <w:numPr>
+                      <w:ilvl w:val="0"/>
+                      <w:numId w:val="9"/>
+                    </w:numPr>
+                  </w:pPr>
+                  <w:r>
+                    <w:t>Education</w:t>
+                  </w:r>
+                </w:p>
+                <w:p>
+                  <w:pPr>
+                    <w:pStyle w:val="NormalWeb"/>
+                    <w:numPr>
+                      <w:ilvl w:val="0"/>
+                      <w:numId w:val="9"/>
+                    </w:numPr>
+                  </w:pPr>
+                  <w:r>
+                    <w:t>Skills</w:t>
+                  </w:r>
+                </w:p>
+                <w:p>
+                  <w:pPr>
+                    <w:pStyle w:val="NormalWeb"/>
+                    <w:numPr>
+                      <w:ilvl w:val="0"/>
+                      <w:numId w:val="9"/>
+                    </w:numPr>
+                  </w:pPr>
+                  <w:r>
+                    <w:t>Projects</w:t>
+                  </w:r>
+                </w:p>
+                <w:p>
+                  <w:pPr>
+                    <w:pStyle w:val="NormalWeb"/>
+                    <w:numPr>
+                      <w:ilvl w:val="0"/>
+                      <w:numId w:val="9"/>
+                    </w:numPr>
+                  </w:pPr>
+                  <w:r>
+                    <w:t>CV</w:t>
+                  </w:r>
+                </w:p>
+                <w:p>
+                  <w:pPr>
+                    <w:pStyle w:val="NormalWeb"/>
+                    <w:numPr>
+                      <w:ilvl w:val="0"/>
+                      <w:numId w:val="9"/>
+                    </w:numPr>
+                  </w:pPr>
+                  <w:r>
+                    <w:t>Contact</w:t>
+                  </w:r>
+                </w:p>
+                <w:p>
+                  <w:pPr>
+                    <w:pStyle w:val="NormalWeb"/>
+                  </w:pPr>
+                  <w:r>
+                    <w:t>All sections are accessible through the navigation menu.</w:t>
+                  </w:r>
+                </w:p>
+                <w:p>
+                  <w:pPr>
+                    <w:framePr w:hSpace="180" w:wrap="around" w:vAnchor="text" w:hAnchor="text" w:x="-180" w:y="1"/>
+                    <w:suppressOverlap/>
+                    <w:rPr>
+                      <w:noProof/>
+                    </w:rPr>
+                  </w:pPr>
+                </w:p>
+              </w:tc>
+              <w:tc>
+                <w:tcPr>
+                  <w:tcW w:w="0" w:type="auto"/>
+                  <w:vAlign w:val="center"/>
+                </w:tcPr>
+                <w:p>
+                  <w:pPr>
+                    <w:framePr w:hSpace="180" w:wrap="around" w:vAnchor="text" w:hAnchor="text" w:x="-180" w:y="1"/>
+                    <w:ind w:left="603" w:firstLine="96"/>
+                    <w:suppressOverlap/>
+                  </w:pPr>
+                </w:p>
+              </w:tc>
+            </w:tr>
           </w:tbl>
           <w:p/>
         </w:tc>
@@ -4702,8 +4977,11 @@
     </w:tbl>
     <w:p>
       <w:r>
+        <w:lastRenderedPageBreak/>
         <w:br w:type="textWrapping" w:clear="all"/>
       </w:r>
+      <w:bookmarkStart w:id="0" w:name="_GoBack"/>
+      <w:bookmarkEnd w:id="0"/>
     </w:p>
     <w:sectPr>
       <w:pgSz w:w="12240" w:h="15840"/>
@@ -5775,6 +6053,155 @@
     </w:lvl>
   </w:abstractNum>
   <w:abstractNum w:abstractNumId="7" w15:restartNumberingAfterBreak="0">
+    <w:nsid w:val="6E1B5EDB"/>
+    <w:multiLevelType w:val="multilevel"/>
+    <w:tmpl w:val="941436FA"/>
+    <w:lvl w:ilvl="0">
+      <w:start w:val="1"/>
+      <w:numFmt w:val="bullet"/>
+      <w:lvlText w:val=""/>
+      <w:lvlJc w:val="left"/>
+      <w:pPr>
+        <w:tabs>
+          <w:tab w:val="num" w:pos="720"/>
+        </w:tabs>
+        <w:ind w:left="720" w:hanging="360"/>
+      </w:pPr>
+      <w:rPr>
+        <w:rFonts w:ascii="Symbol" w:hAnsi="Symbol" w:hint="default"/>
+        <w:sz w:val="20"/>
+      </w:rPr>
+    </w:lvl>
+    <w:lvl w:ilvl="1" w:tentative="1">
+      <w:start w:val="1"/>
+      <w:numFmt w:val="bullet"/>
+      <w:lvlText w:val="o"/>
+      <w:lvlJc w:val="left"/>
+      <w:pPr>
+        <w:tabs>
+          <w:tab w:val="num" w:pos="1440"/>
+        </w:tabs>
+        <w:ind w:left="1440" w:hanging="360"/>
+      </w:pPr>
+      <w:rPr>
+        <w:rFonts w:ascii="Courier New" w:hAnsi="Courier New" w:hint="default"/>
+        <w:sz w:val="20"/>
+      </w:rPr>
+    </w:lvl>
+    <w:lvl w:ilvl="2" w:tentative="1">
+      <w:start w:val="1"/>
+      <w:numFmt w:val="bullet"/>
+      <w:lvlText w:val=""/>
+      <w:lvlJc w:val="left"/>
+      <w:pPr>
+        <w:tabs>
+          <w:tab w:val="num" w:pos="2160"/>
+        </w:tabs>
+        <w:ind w:left="2160" w:hanging="360"/>
+      </w:pPr>
+      <w:rPr>
+        <w:rFonts w:ascii="Wingdings" w:hAnsi="Wingdings" w:hint="default"/>
+        <w:sz w:val="20"/>
+      </w:rPr>
+    </w:lvl>
+    <w:lvl w:ilvl="3" w:tentative="1">
+      <w:start w:val="1"/>
+      <w:numFmt w:val="bullet"/>
+      <w:lvlText w:val=""/>
+      <w:lvlJc w:val="left"/>
+      <w:pPr>
+        <w:tabs>
+          <w:tab w:val="num" w:pos="2880"/>
+        </w:tabs>
+        <w:ind w:left="2880" w:hanging="360"/>
+      </w:pPr>
+      <w:rPr>
+        <w:rFonts w:ascii="Wingdings" w:hAnsi="Wingdings" w:hint="default"/>
+        <w:sz w:val="20"/>
+      </w:rPr>
+    </w:lvl>
+    <w:lvl w:ilvl="4" w:tentative="1">
+      <w:start w:val="1"/>
+      <w:numFmt w:val="bullet"/>
+      <w:lvlText w:val=""/>
+      <w:lvlJc w:val="left"/>
+      <w:pPr>
+        <w:tabs>
+          <w:tab w:val="num" w:pos="3600"/>
+        </w:tabs>
+        <w:ind w:left="3600" w:hanging="360"/>
+      </w:pPr>
+      <w:rPr>
+        <w:rFonts w:ascii="Wingdings" w:hAnsi="Wingdings" w:hint="default"/>
+        <w:sz w:val="20"/>
+      </w:rPr>
+    </w:lvl>
+    <w:lvl w:ilvl="5" w:tentative="1">
+      <w:start w:val="1"/>
+      <w:numFmt w:val="bullet"/>
+      <w:lvlText w:val=""/>
+      <w:lvlJc w:val="left"/>
+      <w:pPr>
+        <w:tabs>
+          <w:tab w:val="num" w:pos="4320"/>
+        </w:tabs>
+        <w:ind w:left="4320" w:hanging="360"/>
+      </w:pPr>
+      <w:rPr>
+        <w:rFonts w:ascii="Wingdings" w:hAnsi="Wingdings" w:hint="default"/>
+        <w:sz w:val="20"/>
+      </w:rPr>
+    </w:lvl>
+    <w:lvl w:ilvl="6" w:tentative="1">
+      <w:start w:val="1"/>
+      <w:numFmt w:val="bullet"/>
+      <w:lvlText w:val=""/>
+      <w:lvlJc w:val="left"/>
+      <w:pPr>
+        <w:tabs>
+          <w:tab w:val="num" w:pos="5040"/>
+        </w:tabs>
+        <w:ind w:left="5040" w:hanging="360"/>
+      </w:pPr>
+      <w:rPr>
+        <w:rFonts w:ascii="Wingdings" w:hAnsi="Wingdings" w:hint="default"/>
+        <w:sz w:val="20"/>
+      </w:rPr>
+    </w:lvl>
+    <w:lvl w:ilvl="7" w:tentative="1">
+      <w:start w:val="1"/>
+      <w:numFmt w:val="bullet"/>
+      <w:lvlText w:val=""/>
+      <w:lvlJc w:val="left"/>
+      <w:pPr>
+        <w:tabs>
+          <w:tab w:val="num" w:pos="5760"/>
+        </w:tabs>
+        <w:ind w:left="5760" w:hanging="360"/>
+      </w:pPr>
+      <w:rPr>
+        <w:rFonts w:ascii="Wingdings" w:hAnsi="Wingdings" w:hint="default"/>
+        <w:sz w:val="20"/>
+      </w:rPr>
+    </w:lvl>
+    <w:lvl w:ilvl="8" w:tentative="1">
+      <w:start w:val="1"/>
+      <w:numFmt w:val="bullet"/>
+      <w:lvlText w:val=""/>
+      <w:lvlJc w:val="left"/>
+      <w:pPr>
+        <w:tabs>
+          <w:tab w:val="num" w:pos="6480"/>
+        </w:tabs>
+        <w:ind w:left="6480" w:hanging="360"/>
+      </w:pPr>
+      <w:rPr>
+        <w:rFonts w:ascii="Wingdings" w:hAnsi="Wingdings" w:hint="default"/>
+        <w:sz w:val="20"/>
+      </w:rPr>
+    </w:lvl>
+  </w:abstractNum>
+  <w:abstractNum w:abstractNumId="8" w15:restartNumberingAfterBreak="0">
     <w:nsid w:val="7565782C"/>
     <w:multiLevelType w:val="multilevel"/>
     <w:tmpl w:val="116832D6"/>
@@ -5939,13 +6366,16 @@
     <w:abstractNumId w:val="5"/>
   </w:num>
   <w:num w:numId="6">
-    <w:abstractNumId w:val="7"/>
+    <w:abstractNumId w:val="8"/>
   </w:num>
   <w:num w:numId="7">
     <w:abstractNumId w:val="6"/>
   </w:num>
   <w:num w:numId="8">
     <w:abstractNumId w:val="2"/>
+  </w:num>
+  <w:num w:numId="9">
+    <w:abstractNumId w:val="7"/>
   </w:num>
 </w:numbering>
 </file>
@@ -6930,4 +7360,16 @@
     </a:ext>
   </a:extLst>
 </a:theme>
+</file>
+
+<file path=customXml/item1.xml><?xml version="1.0" encoding="utf-8"?>
+<b:Sources xmlns:b="http://schemas.openxmlformats.org/officeDocument/2006/bibliography" xmlns="http://schemas.openxmlformats.org/officeDocument/2006/bibliography" SelectedStyle="\APASixthEditionOfficeOnline.xsl" StyleName="APA" Version="6"/>
+</file>
+
+<file path=customXml/itemProps1.xml><?xml version="1.0" encoding="utf-8"?>
+<ds:datastoreItem xmlns:ds="http://schemas.openxmlformats.org/officeDocument/2006/customXml" ds:itemID="{061AA61F-BA3A-4BFC-B033-E01278FFCDC8}">
+  <ds:schemaRefs>
+    <ds:schemaRef ds:uri="http://schemas.openxmlformats.org/officeDocument/2006/bibliography"/>
+  </ds:schemaRefs>
+</ds:datastoreItem>
 </file>
</xml_diff>

<commit_message>
docs: update roadmap — Week 2 Day 3 complete-about and education part
</commit_message>
<xml_diff>
--- a/report/Problem Statement.docx
+++ b/report/Problem Statement.docx
@@ -4248,7 +4248,7 @@
                       </mc:Choice>
                       <mc:Fallback>
                         <w:pict>
-                          <v:oval w14:anchorId="3FE93C47" id="Oval 6" o:spid="_x0000_s1026" style="position:absolute;margin-left:-5pt;margin-top:-2.2pt;width:19.6pt;height:17.8pt;z-index:251658240;visibility:visible;mso-wrap-style:square;mso-width-percent:0;mso-height-percent:0;mso-wrap-distance-left:9pt;mso-wrap-distance-top:0;mso-wrap-distance-right:9pt;mso-wrap-distance-bottom:0;mso-position-horizontal:absolute;mso-position-horizontal-relative:text;mso-position-vertical:absolute;mso-position-vertical-relative:text;mso-width-percent:0;mso-height-percent:0;mso-width-relative:margin;mso-height-relative:margin;v-text-anchor:middle" o:gfxdata="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" fillcolor="black [3200]" strokecolor="black [1600]" strokeweight="1pt">
+                          <v:oval w14:anchorId="4B25BBBE" id="Oval 6" o:spid="_x0000_s1026" style="position:absolute;margin-left:-5pt;margin-top:-2.2pt;width:19.6pt;height:17.8pt;z-index:251658240;visibility:visible;mso-wrap-style:square;mso-width-percent:0;mso-height-percent:0;mso-wrap-distance-left:9pt;mso-wrap-distance-top:0;mso-wrap-distance-right:9pt;mso-wrap-distance-bottom:0;mso-position-horizontal:absolute;mso-position-horizontal-relative:text;mso-position-vertical:absolute;mso-position-vertical-relative:text;mso-width-percent:0;mso-height-percent:0;mso-width-relative:margin;mso-height-relative:margin;v-text-anchor:middle" o:gfxdata="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" fillcolor="black [3200]" strokecolor="black [1600]" strokeweight="1pt">
                             <v:stroke joinstyle="miter"/>
                           </v:oval>
                         </w:pict>
@@ -4365,7 +4365,7 @@
                       </mc:Choice>
                       <mc:Fallback>
                         <w:pict>
-                          <v:roundrect w14:anchorId="2593D554" id="Rectangle: Rounded Corners 5" o:spid="_x0000_s1026" style="position:absolute;margin-left:-4pt;margin-top:-5.85pt;width:19.75pt;height:11.05pt;z-index:251657216;visibility:visible;mso-wrap-style:square;mso-width-percent:0;mso-height-percent:0;mso-wrap-distance-left:9pt;mso-wrap-distance-top:0;mso-wrap-distance-right:9pt;mso-wrap-distance-bottom:0;mso-position-horizontal:absolute;mso-position-horizontal-relative:text;mso-position-vertical:absolute;mso-position-vertical-relative:text;mso-width-percent:0;mso-height-percent:0;mso-width-relative:margin;mso-height-relative:margin;v-text-anchor:middle" arcsize="10923f" o:gfxdata="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" fillcolor="white [3212]" strokecolor="black [1600]" strokeweight="1pt">
+                          <v:roundrect w14:anchorId="115D1E88" id="Rectangle: Rounded Corners 5" o:spid="_x0000_s1026" style="position:absolute;margin-left:-4pt;margin-top:-5.85pt;width:19.75pt;height:11.05pt;z-index:251657216;visibility:visible;mso-wrap-style:square;mso-width-percent:0;mso-height-percent:0;mso-wrap-distance-left:9pt;mso-wrap-distance-top:0;mso-wrap-distance-right:9pt;mso-wrap-distance-bottom:0;mso-position-horizontal:absolute;mso-position-horizontal-relative:text;mso-position-vertical:absolute;mso-position-vertical-relative:text;mso-width-percent:0;mso-height-percent:0;mso-width-relative:margin;mso-height-relative:margin;v-text-anchor:middle" arcsize="10923f" o:gfxdata="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" fillcolor="white [3212]" strokecolor="black [1600]" strokeweight="1pt">
                             <v:stroke joinstyle="miter"/>
                           </v:roundrect>
                         </w:pict>
@@ -4479,7 +4479,7 @@
                       </mc:Choice>
                       <mc:Fallback>
                         <w:pict>
-                          <v:rect w14:anchorId="68665A99" id="Rectangle 7" o:spid="_x0000_s1026" style="position:absolute;margin-left:-1.3pt;margin-top:-1.35pt;width:14.75pt;height:14.75pt;rotation:2977250fd;z-index:251659264;visibility:visible;mso-wrap-style:square;mso-width-percent:0;mso-height-percent:0;mso-wrap-distance-left:9pt;mso-wrap-distance-top:0;mso-wrap-distance-right:9pt;mso-wrap-distance-bottom:0;mso-position-horizontal:absolute;mso-position-horizontal-relative:text;mso-position-vertical:absolute;mso-position-vertical-relative:text;mso-width-percent:0;mso-height-percent:0;mso-width-relative:margin;mso-height-relative:margin;v-text-anchor:middle" o:gfxdata="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" fillcolor="white [3212]" strokecolor="black [1600]" strokeweight="1pt"/>
+                          <v:rect w14:anchorId="3AA52CE8" id="Rectangle 7" o:spid="_x0000_s1026" style="position:absolute;margin-left:-1.3pt;margin-top:-1.35pt;width:14.75pt;height:14.75pt;rotation:2977250fd;z-index:251659264;visibility:visible;mso-wrap-style:square;mso-width-percent:0;mso-height-percent:0;mso-wrap-distance-left:9pt;mso-wrap-distance-top:0;mso-wrap-distance-right:9pt;mso-wrap-distance-bottom:0;mso-position-horizontal:absolute;mso-position-horizontal-relative:text;mso-position-vertical:absolute;mso-position-vertical-relative:text;mso-width-percent:0;mso-height-percent:0;mso-width-relative:margin;mso-height-relative:margin;v-text-anchor:middle" o:gfxdata="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" fillcolor="white [3212]" strokecolor="black [1600]" strokeweight="1pt"/>
                         </w:pict>
                       </mc:Fallback>
                     </mc:AlternateContent>
@@ -4647,7 +4647,7 @@
                       </mc:Choice>
                       <mc:Fallback>
                         <w:pict>
-                          <v:group w14:anchorId="62DBB2CA" id="Group 10" o:spid="_x0000_s1026" style="position:absolute;margin-left:-4.15pt;margin-top:-3.95pt;width:17.55pt;height:17.55pt;z-index:251665408;mso-width-relative:margin;mso-height-relative:margin" coordsize="222885,222885" o:gfxdata="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">
+                          <v:group w14:anchorId="46DFF5FB" id="Group 10" o:spid="_x0000_s1026" style="position:absolute;margin-left:-4.15pt;margin-top:-3.95pt;width:17.55pt;height:17.55pt;z-index:251665408;mso-width-relative:margin;mso-height-relative:margin" coordsize="222885,222885" o:gfxdata="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">
                             <v:oval id="Oval 8" o:spid="_x0000_s1027" style="position:absolute;width:222885;height:222885;visibility:visible;mso-wrap-style:square;v-text-anchor:middle" o:gfxdata="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" fillcolor="white [3212]" strokecolor="black [1600]" strokeweight="1pt">
                               <v:stroke joinstyle="miter"/>
                             </v:oval>
@@ -4980,6 +4980,8 @@
         <w:lastRenderedPageBreak/>
         <w:br w:type="textWrapping" w:clear="all"/>
       </w:r>
+    </w:p>
+    <w:p>
       <w:bookmarkStart w:id="0" w:name="_GoBack"/>
       <w:bookmarkEnd w:id="0"/>
     </w:p>
@@ -7367,7 +7369,7 @@
 </file>
 
 <file path=customXml/itemProps1.xml><?xml version="1.0" encoding="utf-8"?>
-<ds:datastoreItem xmlns:ds="http://schemas.openxmlformats.org/officeDocument/2006/customXml" ds:itemID="{061AA61F-BA3A-4BFC-B033-E01278FFCDC8}">
+<ds:datastoreItem xmlns:ds="http://schemas.openxmlformats.org/officeDocument/2006/customXml" ds:itemID="{0854845D-73D5-4586-8C96-D3DAE6EAC812}">
   <ds:schemaRefs>
     <ds:schemaRef ds:uri="http://schemas.openxmlformats.org/officeDocument/2006/bibliography"/>
   </ds:schemaRefs>

</xml_diff>

<commit_message>
updated report - Low and High Fidality Wireframes
</commit_message>
<xml_diff>
--- a/report/Problem Statement.docx
+++ b/report/Problem Statement.docx
@@ -45,7 +45,7 @@
     <w:p>
       <w:r>
         <w:pict w14:anchorId="53CC6B54">
-          <v:rect id="_x0000_i1102" style="width:0;height:1.5pt" o:hralign="center" o:hrstd="t" o:hr="t" fillcolor="#a0a0a0" stroked="f"/>
+          <v:rect id="_x0000_i1025" style="width:0;height:1.5pt" o:hralign="center" o:hrstd="t" o:hr="t" fillcolor="#a0a0a0" stroked="f"/>
         </w:pict>
       </w:r>
     </w:p>
@@ -168,7 +168,7 @@
     <w:p>
       <w:r>
         <w:pict w14:anchorId="643E538C">
-          <v:rect id="_x0000_i1103" style="width:0;height:1.5pt" o:hralign="center" o:hrstd="t" o:hr="t" fillcolor="#a0a0a0" stroked="f"/>
+          <v:rect id="_x0000_i1026" style="width:0;height:1.5pt" o:hralign="center" o:hrstd="t" o:hr="t" fillcolor="#a0a0a0" stroked="f"/>
         </w:pict>
       </w:r>
     </w:p>
@@ -461,7 +461,7 @@
     <w:p>
       <w:r>
         <w:pict w14:anchorId="4618207D">
-          <v:rect id="_x0000_i1104" style="width:0;height:1.5pt" o:hralign="center" o:hrstd="t" o:hr="t" fillcolor="#a0a0a0" stroked="f"/>
+          <v:rect id="_x0000_i1027" style="width:0;height:1.5pt" o:hralign="center" o:hrstd="t" o:hr="t" fillcolor="#a0a0a0" stroked="f"/>
         </w:pict>
       </w:r>
     </w:p>
@@ -755,7 +755,7 @@
     <w:p>
       <w:r>
         <w:pict w14:anchorId="26A33434">
-          <v:rect id="_x0000_i1105" style="width:0;height:1.5pt" o:hralign="center" o:hrstd="t" o:hr="t" fillcolor="#a0a0a0" stroked="f"/>
+          <v:rect id="_x0000_i1028" style="width:0;height:1.5pt" o:hralign="center" o:hrstd="t" o:hr="t" fillcolor="#a0a0a0" stroked="f"/>
         </w:pict>
       </w:r>
     </w:p>
@@ -967,7 +967,7 @@
     <w:p>
       <w:r>
         <w:pict w14:anchorId="34899E99">
-          <v:rect id="_x0000_i1106" style="width:0;height:1.5pt" o:hralign="center" o:hrstd="t" o:hr="t" fillcolor="#a0a0a0" stroked="f"/>
+          <v:rect id="_x0000_i1029" style="width:0;height:1.5pt" o:hralign="center" o:hrstd="t" o:hr="t" fillcolor="#a0a0a0" stroked="f"/>
         </w:pict>
       </w:r>
     </w:p>
@@ -1360,7 +1360,7 @@
     <w:p>
       <w:r>
         <w:pict w14:anchorId="1E961320">
-          <v:rect id="_x0000_i1107" style="width:0;height:1.5pt" o:hralign="center" o:hrstd="t" o:hr="t" fillcolor="#a0a0a0" stroked="f"/>
+          <v:rect id="_x0000_i1030" style="width:0;height:1.5pt" o:hralign="center" o:hrstd="t" o:hr="t" fillcolor="#a0a0a0" stroked="f"/>
         </w:pict>
       </w:r>
     </w:p>
@@ -2004,7 +2004,7 @@
       <w:r>
         <w:lastRenderedPageBreak/>
         <w:pict w14:anchorId="3983BD3B">
-          <v:rect id="_x0000_i1108" style="width:0;height:1.5pt" o:hralign="center" o:hrstd="t" o:hr="t" fillcolor="#a0a0a0" stroked="f"/>
+          <v:rect id="_x0000_i1031" style="width:0;height:1.5pt" o:hralign="center" o:hrstd="t" o:hr="t" fillcolor="#a0a0a0" stroked="f"/>
         </w:pict>
       </w:r>
     </w:p>
@@ -2270,7 +2270,7 @@
     <w:p>
       <w:r>
         <w:pict w14:anchorId="6B197895">
-          <v:rect id="_x0000_i1109" style="width:0;height:1.5pt" o:hralign="center" o:hrstd="t" o:hr="t" fillcolor="#a0a0a0" stroked="f"/>
+          <v:rect id="_x0000_i1032" style="width:0;height:1.5pt" o:hralign="center" o:hrstd="t" o:hr="t" fillcolor="#a0a0a0" stroked="f"/>
         </w:pict>
       </w:r>
     </w:p>
@@ -2528,7 +2528,7 @@
     <w:p>
       <w:r>
         <w:pict w14:anchorId="4B33DA93">
-          <v:rect id="_x0000_i1110" style="width:0;height:1.5pt" o:hralign="center" o:hrstd="t" o:hr="t" fillcolor="#a0a0a0" stroked="f"/>
+          <v:rect id="_x0000_i1033" style="width:0;height:1.5pt" o:hralign="center" o:hrstd="t" o:hr="t" fillcolor="#a0a0a0" stroked="f"/>
         </w:pict>
       </w:r>
     </w:p>
@@ -2787,7 +2787,7 @@
     <w:p>
       <w:r>
         <w:pict w14:anchorId="1F55095A">
-          <v:rect id="_x0000_i1111" style="width:0;height:1.5pt" o:hralign="center" o:hrstd="t" o:hr="t" fillcolor="#a0a0a0" stroked="f"/>
+          <v:rect id="_x0000_i1034" style="width:0;height:1.5pt" o:hralign="center" o:hrstd="t" o:hr="t" fillcolor="#a0a0a0" stroked="f"/>
         </w:pict>
       </w:r>
     </w:p>
@@ -3045,7 +3045,7 @@
     <w:p>
       <w:r>
         <w:pict w14:anchorId="1C549445">
-          <v:rect id="_x0000_i1112" style="width:0;height:1.5pt" o:hralign="center" o:hrstd="t" o:hr="t" fillcolor="#a0a0a0" stroked="f"/>
+          <v:rect id="_x0000_i1035" style="width:0;height:1.5pt" o:hralign="center" o:hrstd="t" o:hr="t" fillcolor="#a0a0a0" stroked="f"/>
         </w:pict>
       </w:r>
     </w:p>
@@ -3303,7 +3303,7 @@
     <w:p>
       <w:r>
         <w:pict w14:anchorId="73C8D4FC">
-          <v:rect id="_x0000_i1113" style="width:0;height:1.5pt" o:hralign="center" o:hrstd="t" o:hr="t" fillcolor="#a0a0a0" stroked="f"/>
+          <v:rect id="_x0000_i1036" style="width:0;height:1.5pt" o:hralign="center" o:hrstd="t" o:hr="t" fillcolor="#a0a0a0" stroked="f"/>
         </w:pict>
       </w:r>
     </w:p>
@@ -4745,6 +4745,8 @@
                 <w:p>
                   <w:pPr>
                     <w:pStyle w:val="Heading1"/>
+                    <w:framePr w:hSpace="180" w:wrap="around" w:vAnchor="text" w:hAnchor="text" w:x="-180" w:y="1"/>
+                    <w:suppressOverlap/>
                   </w:pPr>
                   <w:r>
                     <w:t>1.8 Sitemap</w:t>
@@ -4753,6 +4755,8 @@
                 <w:p>
                   <w:pPr>
                     <w:pStyle w:val="NormalWeb"/>
+                    <w:framePr w:hSpace="180" w:wrap="around" w:vAnchor="text" w:hAnchor="text" w:x="-180" w:y="1"/>
+                    <w:suppressOverlap/>
                   </w:pPr>
                   <w:r>
                     <w:t>The sitemap shows the structure of the Personal Portfolio Website and the relationships between its sections. It helps users navigate the website easily and find information quickly.</w:t>
@@ -4761,6 +4765,8 @@
                 <w:p>
                   <w:pPr>
                     <w:pStyle w:val="Heading2"/>
+                    <w:framePr w:hSpace="180" w:wrap="around" w:vAnchor="text" w:hAnchor="text" w:x="-180" w:y="1"/>
+                    <w:suppressOverlap/>
                   </w:pPr>
                   <w:r>
                     <w:t>1.8.1 Sitemap Diagram</w:t>
@@ -4769,6 +4775,8 @@
                 <w:p>
                   <w:pPr>
                     <w:pStyle w:val="NormalWeb"/>
+                    <w:framePr w:hSpace="180" w:wrap="around" w:vAnchor="text" w:hAnchor="text" w:x="-180" w:y="1"/>
+                    <w:suppressOverlap/>
                   </w:pPr>
                   <w:r>
                     <w:rPr>
@@ -4827,6 +4835,8 @@
                 <w:p>
                   <w:pPr>
                     <w:pStyle w:val="Heading2"/>
+                    <w:framePr w:hSpace="180" w:wrap="around" w:vAnchor="text" w:hAnchor="text" w:x="-180" w:y="1"/>
+                    <w:suppressOverlap/>
                   </w:pPr>
                   <w:r>
                     <w:t>1.8.2 Sitemap Description</w:t>
@@ -4835,6 +4845,8 @@
                 <w:p>
                   <w:pPr>
                     <w:pStyle w:val="NormalWeb"/>
+                    <w:framePr w:hSpace="180" w:wrap="around" w:vAnchor="text" w:hAnchor="text" w:x="-180" w:y="1"/>
+                    <w:suppressOverlap/>
                   </w:pPr>
                   <w:r>
                     <w:t>The website consists of the following sections:</w:t>
@@ -4843,10 +4855,12 @@
                 <w:p>
                   <w:pPr>
                     <w:pStyle w:val="NormalWeb"/>
+                    <w:framePr w:hSpace="180" w:wrap="around" w:vAnchor="text" w:hAnchor="text" w:x="-180" w:y="1"/>
                     <w:numPr>
                       <w:ilvl w:val="0"/>
                       <w:numId w:val="9"/>
                     </w:numPr>
+                    <w:suppressOverlap/>
                   </w:pPr>
                   <w:r>
                     <w:t>Home</w:t>
@@ -4855,10 +4869,12 @@
                 <w:p>
                   <w:pPr>
                     <w:pStyle w:val="NormalWeb"/>
+                    <w:framePr w:hSpace="180" w:wrap="around" w:vAnchor="text" w:hAnchor="text" w:x="-180" w:y="1"/>
                     <w:numPr>
                       <w:ilvl w:val="0"/>
                       <w:numId w:val="9"/>
                     </w:numPr>
+                    <w:suppressOverlap/>
                   </w:pPr>
                   <w:r>
                     <w:t>About</w:t>
@@ -4867,10 +4883,12 @@
                 <w:p>
                   <w:pPr>
                     <w:pStyle w:val="NormalWeb"/>
+                    <w:framePr w:hSpace="180" w:wrap="around" w:vAnchor="text" w:hAnchor="text" w:x="-180" w:y="1"/>
                     <w:numPr>
                       <w:ilvl w:val="0"/>
                       <w:numId w:val="9"/>
                     </w:numPr>
+                    <w:suppressOverlap/>
                   </w:pPr>
                   <w:r>
                     <w:t>Education</w:t>
@@ -4879,10 +4897,12 @@
                 <w:p>
                   <w:pPr>
                     <w:pStyle w:val="NormalWeb"/>
+                    <w:framePr w:hSpace="180" w:wrap="around" w:vAnchor="text" w:hAnchor="text" w:x="-180" w:y="1"/>
                     <w:numPr>
                       <w:ilvl w:val="0"/>
                       <w:numId w:val="9"/>
                     </w:numPr>
+                    <w:suppressOverlap/>
                   </w:pPr>
                   <w:r>
                     <w:t>Skills</w:t>
@@ -4891,10 +4911,12 @@
                 <w:p>
                   <w:pPr>
                     <w:pStyle w:val="NormalWeb"/>
+                    <w:framePr w:hSpace="180" w:wrap="around" w:vAnchor="text" w:hAnchor="text" w:x="-180" w:y="1"/>
                     <w:numPr>
                       <w:ilvl w:val="0"/>
                       <w:numId w:val="9"/>
                     </w:numPr>
+                    <w:suppressOverlap/>
                   </w:pPr>
                   <w:r>
                     <w:t>Projects</w:t>
@@ -4903,10 +4925,12 @@
                 <w:p>
                   <w:pPr>
                     <w:pStyle w:val="NormalWeb"/>
+                    <w:framePr w:hSpace="180" w:wrap="around" w:vAnchor="text" w:hAnchor="text" w:x="-180" w:y="1"/>
                     <w:numPr>
                       <w:ilvl w:val="0"/>
                       <w:numId w:val="9"/>
                     </w:numPr>
+                    <w:suppressOverlap/>
                   </w:pPr>
                   <w:r>
                     <w:t>CV</w:t>
@@ -4915,10 +4939,12 @@
                 <w:p>
                   <w:pPr>
                     <w:pStyle w:val="NormalWeb"/>
+                    <w:framePr w:hSpace="180" w:wrap="around" w:vAnchor="text" w:hAnchor="text" w:x="-180" w:y="1"/>
                     <w:numPr>
                       <w:ilvl w:val="0"/>
                       <w:numId w:val="9"/>
                     </w:numPr>
+                    <w:suppressOverlap/>
                   </w:pPr>
                   <w:r>
                     <w:t>Contact</w:t>
@@ -4927,9 +4953,295 @@
                 <w:p>
                   <w:pPr>
                     <w:pStyle w:val="NormalWeb"/>
+                    <w:framePr w:hSpace="180" w:wrap="around" w:vAnchor="text" w:hAnchor="text" w:x="-180" w:y="1"/>
+                    <w:suppressOverlap/>
                   </w:pPr>
                   <w:r>
                     <w:t>All sections are accessible through the navigation menu.</w:t>
+                  </w:r>
+                </w:p>
+                <w:p>
+                  <w:pPr>
+                    <w:framePr w:hSpace="180" w:wrap="around" w:vAnchor="text" w:hAnchor="text" w:x="-180" w:y="1"/>
+                    <w:suppressOverlap/>
+                    <w:rPr>
+                      <w:noProof/>
+                    </w:rPr>
+                  </w:pPr>
+                </w:p>
+                <w:p>
+                  <w:pPr>
+                    <w:framePr w:hSpace="180" w:wrap="around" w:vAnchor="text" w:hAnchor="text" w:x="-180" w:y="1"/>
+                    <w:suppressOverlap/>
+                    <w:rPr>
+                      <w:noProof/>
+                    </w:rPr>
+                  </w:pPr>
+                </w:p>
+                <w:p>
+                  <w:pPr>
+                    <w:pStyle w:val="Heading1"/>
+                  </w:pPr>
+                  <w:r>
+                    <w:lastRenderedPageBreak/>
+                    <w:t>1.11 Wireframes and Interface Design</w:t>
+                  </w:r>
+                </w:p>
+                <w:p>
+                  <w:pPr>
+                    <w:pStyle w:val="Heading2"/>
+                  </w:pPr>
+                  <w:r>
+                    <w:t>1.11.1 Low-Fidelity Wireframe</w:t>
+                  </w:r>
+                </w:p>
+                <w:p>
+                  <w:pPr>
+                    <w:pStyle w:val="NormalWeb"/>
+                  </w:pPr>
+                  <w:r>
+                    <w:t>The low-fidelity wireframe was used to plan the layout, content placement, and navigation structure of the portfolio website.</w:t>
+                  </w:r>
+                </w:p>
+                <w:p>
+                  <w:pPr>
+                    <w:pStyle w:val="Heading2"/>
+                  </w:pPr>
+                  <w:r>
+                    <w:t>1.11.2 High-Fidelity Wireframe</w:t>
+                  </w:r>
+                </w:p>
+                <w:p>
+                  <w:pPr>
+                    <w:pStyle w:val="NormalWeb"/>
+                  </w:pPr>
+                  <w:bookmarkStart w:id="0" w:name="_GoBack"/>
+                  <w:r>
+                    <w:rPr>
+                      <w:noProof/>
+                      <w14:ligatures w14:val="standardContextual"/>
+                    </w:rPr>
+                    <mc:AlternateContent>
+                      <mc:Choice Requires="wps">
+                        <w:drawing>
+                          <wp:anchor distT="0" distB="0" distL="114300" distR="114300" simplePos="0" relativeHeight="251669504" behindDoc="0" locked="0" layoutInCell="1" allowOverlap="1" wp14:anchorId="71DCEC24" wp14:editId="74FADA2C">
+                            <wp:simplePos x="0" y="0"/>
+                            <wp:positionH relativeFrom="column">
+                              <wp:posOffset>288925</wp:posOffset>
+                            </wp:positionH>
+                            <wp:positionV relativeFrom="paragraph">
+                              <wp:posOffset>693420</wp:posOffset>
+                            </wp:positionV>
+                            <wp:extent cx="5178425" cy="3244215"/>
+                            <wp:effectExtent l="0" t="0" r="22225" b="13335"/>
+                            <wp:wrapNone/>
+                            <wp:docPr id="14" name="Rectangle 14"/>
+                            <wp:cNvGraphicFramePr/>
+                            <a:graphic xmlns:a="http://schemas.openxmlformats.org/drawingml/2006/main">
+                              <a:graphicData uri="http://schemas.microsoft.com/office/word/2010/wordprocessingShape">
+                                <wps:wsp>
+                                  <wps:cNvSpPr/>
+                                  <wps:spPr>
+                                    <a:xfrm>
+                                      <a:off x="0" y="0"/>
+                                      <a:ext cx="5178425" cy="3244215"/>
+                                    </a:xfrm>
+                                    <a:prstGeom prst="rect">
+                                      <a:avLst/>
+                                    </a:prstGeom>
+                                    <a:blipFill dpi="0" rotWithShape="1">
+                                      <a:blip r:embed="rId11">
+                                        <a:extLst>
+                                          <a:ext uri="{28A0092B-C50C-407E-A947-70E740481C1C}">
+                                            <a14:useLocalDpi xmlns:a14="http://schemas.microsoft.com/office/drawing/2010/main" val="0"/>
+                                          </a:ext>
+                                        </a:extLst>
+                                      </a:blip>
+                                      <a:srcRect/>
+                                      <a:stretch>
+                                        <a:fillRect/>
+                                      </a:stretch>
+                                    </a:blipFill>
+                                  </wps:spPr>
+                                  <wps:style>
+                                    <a:lnRef idx="2">
+                                      <a:schemeClr val="accent1">
+                                        <a:shade val="50000"/>
+                                      </a:schemeClr>
+                                    </a:lnRef>
+                                    <a:fillRef idx="1">
+                                      <a:schemeClr val="accent1"/>
+                                    </a:fillRef>
+                                    <a:effectRef idx="0">
+                                      <a:schemeClr val="accent1"/>
+                                    </a:effectRef>
+                                    <a:fontRef idx="minor">
+                                      <a:schemeClr val="lt1"/>
+                                    </a:fontRef>
+                                  </wps:style>
+                                  <wps:bodyPr rot="0" spcFirstLastPara="0" vertOverflow="overflow" horzOverflow="overflow" vert="horz" wrap="square" lIns="91440" tIns="45720" rIns="91440" bIns="45720" numCol="1" spcCol="0" rtlCol="0" fromWordArt="0" anchor="ctr" anchorCtr="0" forceAA="0" compatLnSpc="1">
+                                    <a:prstTxWarp prst="textNoShape">
+                                      <a:avLst/>
+                                    </a:prstTxWarp>
+                                    <a:noAutofit/>
+                                  </wps:bodyPr>
+                                </wps:wsp>
+                              </a:graphicData>
+                            </a:graphic>
+                            <wp14:sizeRelH relativeFrom="margin">
+                              <wp14:pctWidth>0</wp14:pctWidth>
+                            </wp14:sizeRelH>
+                            <wp14:sizeRelV relativeFrom="margin">
+                              <wp14:pctHeight>0</wp14:pctHeight>
+                            </wp14:sizeRelV>
+                          </wp:anchor>
+                        </w:drawing>
+                      </mc:Choice>
+                      <mc:Fallback>
+                        <w:pict>
+                          <v:rect w14:anchorId="75B8B21A" id="Rectangle 14" o:spid="_x0000_s1026" style="position:absolute;margin-left:22.75pt;margin-top:54.6pt;width:407.75pt;height:255.45pt;z-index:251669504;visibility:visible;mso-wrap-style:square;mso-width-percent:0;mso-height-percent:0;mso-wrap-distance-left:9pt;mso-wrap-distance-top:0;mso-wrap-distance-right:9pt;mso-wrap-distance-bottom:0;mso-position-horizontal:absolute;mso-position-horizontal-relative:text;mso-position-vertical:absolute;mso-position-vertical-relative:text;mso-width-percent:0;mso-height-percent:0;mso-width-relative:margin;mso-height-relative:margin;v-text-anchor:middle" o:gfxdata="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" strokecolor="#1f3763 [1604]" strokeweight="1pt">
+                            <v:fill r:id="rId12" o:title="" recolor="t" rotate="t" type="frame"/>
+                          </v:rect>
+                        </w:pict>
+                      </mc:Fallback>
+                    </mc:AlternateContent>
+                  </w:r>
+                  <w:bookmarkEnd w:id="0"/>
+                  <w:r>
+                    <w:t>The high-fidelity wireframe represents the final visual design of the website, including colors, typography, images, and user interface elements.</w:t>
+                  </w:r>
+                </w:p>
+                <w:p>
+                  <w:pPr>
+                    <w:pStyle w:val="NormalWeb"/>
+                  </w:pPr>
+                </w:p>
+                <w:p>
+                  <w:pPr>
+                    <w:pStyle w:val="NormalWeb"/>
+                  </w:pPr>
+                </w:p>
+                <w:p>
+                  <w:pPr>
+                    <w:pStyle w:val="Heading2"/>
+                  </w:pPr>
+                </w:p>
+                <w:p>
+                  <w:pPr>
+                    <w:pStyle w:val="Heading2"/>
+                  </w:pPr>
+                </w:p>
+                <w:p>
+                  <w:pPr>
+                    <w:pStyle w:val="Heading2"/>
+                  </w:pPr>
+                </w:p>
+                <w:p>
+                  <w:pPr>
+                    <w:pStyle w:val="Heading2"/>
+                  </w:pPr>
+                </w:p>
+                <w:p>
+                  <w:pPr>
+                    <w:pStyle w:val="Heading2"/>
+                  </w:pPr>
+                </w:p>
+                <w:p>
+                  <w:pPr>
+                    <w:pStyle w:val="Heading2"/>
+                  </w:pPr>
+                </w:p>
+                <w:p>
+                  <w:pPr>
+                    <w:pStyle w:val="Heading2"/>
+                  </w:pPr>
+                </w:p>
+                <w:p>
+                  <w:pPr>
+                    <w:pStyle w:val="Heading2"/>
+                  </w:pPr>
+                </w:p>
+                <w:p>
+                  <w:pPr>
+                    <w:pStyle w:val="Heading2"/>
+                  </w:pPr>
+                </w:p>
+                <w:p>
+                  <w:pPr>
+                    <w:pStyle w:val="Heading2"/>
+                  </w:pPr>
+                </w:p>
+                <w:p>
+                  <w:pPr>
+                    <w:pStyle w:val="Heading2"/>
+                  </w:pPr>
+                </w:p>
+                <w:p>
+                  <w:pPr>
+                    <w:pStyle w:val="Heading2"/>
+                  </w:pPr>
+                  <w:r>
+                    <w:t>1.11.3 Interface Design Decisions</w:t>
+                  </w:r>
+                </w:p>
+                <w:p>
+                  <w:pPr>
+                    <w:pStyle w:val="NormalWeb"/>
+                    <w:numPr>
+                      <w:ilvl w:val="0"/>
+                      <w:numId w:val="10"/>
+                    </w:numPr>
+                  </w:pPr>
+                  <w:r>
+                    <w:t>Simple and professional layout.</w:t>
+                  </w:r>
+                </w:p>
+                <w:p>
+                  <w:pPr>
+                    <w:pStyle w:val="NormalWeb"/>
+                    <w:numPr>
+                      <w:ilvl w:val="0"/>
+                      <w:numId w:val="10"/>
+                    </w:numPr>
+                  </w:pPr>
+                  <w:r>
+                    <w:t>Consistent color scheme and typography.</w:t>
+                  </w:r>
+                </w:p>
+                <w:p>
+                  <w:pPr>
+                    <w:pStyle w:val="NormalWeb"/>
+                    <w:numPr>
+                      <w:ilvl w:val="0"/>
+                      <w:numId w:val="10"/>
+                    </w:numPr>
+                  </w:pPr>
+                  <w:r>
+                    <w:t>Responsive design for different screen sizes.</w:t>
+                  </w:r>
+                </w:p>
+                <w:p>
+                  <w:pPr>
+                    <w:pStyle w:val="NormalWeb"/>
+                    <w:numPr>
+                      <w:ilvl w:val="0"/>
+                      <w:numId w:val="10"/>
+                    </w:numPr>
+                  </w:pPr>
+                  <w:r>
+                    <w:t>Easy navigation through a fixed menu.</w:t>
+                  </w:r>
+                </w:p>
+                <w:p>
+                  <w:pPr>
+                    <w:pStyle w:val="NormalWeb"/>
+                    <w:numPr>
+                      <w:ilvl w:val="0"/>
+                      <w:numId w:val="10"/>
+                    </w:numPr>
+                  </w:pPr>
+                  <w:r>
+                    <w:t>Clear buttons for CV download and contact links.</w:t>
                   </w:r>
                 </w:p>
                 <w:p>
@@ -4981,10 +5293,7 @@
         <w:br w:type="textWrapping" w:clear="all"/>
       </w:r>
     </w:p>
-    <w:p>
-      <w:bookmarkStart w:id="0" w:name="_GoBack"/>
-      <w:bookmarkEnd w:id="0"/>
-    </w:p>
+    <w:p/>
     <w:sectPr>
       <w:pgSz w:w="12240" w:h="15840"/>
       <w:pgMar w:top="1440" w:right="1440" w:bottom="1080" w:left="1440" w:header="720" w:footer="720" w:gutter="0"/>
@@ -5608,6 +5917,155 @@
     </w:lvl>
   </w:abstractNum>
   <w:abstractNum w:abstractNumId="4" w15:restartNumberingAfterBreak="0">
+    <w:nsid w:val="28D65916"/>
+    <w:multiLevelType w:val="multilevel"/>
+    <w:tmpl w:val="B7A6EE42"/>
+    <w:lvl w:ilvl="0">
+      <w:start w:val="1"/>
+      <w:numFmt w:val="bullet"/>
+      <w:lvlText w:val=""/>
+      <w:lvlJc w:val="left"/>
+      <w:pPr>
+        <w:tabs>
+          <w:tab w:val="num" w:pos="720"/>
+        </w:tabs>
+        <w:ind w:left="720" w:hanging="360"/>
+      </w:pPr>
+      <w:rPr>
+        <w:rFonts w:ascii="Symbol" w:hAnsi="Symbol" w:hint="default"/>
+        <w:sz w:val="20"/>
+      </w:rPr>
+    </w:lvl>
+    <w:lvl w:ilvl="1" w:tentative="1">
+      <w:start w:val="1"/>
+      <w:numFmt w:val="bullet"/>
+      <w:lvlText w:val="o"/>
+      <w:lvlJc w:val="left"/>
+      <w:pPr>
+        <w:tabs>
+          <w:tab w:val="num" w:pos="1440"/>
+        </w:tabs>
+        <w:ind w:left="1440" w:hanging="360"/>
+      </w:pPr>
+      <w:rPr>
+        <w:rFonts w:ascii="Courier New" w:hAnsi="Courier New" w:hint="default"/>
+        <w:sz w:val="20"/>
+      </w:rPr>
+    </w:lvl>
+    <w:lvl w:ilvl="2" w:tentative="1">
+      <w:start w:val="1"/>
+      <w:numFmt w:val="bullet"/>
+      <w:lvlText w:val=""/>
+      <w:lvlJc w:val="left"/>
+      <w:pPr>
+        <w:tabs>
+          <w:tab w:val="num" w:pos="2160"/>
+        </w:tabs>
+        <w:ind w:left="2160" w:hanging="360"/>
+      </w:pPr>
+      <w:rPr>
+        <w:rFonts w:ascii="Wingdings" w:hAnsi="Wingdings" w:hint="default"/>
+        <w:sz w:val="20"/>
+      </w:rPr>
+    </w:lvl>
+    <w:lvl w:ilvl="3" w:tentative="1">
+      <w:start w:val="1"/>
+      <w:numFmt w:val="bullet"/>
+      <w:lvlText w:val=""/>
+      <w:lvlJc w:val="left"/>
+      <w:pPr>
+        <w:tabs>
+          <w:tab w:val="num" w:pos="2880"/>
+        </w:tabs>
+        <w:ind w:left="2880" w:hanging="360"/>
+      </w:pPr>
+      <w:rPr>
+        <w:rFonts w:ascii="Wingdings" w:hAnsi="Wingdings" w:hint="default"/>
+        <w:sz w:val="20"/>
+      </w:rPr>
+    </w:lvl>
+    <w:lvl w:ilvl="4" w:tentative="1">
+      <w:start w:val="1"/>
+      <w:numFmt w:val="bullet"/>
+      <w:lvlText w:val=""/>
+      <w:lvlJc w:val="left"/>
+      <w:pPr>
+        <w:tabs>
+          <w:tab w:val="num" w:pos="3600"/>
+        </w:tabs>
+        <w:ind w:left="3600" w:hanging="360"/>
+      </w:pPr>
+      <w:rPr>
+        <w:rFonts w:ascii="Wingdings" w:hAnsi="Wingdings" w:hint="default"/>
+        <w:sz w:val="20"/>
+      </w:rPr>
+    </w:lvl>
+    <w:lvl w:ilvl="5" w:tentative="1">
+      <w:start w:val="1"/>
+      <w:numFmt w:val="bullet"/>
+      <w:lvlText w:val=""/>
+      <w:lvlJc w:val="left"/>
+      <w:pPr>
+        <w:tabs>
+          <w:tab w:val="num" w:pos="4320"/>
+        </w:tabs>
+        <w:ind w:left="4320" w:hanging="360"/>
+      </w:pPr>
+      <w:rPr>
+        <w:rFonts w:ascii="Wingdings" w:hAnsi="Wingdings" w:hint="default"/>
+        <w:sz w:val="20"/>
+      </w:rPr>
+    </w:lvl>
+    <w:lvl w:ilvl="6" w:tentative="1">
+      <w:start w:val="1"/>
+      <w:numFmt w:val="bullet"/>
+      <w:lvlText w:val=""/>
+      <w:lvlJc w:val="left"/>
+      <w:pPr>
+        <w:tabs>
+          <w:tab w:val="num" w:pos="5040"/>
+        </w:tabs>
+        <w:ind w:left="5040" w:hanging="360"/>
+      </w:pPr>
+      <w:rPr>
+        <w:rFonts w:ascii="Wingdings" w:hAnsi="Wingdings" w:hint="default"/>
+        <w:sz w:val="20"/>
+      </w:rPr>
+    </w:lvl>
+    <w:lvl w:ilvl="7" w:tentative="1">
+      <w:start w:val="1"/>
+      <w:numFmt w:val="bullet"/>
+      <w:lvlText w:val=""/>
+      <w:lvlJc w:val="left"/>
+      <w:pPr>
+        <w:tabs>
+          <w:tab w:val="num" w:pos="5760"/>
+        </w:tabs>
+        <w:ind w:left="5760" w:hanging="360"/>
+      </w:pPr>
+      <w:rPr>
+        <w:rFonts w:ascii="Wingdings" w:hAnsi="Wingdings" w:hint="default"/>
+        <w:sz w:val="20"/>
+      </w:rPr>
+    </w:lvl>
+    <w:lvl w:ilvl="8" w:tentative="1">
+      <w:start w:val="1"/>
+      <w:numFmt w:val="bullet"/>
+      <w:lvlText w:val=""/>
+      <w:lvlJc w:val="left"/>
+      <w:pPr>
+        <w:tabs>
+          <w:tab w:val="num" w:pos="6480"/>
+        </w:tabs>
+        <w:ind w:left="6480" w:hanging="360"/>
+      </w:pPr>
+      <w:rPr>
+        <w:rFonts w:ascii="Wingdings" w:hAnsi="Wingdings" w:hint="default"/>
+        <w:sz w:val="20"/>
+      </w:rPr>
+    </w:lvl>
+  </w:abstractNum>
+  <w:abstractNum w:abstractNumId="5" w15:restartNumberingAfterBreak="0">
     <w:nsid w:val="334D4D5F"/>
     <w:multiLevelType w:val="multilevel"/>
     <w:tmpl w:val="01E639C0"/>
@@ -5756,7 +6214,7 @@
       </w:rPr>
     </w:lvl>
   </w:abstractNum>
-  <w:abstractNum w:abstractNumId="5" w15:restartNumberingAfterBreak="0">
+  <w:abstractNum w:abstractNumId="6" w15:restartNumberingAfterBreak="0">
     <w:nsid w:val="4A2D6202"/>
     <w:multiLevelType w:val="multilevel"/>
     <w:tmpl w:val="573E5496"/>
@@ -5905,7 +6363,7 @@
       </w:rPr>
     </w:lvl>
   </w:abstractNum>
-  <w:abstractNum w:abstractNumId="6" w15:restartNumberingAfterBreak="0">
+  <w:abstractNum w:abstractNumId="7" w15:restartNumberingAfterBreak="0">
     <w:nsid w:val="60195D4E"/>
     <w:multiLevelType w:val="multilevel"/>
     <w:tmpl w:val="80DE48F2"/>
@@ -6054,7 +6512,7 @@
       </w:rPr>
     </w:lvl>
   </w:abstractNum>
-  <w:abstractNum w:abstractNumId="7" w15:restartNumberingAfterBreak="0">
+  <w:abstractNum w:abstractNumId="8" w15:restartNumberingAfterBreak="0">
     <w:nsid w:val="6E1B5EDB"/>
     <w:multiLevelType w:val="multilevel"/>
     <w:tmpl w:val="941436FA"/>
@@ -6203,7 +6661,7 @@
       </w:rPr>
     </w:lvl>
   </w:abstractNum>
-  <w:abstractNum w:abstractNumId="8" w15:restartNumberingAfterBreak="0">
+  <w:abstractNum w:abstractNumId="9" w15:restartNumberingAfterBreak="0">
     <w:nsid w:val="7565782C"/>
     <w:multiLevelType w:val="multilevel"/>
     <w:tmpl w:val="116832D6"/>
@@ -6353,7 +6811,7 @@
     </w:lvl>
   </w:abstractNum>
   <w:num w:numId="1">
-    <w:abstractNumId w:val="4"/>
+    <w:abstractNumId w:val="5"/>
   </w:num>
   <w:num w:numId="2">
     <w:abstractNumId w:val="1"/>
@@ -6365,19 +6823,22 @@
     <w:abstractNumId w:val="0"/>
   </w:num>
   <w:num w:numId="5">
-    <w:abstractNumId w:val="5"/>
+    <w:abstractNumId w:val="6"/>
   </w:num>
   <w:num w:numId="6">
-    <w:abstractNumId w:val="8"/>
+    <w:abstractNumId w:val="9"/>
   </w:num>
   <w:num w:numId="7">
-    <w:abstractNumId w:val="6"/>
+    <w:abstractNumId w:val="7"/>
   </w:num>
   <w:num w:numId="8">
     <w:abstractNumId w:val="2"/>
   </w:num>
   <w:num w:numId="9">
-    <w:abstractNumId w:val="7"/>
+    <w:abstractNumId w:val="8"/>
+  </w:num>
+  <w:num w:numId="10">
+    <w:abstractNumId w:val="4"/>
   </w:num>
 </w:numbering>
 </file>
@@ -7369,7 +7830,7 @@
 </file>
 
 <file path=customXml/itemProps1.xml><?xml version="1.0" encoding="utf-8"?>
-<ds:datastoreItem xmlns:ds="http://schemas.openxmlformats.org/officeDocument/2006/customXml" ds:itemID="{0854845D-73D5-4586-8C96-D3DAE6EAC812}">
+<ds:datastoreItem xmlns:ds="http://schemas.openxmlformats.org/officeDocument/2006/customXml" ds:itemID="{3C85E9FA-E77D-4278-B78D-7A9D7A8485B8}">
   <ds:schemaRefs>
     <ds:schemaRef ds:uri="http://schemas.openxmlformats.org/officeDocument/2006/bibliography"/>
   </ds:schemaRefs>

</xml_diff>